<commit_message>
updated .docx & .pptx
</commit_message>
<xml_diff>
--- a/conference/conf.docx
+++ b/conference/conf.docx
@@ -1,6 +1,6 @@
 
 <file path=word/document.xml><?xml version="1.0" encoding="utf-8"?>
-<w:document xmlns:wpc="http://schemas.microsoft.com/office/word/2010/wordprocessingCanvas" xmlns:cx="http://schemas.microsoft.com/office/drawing/2014/chartex" xmlns:cx1="http://schemas.microsoft.com/office/drawing/2015/9/8/chartex" xmlns:cx2="http://schemas.microsoft.com/office/drawing/2015/10/21/chartex" xmlns:cx3="http://schemas.microsoft.com/office/drawing/2016/5/9/chartex" xmlns:cx4="http://schemas.microsoft.com/office/drawing/2016/5/10/chartex" xmlns:cx5="http://schemas.microsoft.com/office/drawing/2016/5/11/chartex" xmlns:cx6="http://schemas.microsoft.com/office/drawing/2016/5/12/chartex" xmlns:cx7="http://schemas.microsoft.com/office/drawing/2016/5/13/chartex" xmlns:cx8="http://schemas.microsoft.com/office/drawing/2016/5/14/chartex" xmlns:mc="http://schemas.openxmlformats.org/markup-compatibility/2006" xmlns:aink="http://schemas.microsoft.com/office/drawing/2016/ink" xmlns:am3d="http://schemas.microsoft.com/office/drawing/2017/model3d" xmlns:o="urn:schemas-microsoft-com:office:office" xmlns:oel="http://schemas.microsoft.com/office/2019/extlst" xmlns:r="http://schemas.openxmlformats.org/officeDocument/2006/relationships" xmlns:m="http://schemas.openxmlformats.org/officeDocument/2006/math" xmlns:v="urn:schemas-microsoft-com:vml" xmlns:wp14="http://schemas.microsoft.com/office/word/2010/wordprocessingDrawing" xmlns:wp="http://schemas.openxmlformats.org/drawingml/2006/wordprocessingDrawing" xmlns:w10="urn:schemas-microsoft-com:office:word" xmlns:w="http://schemas.openxmlformats.org/wordprocessingml/2006/main" xmlns:w14="http://schemas.microsoft.com/office/word/2010/wordml" xmlns:w15="http://schemas.microsoft.com/office/word/2012/wordml" xmlns:w16cex="http://schemas.microsoft.com/office/word/2018/wordml/cex" xmlns:w16cid="http://schemas.microsoft.com/office/word/2016/wordml/cid" xmlns:w16="http://schemas.microsoft.com/office/word/2018/wordml" xmlns:w16sdtdh="http://schemas.microsoft.com/office/word/2020/wordml/sdtdatahash" xmlns:w16se="http://schemas.microsoft.com/office/word/2015/wordml/symex" xmlns:wpg="http://schemas.microsoft.com/office/word/2010/wordprocessingGroup" xmlns:wpi="http://schemas.microsoft.com/office/word/2010/wordprocessingInk" xmlns:wne="http://schemas.microsoft.com/office/word/2006/wordml" xmlns:wps="http://schemas.microsoft.com/office/word/2010/wordprocessingShape" mc:Ignorable="w14 w15 w16se w16cid w16 w16cex w16sdtdh wp14">
+<w:document xmlns:wpc="http://schemas.microsoft.com/office/word/2010/wordprocessingCanvas" xmlns:cx="http://schemas.microsoft.com/office/drawing/2014/chartex" xmlns:cx1="http://schemas.microsoft.com/office/drawing/2015/9/8/chartex" xmlns:cx2="http://schemas.microsoft.com/office/drawing/2015/10/21/chartex" xmlns:cx3="http://schemas.microsoft.com/office/drawing/2016/5/9/chartex" xmlns:cx4="http://schemas.microsoft.com/office/drawing/2016/5/10/chartex" xmlns:cx5="http://schemas.microsoft.com/office/drawing/2016/5/11/chartex" xmlns:cx6="http://schemas.microsoft.com/office/drawing/2016/5/12/chartex" xmlns:cx7="http://schemas.microsoft.com/office/drawing/2016/5/13/chartex" xmlns:cx8="http://schemas.microsoft.com/office/drawing/2016/5/14/chartex" xmlns:mc="http://schemas.openxmlformats.org/markup-compatibility/2006" xmlns:aink="http://schemas.microsoft.com/office/drawing/2016/ink" xmlns:am3d="http://schemas.microsoft.com/office/drawing/2017/model3d" xmlns:o="urn:schemas-microsoft-com:office:office" xmlns:oel="http://schemas.microsoft.com/office/2019/extlst" xmlns:r="http://schemas.openxmlformats.org/officeDocument/2006/relationships" xmlns:m="http://schemas.openxmlformats.org/officeDocument/2006/math" xmlns:v="urn:schemas-microsoft-com:vml" xmlns:wp14="http://schemas.microsoft.com/office/word/2010/wordprocessingDrawing" xmlns:wp="http://schemas.openxmlformats.org/drawingml/2006/wordprocessingDrawing" xmlns:w10="urn:schemas-microsoft-com:office:word" xmlns:w="http://schemas.openxmlformats.org/wordprocessingml/2006/main" xmlns:w14="http://schemas.microsoft.com/office/word/2010/wordml" xmlns:w15="http://schemas.microsoft.com/office/word/2012/wordml" xmlns:w16cex="http://schemas.microsoft.com/office/word/2018/wordml/cex" xmlns:w16cid="http://schemas.microsoft.com/office/word/2016/wordml/cid" xmlns:w16="http://schemas.microsoft.com/office/word/2018/wordml" xmlns:w16du="http://schemas.microsoft.com/office/word/2023/wordml/word16du" xmlns:w16sdtdh="http://schemas.microsoft.com/office/word/2020/wordml/sdtdatahash" xmlns:w16sdtfl="http://schemas.microsoft.com/office/word/2024/wordml/sdtformatlock" xmlns:w16se="http://schemas.microsoft.com/office/word/2015/wordml/symex" xmlns:wpg="http://schemas.microsoft.com/office/word/2010/wordprocessingGroup" xmlns:wpi="http://schemas.microsoft.com/office/word/2010/wordprocessingInk" xmlns:wne="http://schemas.microsoft.com/office/word/2006/wordml" xmlns:wps="http://schemas.microsoft.com/office/word/2010/wordprocessingShape" mc:Ignorable="w14 w15 w16se w16cid w16 w16cex w16sdtdh w16sdtfl w16du wp14">
   <w:body>
     <w:p>
       <w:pPr>
@@ -71,7 +71,7 @@
           <w:sz w:val="28"/>
           <w:szCs w:val="28"/>
         </w:rPr>
-        <w:t>К</w:t>
+        <w:t>к</w:t>
       </w:r>
       <w:r>
         <w:rPr>
@@ -150,438 +150,444 @@
           <w:szCs w:val="28"/>
         </w:rPr>
         <w:noBreakHyphen/>
-        <w:t>АРХИТЕКТУРА НА ОСНОВЕ</w:t>
-      </w:r>
-      <w:r>
-        <w:rPr>
-          <w:rFonts w:ascii="Times New Roman" w:hAnsi="Times New Roman"/>
-          <w:b/>
-          <w:sz w:val="28"/>
-          <w:szCs w:val="28"/>
-        </w:rPr>
-        <w:t xml:space="preserve"> </w:t>
-      </w:r>
-      <w:r>
-        <w:rPr>
-          <w:rFonts w:ascii="Times New Roman" w:hAnsi="Times New Roman"/>
-          <w:b/>
-          <w:sz w:val="28"/>
-          <w:szCs w:val="28"/>
-        </w:rPr>
-        <w:t>POSTGRESQL, CITUS И KUBERNETES</w:t>
+        <w:t>АРХИТЕКТУРА НА ОСНОВЕ POSTGRESQL, CITUS И KUBERNETES</w:t>
       </w:r>
     </w:p>
     <w:p>
       <w:pPr>
-        <w:spacing w:after="0" w:line="240" w:lineRule="auto"/>
+        <w:spacing w:after="0" w:line="312" w:lineRule="exact"/>
         <w:ind w:firstLine="709"/>
         <w:jc w:val="both"/>
         <w:rPr>
           <w:rFonts w:ascii="Times New Roman" w:hAnsi="Times New Roman"/>
           <w:color w:val="000000"/>
-          <w:sz w:val="28"/>
-          <w:szCs w:val="28"/>
-          <w:lang w:eastAsia="ru-RU"/>
-        </w:rPr>
-      </w:pPr>
-      <w:r>
-        <w:rPr>
-          <w:rFonts w:ascii="Times New Roman" w:hAnsi="Times New Roman"/>
-          <w:color w:val="000000"/>
-          <w:sz w:val="28"/>
-          <w:szCs w:val="28"/>
-          <w:lang w:eastAsia="ru-RU"/>
-        </w:rPr>
-        <w:t>Рост требований к масштабируемости и отказоустойчивости приводит к тому, что классическая схема с одним ведущим сервером</w:t>
-      </w:r>
-      <w:r>
-        <w:rPr>
-          <w:rFonts w:ascii="Times New Roman" w:hAnsi="Times New Roman"/>
-          <w:color w:val="000000"/>
-          <w:sz w:val="28"/>
-          <w:szCs w:val="28"/>
-          <w:lang w:eastAsia="ru-RU"/>
-        </w:rPr>
-        <w:t xml:space="preserve"> </w:t>
-      </w:r>
-      <w:r>
-        <w:rPr>
-          <w:rFonts w:ascii="Times New Roman" w:hAnsi="Times New Roman"/>
-          <w:color w:val="000000"/>
-          <w:sz w:val="28"/>
-          <w:szCs w:val="28"/>
-          <w:lang w:eastAsia="ru-RU"/>
-        </w:rPr>
-        <w:t>пер</w:t>
-      </w:r>
-      <w:r>
-        <w:rPr>
-          <w:rFonts w:ascii="Times New Roman" w:hAnsi="Times New Roman"/>
-          <w:color w:val="000000"/>
-          <w:sz w:val="28"/>
-          <w:szCs w:val="28"/>
-          <w:lang w:val="en-US" w:eastAsia="ru-RU"/>
-        </w:rPr>
-        <w:t>e</w:t>
-      </w:r>
-      <w:r>
-        <w:rPr>
-          <w:rFonts w:ascii="Times New Roman" w:hAnsi="Times New Roman"/>
-          <w:color w:val="000000"/>
-          <w:sz w:val="28"/>
-          <w:szCs w:val="28"/>
-          <w:lang w:eastAsia="ru-RU"/>
-        </w:rPr>
-        <w:t>стаёт удовлетворять потребност</w:t>
-      </w:r>
-      <w:r>
-        <w:rPr>
-          <w:rFonts w:ascii="Times New Roman" w:hAnsi="Times New Roman"/>
-          <w:color w:val="000000"/>
-          <w:sz w:val="28"/>
-          <w:szCs w:val="28"/>
-          <w:lang w:eastAsia="ru-RU"/>
-        </w:rPr>
-        <w:t xml:space="preserve">ям </w:t>
-      </w:r>
-      <w:r>
-        <w:rPr>
-          <w:rFonts w:ascii="Times New Roman" w:hAnsi="Times New Roman"/>
-          <w:color w:val="000000"/>
-          <w:sz w:val="28"/>
-          <w:szCs w:val="28"/>
-          <w:lang w:eastAsia="ru-RU"/>
-        </w:rPr>
-        <w:t>современных приложений. Одним из решений является мультимастер</w:t>
-      </w:r>
-      <w:r>
-        <w:rPr>
-          <w:rFonts w:ascii="Times New Roman" w:hAnsi="Times New Roman"/>
-          <w:color w:val="000000"/>
-          <w:sz w:val="28"/>
-          <w:szCs w:val="28"/>
-          <w:lang w:eastAsia="ru-RU"/>
-        </w:rPr>
-        <w:t xml:space="preserve"> </w:t>
-      </w:r>
-      <w:r>
-        <w:rPr>
-          <w:rFonts w:ascii="Times New Roman" w:hAnsi="Times New Roman"/>
-          <w:color w:val="000000"/>
-          <w:sz w:val="28"/>
-          <w:szCs w:val="28"/>
-          <w:lang w:eastAsia="ru-RU"/>
-        </w:rPr>
-        <w:t>подход, при котором несколько узлов могут принимать записи и обеспечивать высокую доступность данных.</w:t>
+          <w:spacing w:val="-4"/>
+          <w:sz w:val="28"/>
+          <w:szCs w:val="28"/>
+        </w:rPr>
+      </w:pPr>
+      <w:r>
+        <w:rPr>
+          <w:rFonts w:ascii="Times New Roman" w:hAnsi="Times New Roman"/>
+          <w:color w:val="000000"/>
+          <w:spacing w:val="-4"/>
+          <w:sz w:val="28"/>
+          <w:szCs w:val="28"/>
+        </w:rPr>
+        <w:t>Рост требований к масштабируемости и отказоустойчивости современных информационных систем приводит к тому, что классическая архитектура с одним ведущим сервером и набором реплик не всегда обеспечивает необходимую производительность и устойчивость. При высокой интенсивности операций записи единственный мастер-узел становится узким местом и единой точкой отказа. Мультимастер-архитектура, в рамках которой несколько равноправных узлов принимают операции записи, позволяет распределить нагрузку и сохранить доступность данных даже при выходе части узлов из строя.</w:t>
       </w:r>
     </w:p>
     <w:p>
       <w:pPr>
-        <w:spacing w:after="0" w:line="240" w:lineRule="auto"/>
+        <w:spacing w:after="0" w:line="312" w:lineRule="exact"/>
         <w:ind w:firstLine="709"/>
         <w:jc w:val="both"/>
         <w:rPr>
           <w:rFonts w:ascii="Times New Roman" w:hAnsi="Times New Roman"/>
           <w:color w:val="000000"/>
-          <w:sz w:val="28"/>
-          <w:szCs w:val="28"/>
-          <w:lang w:eastAsia="ru-RU"/>
-        </w:rPr>
-      </w:pPr>
-      <w:r>
-        <w:rPr>
-          <w:rFonts w:ascii="Times New Roman" w:hAnsi="Times New Roman"/>
-          <w:color w:val="000000"/>
-          <w:sz w:val="28"/>
-          <w:szCs w:val="28"/>
-          <w:lang w:eastAsia="ru-RU"/>
-        </w:rPr>
-        <w:t>Цель работы — спроектировать и реализовать прототип распределённой СУБД, сочетающий PostgreSQL, расширение Citus и оркестратор Kubernetes, а также оценить возможности такой архитектуры для учебных и прикладных задач. В рамках работы были исследованы механизмы шардирования и репликации данных на уровне Citus, а также логической репликации PostgreSQL, позволяющие организовать мультимастер</w:t>
-      </w:r>
-      <w:r>
-        <w:rPr>
-          <w:rFonts w:ascii="Times New Roman" w:hAnsi="Times New Roman"/>
-          <w:color w:val="000000"/>
-          <w:sz w:val="28"/>
-          <w:szCs w:val="28"/>
-          <w:lang w:eastAsia="ru-RU"/>
-        </w:rPr>
-        <w:noBreakHyphen/>
-        <w:t>взаимодействие нескольких координаторов.</w:t>
+          <w:spacing w:val="-4"/>
+          <w:sz w:val="28"/>
+          <w:szCs w:val="28"/>
+        </w:rPr>
+      </w:pPr>
+      <w:r>
+        <w:rPr>
+          <w:rFonts w:ascii="Times New Roman" w:hAnsi="Times New Roman"/>
+          <w:color w:val="000000"/>
+          <w:spacing w:val="-4"/>
+          <w:sz w:val="28"/>
+          <w:szCs w:val="28"/>
+        </w:rPr>
+        <w:t>Цель работы — спроектировать и реализовать прототип распределённой мультимастер-СУБД на основе PostgreSQL, расширения Citus и оркестратора Kubernetes, а также оценить применимость данного стека для построения отказоустойчивых масштабируемых систем.</w:t>
       </w:r>
     </w:p>
     <w:p>
       <w:pPr>
-        <w:spacing w:after="0" w:line="240" w:lineRule="auto"/>
+        <w:spacing w:after="0" w:line="312" w:lineRule="exact"/>
         <w:ind w:firstLine="709"/>
         <w:jc w:val="both"/>
         <w:rPr>
           <w:rFonts w:ascii="Times New Roman" w:hAnsi="Times New Roman"/>
           <w:color w:val="000000"/>
-          <w:sz w:val="28"/>
-          <w:szCs w:val="28"/>
-          <w:lang w:eastAsia="ru-RU"/>
-        </w:rPr>
-      </w:pPr>
-      <w:r>
-        <w:rPr>
-          <w:rFonts w:ascii="Times New Roman" w:hAnsi="Times New Roman"/>
-          <w:color w:val="000000"/>
-          <w:sz w:val="28"/>
-          <w:szCs w:val="28"/>
-          <w:lang w:eastAsia="ru-RU"/>
-        </w:rPr>
-        <w:t>На базе локального кластера Kubernetes (Docker Desktop / kind) развёрнут Citus</w:t>
-      </w:r>
-      <w:r>
-        <w:rPr>
-          <w:rFonts w:ascii="Times New Roman" w:hAnsi="Times New Roman"/>
-          <w:color w:val="000000"/>
-          <w:sz w:val="28"/>
-          <w:szCs w:val="28"/>
-          <w:lang w:eastAsia="ru-RU"/>
-        </w:rPr>
-        <w:noBreakHyphen/>
-        <w:t>кластер с двумя координаторами и пятью worker</w:t>
-      </w:r>
-      <w:r>
-        <w:rPr>
-          <w:rFonts w:ascii="Times New Roman" w:hAnsi="Times New Roman"/>
-          <w:color w:val="000000"/>
-          <w:sz w:val="28"/>
-          <w:szCs w:val="28"/>
-          <w:lang w:eastAsia="ru-RU"/>
-        </w:rPr>
-        <w:noBreakHyphen/>
-        <w:t>узлами. Kubernetes обеспечивает изоляцию компонентов, автоматический перезапуск pod’ов и адресацию через сервисы, включая headless</w:t>
-      </w:r>
-      <w:r>
-        <w:rPr>
-          <w:rFonts w:ascii="Times New Roman" w:hAnsi="Times New Roman"/>
-          <w:color w:val="000000"/>
-          <w:sz w:val="28"/>
-          <w:szCs w:val="28"/>
-          <w:lang w:eastAsia="ru-RU"/>
-        </w:rPr>
-        <w:noBreakHyphen/>
-        <w:t>сервисы для адресации worker</w:t>
-      </w:r>
-      <w:r>
-        <w:rPr>
-          <w:rFonts w:ascii="Times New Roman" w:hAnsi="Times New Roman"/>
-          <w:color w:val="000000"/>
-          <w:sz w:val="28"/>
-          <w:szCs w:val="28"/>
-          <w:lang w:eastAsia="ru-RU"/>
-        </w:rPr>
-        <w:noBreakHyphen/>
-        <w:t>узлов по имени pod’а. Регистрация рабочих узлов и управление шардированием выполняются через штатные средства Citus, что позволяет масштабировать объём данных и распределять нагрузку по нескольким серверам.</w:t>
+          <w:spacing w:val="-4"/>
+          <w:sz w:val="28"/>
+          <w:szCs w:val="28"/>
+        </w:rPr>
+      </w:pPr>
+      <w:r>
+        <w:rPr>
+          <w:rFonts w:ascii="Times New Roman" w:hAnsi="Times New Roman"/>
+          <w:color w:val="000000"/>
+          <w:spacing w:val="-4"/>
+          <w:sz w:val="28"/>
+          <w:szCs w:val="28"/>
+        </w:rPr>
+        <w:t>В рамках работы были решены следующие задачи:</w:t>
       </w:r>
     </w:p>
     <w:p>
       <w:pPr>
-        <w:spacing w:after="0" w:line="240" w:lineRule="auto"/>
+        <w:numPr>
+          <w:ilvl w:val="0"/>
+          <w:numId w:val="7"/>
+        </w:numPr>
+        <w:spacing w:after="0" w:line="312" w:lineRule="exact"/>
+        <w:ind w:left="0" w:firstLine="709"/>
+        <w:jc w:val="both"/>
+        <w:rPr>
+          <w:rFonts w:ascii="Times New Roman" w:hAnsi="Times New Roman"/>
+          <w:color w:val="000000"/>
+          <w:spacing w:val="-4"/>
+          <w:sz w:val="28"/>
+          <w:szCs w:val="28"/>
+        </w:rPr>
+      </w:pPr>
+      <w:r>
+        <w:rPr>
+          <w:rFonts w:ascii="Times New Roman" w:hAnsi="Times New Roman"/>
+          <w:color w:val="000000"/>
+          <w:spacing w:val="-4"/>
+          <w:sz w:val="28"/>
+          <w:szCs w:val="28"/>
+        </w:rPr>
+        <w:t xml:space="preserve">проектирование трёхуровневой топологии кластера и её автоматизированное развёртывание через </w:t>
+      </w:r>
+      <w:proofErr w:type="spellStart"/>
+      <w:r>
+        <w:rPr>
+          <w:rFonts w:ascii="Times New Roman" w:hAnsi="Times New Roman"/>
+          <w:color w:val="000000"/>
+          <w:spacing w:val="-4"/>
+          <w:sz w:val="28"/>
+          <w:szCs w:val="28"/>
+        </w:rPr>
+        <w:t>Helm</w:t>
+      </w:r>
+      <w:proofErr w:type="spellEnd"/>
+      <w:r>
+        <w:rPr>
+          <w:rFonts w:ascii="Times New Roman" w:hAnsi="Times New Roman"/>
+          <w:color w:val="000000"/>
+          <w:spacing w:val="-4"/>
+          <w:sz w:val="28"/>
+          <w:szCs w:val="28"/>
+        </w:rPr>
+        <w:t xml:space="preserve"> </w:t>
+      </w:r>
+      <w:proofErr w:type="spellStart"/>
+      <w:r>
+        <w:rPr>
+          <w:rFonts w:ascii="Times New Roman" w:hAnsi="Times New Roman"/>
+          <w:color w:val="000000"/>
+          <w:spacing w:val="-4"/>
+          <w:sz w:val="28"/>
+          <w:szCs w:val="28"/>
+        </w:rPr>
+        <w:t>Chart</w:t>
+      </w:r>
+      <w:proofErr w:type="spellEnd"/>
+      <w:r>
+        <w:rPr>
+          <w:rFonts w:ascii="Times New Roman" w:hAnsi="Times New Roman"/>
+          <w:color w:val="000000"/>
+          <w:spacing w:val="-4"/>
+          <w:sz w:val="28"/>
+          <w:szCs w:val="28"/>
+        </w:rPr>
+        <w:t>;</w:t>
+      </w:r>
+    </w:p>
+    <w:p>
+      <w:pPr>
+        <w:numPr>
+          <w:ilvl w:val="0"/>
+          <w:numId w:val="7"/>
+        </w:numPr>
+        <w:spacing w:after="0" w:line="312" w:lineRule="exact"/>
+        <w:ind w:left="0" w:firstLine="709"/>
+        <w:jc w:val="both"/>
+        <w:rPr>
+          <w:rFonts w:ascii="Times New Roman" w:hAnsi="Times New Roman"/>
+          <w:color w:val="000000"/>
+          <w:spacing w:val="-4"/>
+          <w:sz w:val="28"/>
+          <w:szCs w:val="28"/>
+        </w:rPr>
+      </w:pPr>
+      <w:r>
+        <w:rPr>
+          <w:rFonts w:ascii="Times New Roman" w:hAnsi="Times New Roman"/>
+          <w:color w:val="000000"/>
+          <w:spacing w:val="-4"/>
+          <w:sz w:val="28"/>
+          <w:szCs w:val="28"/>
+        </w:rPr>
+        <w:t>настройка двунаправленной логической репликации между мастер-узлами с защитой от циклической пересылки данных;</w:t>
+      </w:r>
+    </w:p>
+    <w:p>
+      <w:pPr>
+        <w:numPr>
+          <w:ilvl w:val="0"/>
+          <w:numId w:val="7"/>
+        </w:numPr>
+        <w:spacing w:after="0" w:line="312" w:lineRule="exact"/>
+        <w:ind w:left="0" w:firstLine="709"/>
+        <w:jc w:val="both"/>
+        <w:rPr>
+          <w:rFonts w:ascii="Times New Roman" w:hAnsi="Times New Roman"/>
+          <w:color w:val="000000"/>
+          <w:spacing w:val="-4"/>
+          <w:sz w:val="28"/>
+          <w:szCs w:val="28"/>
+        </w:rPr>
+      </w:pPr>
+      <w:r>
+        <w:rPr>
+          <w:rFonts w:ascii="Times New Roman" w:hAnsi="Times New Roman"/>
+          <w:color w:val="000000"/>
+          <w:spacing w:val="-4"/>
+          <w:sz w:val="28"/>
+          <w:szCs w:val="28"/>
+        </w:rPr>
+        <w:t xml:space="preserve">реализация </w:t>
+      </w:r>
+      <w:proofErr w:type="spellStart"/>
+      <w:r>
+        <w:rPr>
+          <w:rFonts w:ascii="Times New Roman" w:hAnsi="Times New Roman"/>
+          <w:color w:val="000000"/>
+          <w:spacing w:val="-4"/>
+          <w:sz w:val="28"/>
+          <w:szCs w:val="28"/>
+        </w:rPr>
+        <w:t>шардирования</w:t>
+      </w:r>
+      <w:proofErr w:type="spellEnd"/>
+      <w:r>
+        <w:rPr>
+          <w:rFonts w:ascii="Times New Roman" w:hAnsi="Times New Roman"/>
+          <w:color w:val="000000"/>
+          <w:spacing w:val="-4"/>
+          <w:sz w:val="28"/>
+          <w:szCs w:val="28"/>
+        </w:rPr>
+        <w:t xml:space="preserve"> через механизм промежуточных таблиц с триггерами;</w:t>
+      </w:r>
+    </w:p>
+    <w:p>
+      <w:pPr>
+        <w:numPr>
+          <w:ilvl w:val="0"/>
+          <w:numId w:val="7"/>
+        </w:numPr>
+        <w:spacing w:after="0" w:line="312" w:lineRule="exact"/>
+        <w:ind w:left="0" w:firstLine="709"/>
+        <w:jc w:val="both"/>
+        <w:rPr>
+          <w:rFonts w:ascii="Times New Roman" w:hAnsi="Times New Roman"/>
+          <w:color w:val="000000"/>
+          <w:spacing w:val="-4"/>
+          <w:sz w:val="28"/>
+          <w:szCs w:val="28"/>
+        </w:rPr>
+      </w:pPr>
+      <w:r>
+        <w:rPr>
+          <w:rFonts w:ascii="Times New Roman" w:hAnsi="Times New Roman"/>
+          <w:color w:val="000000"/>
+          <w:spacing w:val="-4"/>
+          <w:sz w:val="28"/>
+          <w:szCs w:val="28"/>
+        </w:rPr>
+        <w:t>построение централизованного сервиса глобальных блокировок для предотвращения конфликтов при конкурентной записи.</w:t>
+      </w:r>
+    </w:p>
+    <w:p>
+      <w:pPr>
+        <w:spacing w:after="0" w:line="312" w:lineRule="exact"/>
         <w:ind w:firstLine="709"/>
         <w:jc w:val="both"/>
         <w:rPr>
           <w:rFonts w:ascii="Times New Roman" w:hAnsi="Times New Roman"/>
           <w:color w:val="000000"/>
-          <w:sz w:val="28"/>
-          <w:szCs w:val="28"/>
-          <w:lang w:eastAsia="ru-RU"/>
-        </w:rPr>
-      </w:pPr>
-      <w:r>
-        <w:rPr>
-          <w:rFonts w:ascii="Times New Roman" w:hAnsi="Times New Roman"/>
-          <w:color w:val="000000"/>
-          <w:sz w:val="28"/>
-          <w:szCs w:val="28"/>
-          <w:lang w:eastAsia="ru-RU"/>
-        </w:rPr>
-        <w:t>На уровне координаторов реализована логическая репликация PostgreSQL: один координатор публикует изменения, другой подписывается и получает как начальную копию данных, так и последующий поток обновлений. Далее схема расширена до двунаправленной: оба координатора одновременно выступают в роли издателей и подписчиков, при этом используется фильтрация по происхождению транзакций (origin) для предотвращения зацикливания потока изменений. Это позволяет реализовать мультимастер</w:t>
-      </w:r>
-      <w:r>
-        <w:rPr>
-          <w:rFonts w:ascii="Times New Roman" w:hAnsi="Times New Roman"/>
-          <w:color w:val="000000"/>
-          <w:sz w:val="28"/>
-          <w:szCs w:val="28"/>
-          <w:lang w:eastAsia="ru-RU"/>
-        </w:rPr>
-        <w:noBreakHyphen/>
-        <w:t>взаимодействие без появления дубликатов и конфликтов, сохраняя согласованность данных между узлами.</w:t>
+          <w:spacing w:val="-4"/>
+          <w:sz w:val="28"/>
+          <w:szCs w:val="28"/>
+        </w:rPr>
+      </w:pPr>
+      <w:r>
+        <w:rPr>
+          <w:rFonts w:ascii="Times New Roman" w:hAnsi="Times New Roman"/>
+          <w:color w:val="000000"/>
+          <w:spacing w:val="-4"/>
+          <w:sz w:val="28"/>
+          <w:szCs w:val="28"/>
+        </w:rPr>
+        <w:t xml:space="preserve">Предложенный кластер разворачивается в пространстве имён Kubernetes и включает три уровня. Первый уровень — несколько мастер-узлов PostgreSQL, хранящих исходные данные и связанных между собой двунаправленной логической репликацией. Второй уровень — координаторы Citus, каждый из которых подписан на один мастер-узел и управляет своим набором воркеров. Третий уровень — </w:t>
+      </w:r>
+      <w:proofErr w:type="spellStart"/>
+      <w:r>
+        <w:rPr>
+          <w:rFonts w:ascii="Times New Roman" w:hAnsi="Times New Roman"/>
+          <w:color w:val="000000"/>
+          <w:spacing w:val="-4"/>
+          <w:sz w:val="28"/>
+          <w:szCs w:val="28"/>
+        </w:rPr>
+        <w:t>воркеры</w:t>
+      </w:r>
+      <w:proofErr w:type="spellEnd"/>
+      <w:r>
+        <w:rPr>
+          <w:rFonts w:ascii="Times New Roman" w:hAnsi="Times New Roman"/>
+          <w:color w:val="000000"/>
+          <w:spacing w:val="-4"/>
+          <w:sz w:val="28"/>
+          <w:szCs w:val="28"/>
+        </w:rPr>
+        <w:t xml:space="preserve">, хранящие </w:t>
+      </w:r>
+      <w:proofErr w:type="spellStart"/>
+      <w:r>
+        <w:rPr>
+          <w:rFonts w:ascii="Times New Roman" w:hAnsi="Times New Roman"/>
+          <w:color w:val="000000"/>
+          <w:spacing w:val="-4"/>
+          <w:sz w:val="28"/>
+          <w:szCs w:val="28"/>
+        </w:rPr>
+        <w:t>шарды</w:t>
+      </w:r>
+      <w:proofErr w:type="spellEnd"/>
+      <w:r>
+        <w:rPr>
+          <w:rFonts w:ascii="Times New Roman" w:hAnsi="Times New Roman"/>
+          <w:color w:val="000000"/>
+          <w:spacing w:val="-4"/>
+          <w:sz w:val="28"/>
+          <w:szCs w:val="28"/>
+        </w:rPr>
+        <w:t xml:space="preserve"> распределённых таблиц.</w:t>
       </w:r>
     </w:p>
     <w:p>
       <w:pPr>
-        <w:spacing w:after="0" w:line="240" w:lineRule="auto"/>
+        <w:spacing w:after="0" w:line="312" w:lineRule="exact"/>
         <w:ind w:firstLine="709"/>
         <w:jc w:val="both"/>
         <w:rPr>
           <w:rFonts w:ascii="Times New Roman" w:hAnsi="Times New Roman"/>
           <w:color w:val="000000"/>
-          <w:sz w:val="28"/>
-          <w:szCs w:val="28"/>
-          <w:lang w:eastAsia="ru-RU"/>
-        </w:rPr>
-      </w:pPr>
-      <w:r>
-        <w:rPr>
-          <w:rFonts w:ascii="Times New Roman" w:hAnsi="Times New Roman"/>
-          <w:color w:val="000000"/>
-          <w:sz w:val="28"/>
-          <w:szCs w:val="28"/>
-          <w:lang w:eastAsia="ru-RU"/>
-        </w:rPr>
-        <w:t>Для координации конкурентных изменений в мультимастер</w:t>
-      </w:r>
-      <w:r>
-        <w:rPr>
-          <w:rFonts w:ascii="Times New Roman" w:hAnsi="Times New Roman"/>
-          <w:color w:val="000000"/>
-          <w:sz w:val="28"/>
-          <w:szCs w:val="28"/>
-          <w:lang w:eastAsia="ru-RU"/>
-        </w:rPr>
-        <w:noBreakHyphen/>
-        <w:t>режиме спроектирован отдельный сервис глобальных блокировок</w:t>
-      </w:r>
-      <w:r>
-        <w:rPr>
-          <w:rFonts w:ascii="Times New Roman" w:hAnsi="Times New Roman"/>
-          <w:color w:val="000000"/>
-          <w:sz w:val="28"/>
-          <w:szCs w:val="28"/>
-          <w:lang w:eastAsia="ru-RU"/>
-        </w:rPr>
-        <w:t xml:space="preserve"> </w:t>
-      </w:r>
-      <w:r>
-        <w:rPr>
-          <w:rFonts w:ascii="Times New Roman" w:hAnsi="Times New Roman"/>
-          <w:color w:val="000000"/>
-          <w:sz w:val="28"/>
-          <w:szCs w:val="28"/>
-          <w:lang w:eastAsia="ru-RU"/>
-        </w:rPr>
-        <w:t xml:space="preserve">pg-locker. Он хранит информацию о том, какой координатор в текущий </w:t>
-      </w:r>
-      <w:r>
-        <w:rPr>
-          <w:rFonts w:ascii="Times New Roman" w:hAnsi="Times New Roman"/>
-          <w:color w:val="000000"/>
-          <w:sz w:val="28"/>
-          <w:szCs w:val="28"/>
-          <w:lang w:eastAsia="ru-RU"/>
-        </w:rPr>
-        <w:lastRenderedPageBreak/>
-        <w:t>момент обладает «правом записи» для конкретного логического ключа, и вызывается из координаторов через удалённые обращения. В результате удаётся избежать одновременного изменения одной и той же записи на разных узлах и снизить вероятность конфликтов при репликации.</w:t>
+          <w:spacing w:val="-4"/>
+          <w:sz w:val="28"/>
+          <w:szCs w:val="28"/>
+        </w:rPr>
+      </w:pPr>
+      <w:r>
+        <w:rPr>
+          <w:rFonts w:ascii="Times New Roman" w:hAnsi="Times New Roman"/>
+          <w:color w:val="000000"/>
+          <w:spacing w:val="-4"/>
+          <w:sz w:val="28"/>
+          <w:szCs w:val="28"/>
+        </w:rPr>
+        <w:t>Все компоненты оформлены в виде StatefulSet, что обеспечивает стабильные сетевые имена и сохранность привязанных томов при перезапусках. Конфигурационные параметры подсистемы журналирования (WAL) передаются через аргументы командной строки в манифестах, что позволяет сохранять неизменяемость контейнерных образов.</w:t>
       </w:r>
     </w:p>
     <w:p>
       <w:pPr>
-        <w:spacing w:after="0" w:line="240" w:lineRule="auto"/>
+        <w:spacing w:after="0" w:line="312" w:lineRule="exact"/>
         <w:ind w:firstLine="709"/>
         <w:jc w:val="both"/>
         <w:rPr>
           <w:rFonts w:ascii="Times New Roman" w:hAnsi="Times New Roman"/>
           <w:color w:val="000000"/>
-          <w:sz w:val="28"/>
-          <w:szCs w:val="28"/>
-          <w:lang w:eastAsia="ru-RU"/>
-        </w:rPr>
-      </w:pPr>
-      <w:r>
-        <w:rPr>
-          <w:rFonts w:ascii="Times New Roman" w:hAnsi="Times New Roman"/>
-          <w:color w:val="000000"/>
-          <w:sz w:val="28"/>
-          <w:szCs w:val="28"/>
-          <w:lang w:eastAsia="ru-RU"/>
-        </w:rPr>
-        <w:t>*вот этот абзац можно убрать</w:t>
+          <w:spacing w:val="-4"/>
+          <w:sz w:val="28"/>
+          <w:szCs w:val="28"/>
+        </w:rPr>
+      </w:pPr>
+      <w:r>
+        <w:rPr>
+          <w:rFonts w:ascii="Times New Roman" w:hAnsi="Times New Roman"/>
+          <w:color w:val="000000"/>
+          <w:spacing w:val="-4"/>
+          <w:sz w:val="28"/>
+          <w:szCs w:val="28"/>
+        </w:rPr>
+        <w:lastRenderedPageBreak/>
+        <w:t xml:space="preserve">Между мастер-узлами реализована mesh-репликация: каждый узел публикует целевые таблицы и подписывается на публикации остальных. Для предотвращения циклической пересылки транзакций в логической репликации используется параметр origin = none, указывающий, что изменения, полученные по репликации, не должны распространяться далее. Поскольку Citus не поддерживает логическую репликацию непосредственно в распределённые таблицы, применена схема с промежуточной локальной таблицей и триггером, синхронизирующим данные с </w:t>
+      </w:r>
+      <w:proofErr w:type="spellStart"/>
+      <w:r>
+        <w:rPr>
+          <w:rFonts w:ascii="Times New Roman" w:hAnsi="Times New Roman"/>
+          <w:color w:val="000000"/>
+          <w:spacing w:val="-4"/>
+          <w:sz w:val="28"/>
+          <w:szCs w:val="28"/>
+        </w:rPr>
+        <w:t>шардированной</w:t>
+      </w:r>
+      <w:proofErr w:type="spellEnd"/>
+      <w:r>
+        <w:rPr>
+          <w:rFonts w:ascii="Times New Roman" w:hAnsi="Times New Roman"/>
+          <w:color w:val="000000"/>
+          <w:spacing w:val="-4"/>
+          <w:sz w:val="28"/>
+          <w:szCs w:val="28"/>
+        </w:rPr>
+        <w:t xml:space="preserve"> таблицей.</w:t>
       </w:r>
     </w:p>
     <w:p>
       <w:pPr>
-        <w:spacing w:after="0" w:line="240" w:lineRule="auto"/>
+        <w:spacing w:after="0" w:line="312" w:lineRule="exact"/>
         <w:ind w:firstLine="709"/>
         <w:jc w:val="both"/>
         <w:rPr>
           <w:rFonts w:ascii="Times New Roman" w:hAnsi="Times New Roman"/>
           <w:color w:val="000000"/>
-          <w:sz w:val="28"/>
-          <w:szCs w:val="28"/>
-          <w:lang w:eastAsia="ru-RU"/>
-        </w:rPr>
-      </w:pPr>
-      <w:r>
-        <w:rPr>
-          <w:rFonts w:ascii="Times New Roman" w:hAnsi="Times New Roman"/>
-          <w:color w:val="000000"/>
-          <w:sz w:val="28"/>
-          <w:szCs w:val="28"/>
-          <w:lang w:eastAsia="ru-RU"/>
-        </w:rPr>
-        <w:t>В ходе работы выявлено ограничение расширения Citus, связанное с отсутствием поддержки обычных триггеров на распределённых таблицах. Это потребовало архитектурного разделения: критичные сущности с бизнес</w:t>
-      </w:r>
-      <w:r>
-        <w:rPr>
-          <w:rFonts w:ascii="Times New Roman" w:hAnsi="Times New Roman"/>
-          <w:color w:val="000000"/>
-          <w:sz w:val="28"/>
-          <w:szCs w:val="28"/>
-          <w:lang w:eastAsia="ru-RU"/>
-        </w:rPr>
-        <w:noBreakHyphen/>
-        <w:t>логикой и глобальными блокировками остаются локальными для координаторов и масштабируются через логическую репликацию, а крупные объёмные таблицы без сложной логики шардируются и реплицируются на уровне Citus. Такой компромисс позволяет одновременно использовать преимущества мультимастера и горизонтального масштабирования, не нарушая ограничений платформы.</w:t>
+          <w:spacing w:val="-4"/>
+          <w:sz w:val="28"/>
+          <w:szCs w:val="28"/>
+        </w:rPr>
+      </w:pPr>
+      <w:r>
+        <w:rPr>
+          <w:rFonts w:ascii="Times New Roman" w:hAnsi="Times New Roman"/>
+          <w:color w:val="000000"/>
+          <w:spacing w:val="-4"/>
+          <w:sz w:val="28"/>
+          <w:szCs w:val="28"/>
+        </w:rPr>
+        <w:t>Конкурентная запись одной и той же строки на разных мастер-узлах приводит к риску конфликтов при репликации. Для устранения этого риска реализован отдельный сервис глобальных блокировок pg-locker на основе экземпляра PostgreSQL со специальной схемой и таблицей блокировок. Координаторы обращаются к нему через расширение dblink, вызывая обёртки для установки и освобождения блокировок. Использование форматирования запросов с параметрами %L позволяет избежать SQL-инъекций при формировании динамических SQL-команд.</w:t>
       </w:r>
     </w:p>
     <w:p>
       <w:pPr>
-        <w:spacing w:after="0" w:line="240" w:lineRule="auto"/>
+        <w:spacing w:after="0" w:line="312" w:lineRule="exact"/>
         <w:ind w:firstLine="709"/>
         <w:jc w:val="both"/>
         <w:rPr>
           <w:rFonts w:ascii="Times New Roman" w:hAnsi="Times New Roman"/>
           <w:color w:val="000000"/>
-          <w:sz w:val="28"/>
-          <w:szCs w:val="28"/>
-          <w:lang w:eastAsia="ru-RU"/>
-        </w:rPr>
-      </w:pPr>
-      <w:r>
-        <w:rPr>
-          <w:rFonts w:ascii="Times New Roman" w:hAnsi="Times New Roman"/>
-          <w:color w:val="000000"/>
-          <w:sz w:val="28"/>
-          <w:szCs w:val="28"/>
-          <w:lang w:eastAsia="ru-RU"/>
-        </w:rPr>
-        <w:t>Полученный прототип показывает, что комбинация Kubernetes, Citus и PostgreSQL пригодна для построения учебных и экспериментальных мультимастер</w:t>
-      </w:r>
-      <w:r>
-        <w:rPr>
-          <w:rFonts w:ascii="Times New Roman" w:hAnsi="Times New Roman"/>
-          <w:color w:val="000000"/>
-          <w:sz w:val="28"/>
-          <w:szCs w:val="28"/>
-          <w:lang w:eastAsia="ru-RU"/>
-        </w:rPr>
-        <w:noBreakHyphen/>
-        <w:t>систем. Kubernetes отвечает за инфраструктурную надёжность, Citus — за распределённое хранение и репликацию шардов, PostgreSQL — за гибкие механизмы логической репликации. Введение дополнительного сервиса глобальных блокировок расширяет эти возможности и позволяет приблизиться к практической мультимастер</w:t>
-      </w:r>
-      <w:r>
-        <w:rPr>
-          <w:rFonts w:ascii="Times New Roman" w:hAnsi="Times New Roman"/>
-          <w:color w:val="000000"/>
-          <w:sz w:val="28"/>
-          <w:szCs w:val="28"/>
-          <w:lang w:eastAsia="ru-RU"/>
-        </w:rPr>
-        <w:noBreakHyphen/>
-        <w:t>архитектуре, которую можно использовать как основу для дальнейших исследований и развития прикладных систем.</w:t>
+          <w:spacing w:val="-4"/>
+          <w:sz w:val="28"/>
+          <w:szCs w:val="28"/>
+        </w:rPr>
+      </w:pPr>
+      <w:r>
+        <w:rPr>
+          <w:rFonts w:ascii="Times New Roman" w:hAnsi="Times New Roman"/>
+          <w:color w:val="000000"/>
+          <w:spacing w:val="-4"/>
+          <w:sz w:val="28"/>
+          <w:szCs w:val="28"/>
+        </w:rPr>
+        <w:t>Полученный прототип показывает, что комбинация PostgreSQL, Citus и Kubernetes может быть использована для построения отказоустойчивых систем с горизонтальным масштабированием. Kubernetes обеспечивает инфраструктурную надёжность и автоматизацию развёртывания, Citus — распределённое хранение и обработку шардированных данных, PostgreSQL — гибкий механизм логической репликации. Ключевыми аспектами проектирования являются корректная настройка параметра origin в подписках и разделение шардируемых и локальных таблиц с учётом ограничений Citus.</w:t>
       </w:r>
     </w:p>
     <w:p>
@@ -606,6 +612,9 @@
     </w:p>
     <w:p>
       <w:pPr>
+        <w:tabs>
+          <w:tab w:val="left" w:pos="993"/>
+        </w:tabs>
         <w:autoSpaceDE w:val="0"/>
         <w:autoSpaceDN w:val="0"/>
         <w:adjustRightInd w:val="0"/>
@@ -626,26 +635,96 @@
           <w:szCs w:val="28"/>
           <w:lang w:val="en-US"/>
         </w:rPr>
-        <w:t>1.</w:t>
-      </w:r>
-      <w:r>
-        <w:rPr>
-          <w:lang w:val="en-US"/>
-        </w:rPr>
-        <w:t>  </w:t>
-      </w:r>
-      <w:r>
-        <w:rPr>
-          <w:rFonts w:ascii="Times New Roman" w:hAnsi="Times New Roman"/>
-          <w:sz w:val="28"/>
-          <w:szCs w:val="28"/>
-          <w:lang w:val="en-US"/>
-        </w:rPr>
-        <w:t>Bioactive Polysaccharides/ Shaoping N. [et al] // USA: Elsevier Ltd. – 2017. – P. 8–13, 16–17.</w:t>
+        <w:t>1</w:t>
+      </w:r>
+      <w:r>
+        <w:rPr>
+          <w:rFonts w:ascii="Times New Roman" w:hAnsi="Times New Roman"/>
+          <w:sz w:val="28"/>
+          <w:szCs w:val="28"/>
+          <w:lang w:val="en-US"/>
+        </w:rPr>
+        <w:t>.  </w:t>
+      </w:r>
+      <w:r>
+        <w:rPr>
+          <w:rFonts w:ascii="Times New Roman" w:hAnsi="Times New Roman"/>
+          <w:sz w:val="28"/>
+          <w:szCs w:val="28"/>
+          <w:lang w:val="en-US"/>
+        </w:rPr>
+        <w:t xml:space="preserve">PostgreSQL Documentation. Logical Replication / The PostgreSQL Global Development Group. — 2024. — URL: </w:t>
+      </w:r>
+      <w:hyperlink r:id="rId5" w:history="1">
+        <w:r>
+          <w:rPr>
+            <w:rStyle w:val="a3"/>
+            <w:rFonts w:ascii="Times New Roman" w:hAnsi="Times New Roman"/>
+            <w:sz w:val="28"/>
+            <w:szCs w:val="28"/>
+            <w:lang w:val="en-US"/>
+          </w:rPr>
+          <w:t>https://www.postgresql.org/docs/current/logical-replication.html</w:t>
+        </w:r>
+      </w:hyperlink>
+      <w:r>
+        <w:rPr>
+          <w:rFonts w:ascii="Times New Roman" w:hAnsi="Times New Roman"/>
+          <w:sz w:val="28"/>
+          <w:szCs w:val="28"/>
+          <w:lang w:val="en-US"/>
+        </w:rPr>
+        <w:t xml:space="preserve"> (</w:t>
+      </w:r>
+      <w:proofErr w:type="spellStart"/>
+      <w:r>
+        <w:rPr>
+          <w:rFonts w:ascii="Times New Roman" w:hAnsi="Times New Roman"/>
+          <w:sz w:val="28"/>
+          <w:szCs w:val="28"/>
+          <w:lang w:val="en-US"/>
+        </w:rPr>
+        <w:t>дата</w:t>
+      </w:r>
+      <w:proofErr w:type="spellEnd"/>
+      <w:r>
+        <w:rPr>
+          <w:rFonts w:ascii="Times New Roman" w:hAnsi="Times New Roman"/>
+          <w:sz w:val="28"/>
+          <w:szCs w:val="28"/>
+          <w:lang w:val="en-US"/>
+        </w:rPr>
+        <w:t xml:space="preserve"> </w:t>
+      </w:r>
+      <w:proofErr w:type="spellStart"/>
+      <w:r>
+        <w:rPr>
+          <w:rFonts w:ascii="Times New Roman" w:hAnsi="Times New Roman"/>
+          <w:sz w:val="28"/>
+          <w:szCs w:val="28"/>
+          <w:lang w:val="en-US"/>
+        </w:rPr>
+        <w:t>обращения</w:t>
+      </w:r>
+      <w:proofErr w:type="spellEnd"/>
+      <w:r>
+        <w:rPr>
+          <w:rFonts w:ascii="Times New Roman" w:hAnsi="Times New Roman"/>
+          <w:sz w:val="28"/>
+          <w:szCs w:val="28"/>
+          <w:lang w:val="en-US"/>
+        </w:rPr>
+        <w:t>: 17.04.2026).</w:t>
       </w:r>
     </w:p>
     <w:p>
       <w:pPr>
+        <w:tabs>
+          <w:tab w:val="left" w:pos="993"/>
+        </w:tabs>
+        <w:autoSpaceDE w:val="0"/>
+        <w:autoSpaceDN w:val="0"/>
+        <w:adjustRightInd w:val="0"/>
         <w:spacing w:after="0" w:line="312" w:lineRule="exact"/>
         <w:ind w:firstLine="709"/>
         <w:jc w:val="both"/>
@@ -663,46 +742,98 @@
           <w:szCs w:val="28"/>
           <w:lang w:val="en-US"/>
         </w:rPr>
-        <w:t>2.</w:t>
-      </w:r>
-      <w:bookmarkStart w:id="0" w:name="_Hlk511910535"/>
-      <w:r>
-        <w:rPr>
-          <w:rFonts w:ascii="Times New Roman" w:hAnsi="Times New Roman"/>
-          <w:sz w:val="28"/>
-          <w:szCs w:val="28"/>
-          <w:lang w:val="en-US"/>
-        </w:rPr>
-        <w:t> </w:t>
-      </w:r>
-      <w:r>
-        <w:rPr>
-          <w:lang w:val="en-US"/>
-        </w:rPr>
-        <w:t> </w:t>
-      </w:r>
-      <w:r>
-        <w:rPr>
-          <w:rFonts w:ascii="Times New Roman" w:hAnsi="Times New Roman"/>
-          <w:sz w:val="28"/>
-          <w:szCs w:val="28"/>
-          <w:lang w:val="en-US"/>
-        </w:rPr>
-        <w:t>Qiong Wan</w:t>
-      </w:r>
-      <w:bookmarkEnd w:id="0"/>
-      <w:r>
-        <w:rPr>
-          <w:rFonts w:ascii="Times New Roman" w:hAnsi="Times New Roman"/>
-          <w:sz w:val="28"/>
-          <w:szCs w:val="28"/>
-          <w:lang w:val="en-US"/>
-        </w:rPr>
-        <w:t>g. Bioactive Mushroom Polysaccharides: A Review on Monosaccharide Composition, Biosynthesis and Regulation / Qiong Wang, Feng Wang [et al] // School of Food and Biological Engineering, Jiangsu University, China. – P. 2–5.</w:t>
+        <w:t>2.  </w:t>
+      </w:r>
+      <w:proofErr w:type="spellStart"/>
+      <w:r>
+        <w:rPr>
+          <w:rFonts w:ascii="Times New Roman" w:hAnsi="Times New Roman"/>
+          <w:sz w:val="28"/>
+          <w:szCs w:val="28"/>
+          <w:lang w:val="en-US"/>
+        </w:rPr>
+        <w:t>Citus</w:t>
+      </w:r>
+      <w:proofErr w:type="spellEnd"/>
+      <w:r>
+        <w:rPr>
+          <w:rFonts w:ascii="Times New Roman" w:hAnsi="Times New Roman"/>
+          <w:sz w:val="28"/>
+          <w:szCs w:val="28"/>
+          <w:lang w:val="en-US"/>
+        </w:rPr>
+        <w:t xml:space="preserve"> Data. Citus 13.0 Documentation / Microsoft Corporation. — 2024. — URL: </w:t>
+      </w:r>
+      <w:hyperlink r:id="rId6" w:history="1">
+        <w:r>
+          <w:rPr>
+            <w:rStyle w:val="a3"/>
+            <w:rFonts w:ascii="Times New Roman" w:hAnsi="Times New Roman"/>
+            <w:sz w:val="28"/>
+            <w:szCs w:val="28"/>
+            <w:lang w:val="en-US"/>
+          </w:rPr>
+          <w:t>https://docs.citusdata.com/en/v13.0/</w:t>
+        </w:r>
+      </w:hyperlink>
+      <w:r>
+        <w:rPr>
+          <w:rFonts w:ascii="Times New Roman" w:hAnsi="Times New Roman"/>
+          <w:sz w:val="28"/>
+          <w:szCs w:val="28"/>
+          <w:lang w:val="en-US"/>
+        </w:rPr>
+        <w:t xml:space="preserve"> (</w:t>
+      </w:r>
+      <w:proofErr w:type="spellStart"/>
+      <w:r>
+        <w:rPr>
+          <w:rFonts w:ascii="Times New Roman" w:hAnsi="Times New Roman"/>
+          <w:sz w:val="28"/>
+          <w:szCs w:val="28"/>
+          <w:lang w:val="en-US"/>
+        </w:rPr>
+        <w:t>дата</w:t>
+      </w:r>
+      <w:proofErr w:type="spellEnd"/>
+      <w:r>
+        <w:rPr>
+          <w:rFonts w:ascii="Times New Roman" w:hAnsi="Times New Roman"/>
+          <w:sz w:val="28"/>
+          <w:szCs w:val="28"/>
+          <w:lang w:val="en-US"/>
+        </w:rPr>
+        <w:t xml:space="preserve"> </w:t>
+      </w:r>
+      <w:proofErr w:type="spellStart"/>
+      <w:r>
+        <w:rPr>
+          <w:rFonts w:ascii="Times New Roman" w:hAnsi="Times New Roman"/>
+          <w:sz w:val="28"/>
+          <w:szCs w:val="28"/>
+          <w:lang w:val="en-US"/>
+        </w:rPr>
+        <w:t>обращения</w:t>
+      </w:r>
+      <w:proofErr w:type="spellEnd"/>
+      <w:r>
+        <w:rPr>
+          <w:rFonts w:ascii="Times New Roman" w:hAnsi="Times New Roman"/>
+          <w:sz w:val="28"/>
+          <w:szCs w:val="28"/>
+          <w:lang w:val="en-US"/>
+        </w:rPr>
+        <w:t>: 17.04.2026).</w:t>
       </w:r>
     </w:p>
     <w:p>
       <w:pPr>
+        <w:tabs>
+          <w:tab w:val="left" w:pos="993"/>
+        </w:tabs>
+        <w:autoSpaceDE w:val="0"/>
+        <w:autoSpaceDN w:val="0"/>
+        <w:adjustRightInd w:val="0"/>
         <w:spacing w:after="0" w:line="312" w:lineRule="exact"/>
         <w:ind w:firstLine="709"/>
         <w:jc w:val="both"/>
@@ -710,107 +841,420 @@
           <w:rFonts w:ascii="Times New Roman" w:hAnsi="Times New Roman"/>
           <w:sz w:val="28"/>
           <w:szCs w:val="28"/>
-        </w:rPr>
-      </w:pPr>
-      <w:r>
-        <w:rPr>
-          <w:rFonts w:ascii="Times New Roman" w:hAnsi="Times New Roman"/>
-          <w:sz w:val="28"/>
-          <w:szCs w:val="28"/>
-          <w:lang w:val="en-US"/>
-        </w:rPr>
-        <w:t>3.  Borchers A.T. Mushrooms, tumors, and immunity / Borchers A.T., Stern J.S. [et al] // Proc. Soc. Exp. Biol</w:t>
-      </w:r>
-      <w:r>
-        <w:rPr>
-          <w:rFonts w:ascii="Times New Roman" w:hAnsi="Times New Roman"/>
-          <w:sz w:val="28"/>
-          <w:szCs w:val="28"/>
-        </w:rPr>
-        <w:t xml:space="preserve">. </w:t>
-      </w:r>
-      <w:r>
-        <w:rPr>
-          <w:rFonts w:ascii="Times New Roman" w:hAnsi="Times New Roman"/>
-          <w:sz w:val="28"/>
-          <w:szCs w:val="28"/>
-          <w:lang w:val="en-US"/>
-        </w:rPr>
-        <w:t>Med</w:t>
-      </w:r>
-      <w:r>
-        <w:rPr>
-          <w:rFonts w:ascii="Times New Roman" w:hAnsi="Times New Roman"/>
-          <w:sz w:val="28"/>
-          <w:szCs w:val="28"/>
-        </w:rPr>
-        <w:t xml:space="preserve">. – 1999. – </w:t>
-      </w:r>
-      <w:r>
-        <w:rPr>
-          <w:rFonts w:ascii="Times New Roman" w:hAnsi="Times New Roman"/>
-          <w:sz w:val="28"/>
-          <w:szCs w:val="28"/>
-          <w:lang w:val="en-US"/>
-        </w:rPr>
-        <w:t>P</w:t>
-      </w:r>
-      <w:r>
-        <w:rPr>
-          <w:rFonts w:ascii="Times New Roman" w:hAnsi="Times New Roman"/>
-          <w:sz w:val="28"/>
-          <w:szCs w:val="28"/>
-        </w:rPr>
-        <w:t>. 281–293.</w:t>
+          <w:lang w:val="en-US"/>
+        </w:rPr>
+      </w:pPr>
+      <w:r>
+        <w:rPr>
+          <w:rFonts w:ascii="Times New Roman" w:hAnsi="Times New Roman"/>
+          <w:sz w:val="28"/>
+          <w:szCs w:val="28"/>
+          <w:lang w:val="en-US"/>
+        </w:rPr>
+        <w:t>3.  </w:t>
+      </w:r>
+      <w:r>
+        <w:rPr>
+          <w:rFonts w:ascii="Times New Roman" w:hAnsi="Times New Roman"/>
+          <w:sz w:val="28"/>
+          <w:szCs w:val="28"/>
+          <w:lang w:val="en-US"/>
+        </w:rPr>
+        <w:t xml:space="preserve">Kubernetes Documentation. StatefulSets / The Kubernetes Authors. — 2024. — URL: </w:t>
+      </w:r>
+      <w:hyperlink r:id="rId7" w:history="1">
+        <w:r>
+          <w:rPr>
+            <w:rStyle w:val="a3"/>
+            <w:rFonts w:ascii="Times New Roman" w:hAnsi="Times New Roman"/>
+            <w:sz w:val="28"/>
+            <w:szCs w:val="28"/>
+            <w:lang w:val="en-US"/>
+          </w:rPr>
+          <w:t>https://kubernetes.io/docs/concepts/workloads/controllers/statefulset/</w:t>
+        </w:r>
+      </w:hyperlink>
+      <w:r>
+        <w:rPr>
+          <w:rFonts w:ascii="Times New Roman" w:hAnsi="Times New Roman"/>
+          <w:sz w:val="28"/>
+          <w:szCs w:val="28"/>
+          <w:lang w:val="en-US"/>
+        </w:rPr>
+        <w:t xml:space="preserve"> (</w:t>
+      </w:r>
+      <w:proofErr w:type="spellStart"/>
+      <w:r>
+        <w:rPr>
+          <w:rFonts w:ascii="Times New Roman" w:hAnsi="Times New Roman"/>
+          <w:sz w:val="28"/>
+          <w:szCs w:val="28"/>
+          <w:lang w:val="en-US"/>
+        </w:rPr>
+        <w:t>дата</w:t>
+      </w:r>
+      <w:proofErr w:type="spellEnd"/>
+      <w:r>
+        <w:rPr>
+          <w:rFonts w:ascii="Times New Roman" w:hAnsi="Times New Roman"/>
+          <w:sz w:val="28"/>
+          <w:szCs w:val="28"/>
+          <w:lang w:val="en-US"/>
+        </w:rPr>
+        <w:t xml:space="preserve"> </w:t>
+      </w:r>
+      <w:proofErr w:type="spellStart"/>
+      <w:r>
+        <w:rPr>
+          <w:rFonts w:ascii="Times New Roman" w:hAnsi="Times New Roman"/>
+          <w:sz w:val="28"/>
+          <w:szCs w:val="28"/>
+          <w:lang w:val="en-US"/>
+        </w:rPr>
+        <w:t>обращения</w:t>
+      </w:r>
+      <w:proofErr w:type="spellEnd"/>
+      <w:r>
+        <w:rPr>
+          <w:rFonts w:ascii="Times New Roman" w:hAnsi="Times New Roman"/>
+          <w:sz w:val="28"/>
+          <w:szCs w:val="28"/>
+          <w:lang w:val="en-US"/>
+        </w:rPr>
+        <w:t>: 17.04.2026).</w:t>
       </w:r>
     </w:p>
     <w:p>
       <w:pPr>
+        <w:tabs>
+          <w:tab w:val="left" w:pos="993"/>
+        </w:tabs>
+        <w:autoSpaceDE w:val="0"/>
+        <w:autoSpaceDN w:val="0"/>
+        <w:adjustRightInd w:val="0"/>
         <w:spacing w:after="0" w:line="312" w:lineRule="exact"/>
         <w:ind w:firstLine="709"/>
         <w:jc w:val="both"/>
         <w:rPr>
-          <w:sz w:val="28"/>
-          <w:szCs w:val="28"/>
-        </w:rPr>
-      </w:pPr>
-      <w:r>
-        <w:rPr>
-          <w:rFonts w:ascii="Times New Roman" w:hAnsi="Times New Roman"/>
-          <w:sz w:val="28"/>
-          <w:szCs w:val="28"/>
-        </w:rPr>
-        <w:t>4.</w:t>
-      </w:r>
-      <w:r>
-        <w:rPr>
-          <w:rFonts w:ascii="Times New Roman" w:hAnsi="Times New Roman"/>
-          <w:sz w:val="28"/>
-          <w:szCs w:val="28"/>
-          <w:lang w:eastAsia="ru-RU"/>
-        </w:rPr>
-        <w:t>  Е. П. Феофилова. Мицелиальные грибы как источники получения новых лекарственных препаратов с иммуномодулирующей, противоопухолевой и ранозаживляющей активностями / Е. П. Феофилова; РАН, Ин-т микробиологии – Москва, 2004. №1 : 27–32 с.</w:t>
+          <w:rFonts w:ascii="Times New Roman" w:hAnsi="Times New Roman"/>
+          <w:sz w:val="28"/>
+          <w:szCs w:val="28"/>
+          <w:lang w:val="en-US"/>
+        </w:rPr>
+      </w:pPr>
+      <w:r>
+        <w:rPr>
+          <w:rFonts w:ascii="Times New Roman" w:hAnsi="Times New Roman"/>
+          <w:sz w:val="28"/>
+          <w:szCs w:val="28"/>
+          <w:lang w:val="en-US"/>
+        </w:rPr>
+        <w:t>4.  </w:t>
+      </w:r>
+      <w:r>
+        <w:rPr>
+          <w:rFonts w:ascii="Times New Roman" w:hAnsi="Times New Roman"/>
+          <w:sz w:val="28"/>
+          <w:szCs w:val="28"/>
+          <w:lang w:val="en-US"/>
+        </w:rPr>
+        <w:t xml:space="preserve">Helm Documentation. Chart Template Guide / Helm Authors. — 2024. — URL: </w:t>
+      </w:r>
+      <w:hyperlink r:id="rId8" w:history="1">
+        <w:r>
+          <w:rPr>
+            <w:rStyle w:val="a3"/>
+            <w:rFonts w:ascii="Times New Roman" w:hAnsi="Times New Roman"/>
+            <w:sz w:val="28"/>
+            <w:szCs w:val="28"/>
+            <w:lang w:val="en-US"/>
+          </w:rPr>
+          <w:t>https://helm.sh/docs/chart_template_guide/</w:t>
+        </w:r>
+      </w:hyperlink>
+      <w:r>
+        <w:rPr>
+          <w:rFonts w:ascii="Times New Roman" w:hAnsi="Times New Roman"/>
+          <w:sz w:val="28"/>
+          <w:szCs w:val="28"/>
+          <w:lang w:val="en-US"/>
+        </w:rPr>
+        <w:t xml:space="preserve"> </w:t>
+      </w:r>
+      <w:r>
+        <w:rPr>
+          <w:rFonts w:ascii="Times New Roman" w:hAnsi="Times New Roman"/>
+          <w:sz w:val="28"/>
+          <w:szCs w:val="28"/>
+          <w:lang w:val="en-US"/>
+        </w:rPr>
+        <w:t>(</w:t>
+      </w:r>
+      <w:proofErr w:type="spellStart"/>
+      <w:r>
+        <w:rPr>
+          <w:rFonts w:ascii="Times New Roman" w:hAnsi="Times New Roman"/>
+          <w:sz w:val="28"/>
+          <w:szCs w:val="28"/>
+          <w:lang w:val="en-US"/>
+        </w:rPr>
+        <w:t>дата</w:t>
+      </w:r>
+      <w:proofErr w:type="spellEnd"/>
+      <w:r>
+        <w:rPr>
+          <w:rFonts w:ascii="Times New Roman" w:hAnsi="Times New Roman"/>
+          <w:sz w:val="28"/>
+          <w:szCs w:val="28"/>
+          <w:lang w:val="en-US"/>
+        </w:rPr>
+        <w:t xml:space="preserve"> </w:t>
+      </w:r>
+      <w:proofErr w:type="spellStart"/>
+      <w:r>
+        <w:rPr>
+          <w:rFonts w:ascii="Times New Roman" w:hAnsi="Times New Roman"/>
+          <w:sz w:val="28"/>
+          <w:szCs w:val="28"/>
+          <w:lang w:val="en-US"/>
+        </w:rPr>
+        <w:t>обращения</w:t>
+      </w:r>
+      <w:proofErr w:type="spellEnd"/>
+      <w:r>
+        <w:rPr>
+          <w:rFonts w:ascii="Times New Roman" w:hAnsi="Times New Roman"/>
+          <w:sz w:val="28"/>
+          <w:szCs w:val="28"/>
+          <w:lang w:val="en-US"/>
+        </w:rPr>
+        <w:t>: 17.04.2026).</w:t>
       </w:r>
     </w:p>
     <w:p>
       <w:pPr>
-        <w:spacing w:before="120" w:after="80" w:line="240" w:lineRule="auto"/>
-        <w:jc w:val="center"/>
-        <w:rPr>
-          <w:rFonts w:ascii="Times New Roman" w:hAnsi="Times New Roman"/>
-          <w:color w:val="222222"/>
-          <w:sz w:val="28"/>
-          <w:szCs w:val="28"/>
-        </w:rPr>
-      </w:pPr>
-      <w:r>
-        <w:rPr>
-          <w:rFonts w:ascii="Times New Roman" w:hAnsi="Times New Roman"/>
-          <w:color w:val="222222"/>
-          <w:sz w:val="28"/>
-          <w:szCs w:val="28"/>
-        </w:rPr>
-        <w:t>*дополнить литературу</w:t>
+        <w:tabs>
+          <w:tab w:val="left" w:pos="993"/>
+        </w:tabs>
+        <w:autoSpaceDE w:val="0"/>
+        <w:autoSpaceDN w:val="0"/>
+        <w:adjustRightInd w:val="0"/>
+        <w:spacing w:after="0" w:line="312" w:lineRule="exact"/>
+        <w:ind w:firstLine="709"/>
+        <w:jc w:val="both"/>
+        <w:rPr>
+          <w:rFonts w:ascii="Times New Roman" w:hAnsi="Times New Roman"/>
+          <w:sz w:val="28"/>
+          <w:szCs w:val="28"/>
+          <w:lang w:val="en-US"/>
+        </w:rPr>
+      </w:pPr>
+      <w:r>
+        <w:rPr>
+          <w:rFonts w:ascii="Times New Roman" w:hAnsi="Times New Roman"/>
+          <w:sz w:val="28"/>
+          <w:szCs w:val="28"/>
+          <w:lang w:val="en-US"/>
+        </w:rPr>
+        <w:lastRenderedPageBreak/>
+        <w:t>5.  </w:t>
+      </w:r>
+      <w:r>
+        <w:rPr>
+          <w:rFonts w:ascii="Times New Roman" w:hAnsi="Times New Roman"/>
+          <w:sz w:val="28"/>
+          <w:szCs w:val="28"/>
+          <w:lang w:val="en-US"/>
+        </w:rPr>
+        <w:t xml:space="preserve">PostgreSQL Documentation. dblink / The PostgreSQL Global Development Group. — 2024. — URL: </w:t>
+      </w:r>
+      <w:hyperlink r:id="rId9" w:history="1">
+        <w:r>
+          <w:rPr>
+            <w:rStyle w:val="a3"/>
+            <w:rFonts w:ascii="Times New Roman" w:hAnsi="Times New Roman"/>
+            <w:sz w:val="28"/>
+            <w:szCs w:val="28"/>
+            <w:lang w:val="en-US"/>
+          </w:rPr>
+          <w:t>https://www.postgresql.org/docs/current/dblink.html</w:t>
+        </w:r>
+      </w:hyperlink>
+      <w:r>
+        <w:rPr>
+          <w:rFonts w:ascii="Times New Roman" w:hAnsi="Times New Roman"/>
+          <w:sz w:val="28"/>
+          <w:szCs w:val="28"/>
+          <w:lang w:val="en-US"/>
+        </w:rPr>
+        <w:t xml:space="preserve"> </w:t>
+      </w:r>
+      <w:r>
+        <w:rPr>
+          <w:rFonts w:ascii="Times New Roman" w:hAnsi="Times New Roman"/>
+          <w:sz w:val="28"/>
+          <w:szCs w:val="28"/>
+          <w:lang w:val="en-US"/>
+        </w:rPr>
+        <w:t>(</w:t>
+      </w:r>
+      <w:proofErr w:type="spellStart"/>
+      <w:r>
+        <w:rPr>
+          <w:rFonts w:ascii="Times New Roman" w:hAnsi="Times New Roman"/>
+          <w:sz w:val="28"/>
+          <w:szCs w:val="28"/>
+          <w:lang w:val="en-US"/>
+        </w:rPr>
+        <w:t>дата</w:t>
+      </w:r>
+      <w:proofErr w:type="spellEnd"/>
+      <w:r>
+        <w:rPr>
+          <w:rFonts w:ascii="Times New Roman" w:hAnsi="Times New Roman"/>
+          <w:sz w:val="28"/>
+          <w:szCs w:val="28"/>
+          <w:lang w:val="en-US"/>
+        </w:rPr>
+        <w:t xml:space="preserve"> </w:t>
+      </w:r>
+      <w:proofErr w:type="spellStart"/>
+      <w:r>
+        <w:rPr>
+          <w:rFonts w:ascii="Times New Roman" w:hAnsi="Times New Roman"/>
+          <w:sz w:val="28"/>
+          <w:szCs w:val="28"/>
+          <w:lang w:val="en-US"/>
+        </w:rPr>
+        <w:t>обращения</w:t>
+      </w:r>
+      <w:proofErr w:type="spellEnd"/>
+      <w:r>
+        <w:rPr>
+          <w:rFonts w:ascii="Times New Roman" w:hAnsi="Times New Roman"/>
+          <w:sz w:val="28"/>
+          <w:szCs w:val="28"/>
+          <w:lang w:val="en-US"/>
+        </w:rPr>
+        <w:t>: 17.04.2026).</w:t>
+      </w:r>
+    </w:p>
+    <w:p>
+      <w:pPr>
+        <w:tabs>
+          <w:tab w:val="left" w:pos="993"/>
+        </w:tabs>
+        <w:autoSpaceDE w:val="0"/>
+        <w:autoSpaceDN w:val="0"/>
+        <w:adjustRightInd w:val="0"/>
+        <w:spacing w:after="0" w:line="312" w:lineRule="exact"/>
+        <w:ind w:firstLine="709"/>
+        <w:jc w:val="both"/>
+        <w:rPr>
+          <w:rFonts w:ascii="Times New Roman" w:hAnsi="Times New Roman"/>
+          <w:sz w:val="28"/>
+          <w:szCs w:val="28"/>
+          <w:lang w:val="en-US"/>
+        </w:rPr>
+      </w:pPr>
+      <w:r>
+        <w:rPr>
+          <w:rFonts w:ascii="Times New Roman" w:hAnsi="Times New Roman"/>
+          <w:sz w:val="28"/>
+          <w:szCs w:val="28"/>
+          <w:lang w:val="en-US"/>
+        </w:rPr>
+        <w:t>6.  </w:t>
+      </w:r>
+      <w:proofErr w:type="spellStart"/>
+      <w:r>
+        <w:rPr>
+          <w:rFonts w:ascii="Times New Roman" w:hAnsi="Times New Roman"/>
+          <w:sz w:val="28"/>
+          <w:szCs w:val="28"/>
+          <w:lang w:val="en-US"/>
+        </w:rPr>
+        <w:t>Citus</w:t>
+      </w:r>
+      <w:proofErr w:type="spellEnd"/>
+      <w:r>
+        <w:rPr>
+          <w:rFonts w:ascii="Times New Roman" w:hAnsi="Times New Roman"/>
+          <w:sz w:val="28"/>
+          <w:szCs w:val="28"/>
+          <w:lang w:val="en-US"/>
+        </w:rPr>
+        <w:t xml:space="preserve"> Data. Distributed Tables API / Microsoft Corporation. — 2024. — URL: </w:t>
+      </w:r>
+      <w:hyperlink r:id="rId10" w:history="1">
+        <w:r>
+          <w:rPr>
+            <w:rStyle w:val="a3"/>
+            <w:rFonts w:ascii="Times New Roman" w:hAnsi="Times New Roman"/>
+            <w:sz w:val="28"/>
+            <w:szCs w:val="28"/>
+            <w:lang w:val="en-US"/>
+          </w:rPr>
+          <w:t>https://docs.citusdata.com/en/v13.0/develop/api_udf.html</w:t>
+        </w:r>
+      </w:hyperlink>
+      <w:r>
+        <w:rPr>
+          <w:rFonts w:ascii="Times New Roman" w:hAnsi="Times New Roman"/>
+          <w:sz w:val="28"/>
+          <w:szCs w:val="28"/>
+          <w:lang w:val="en-US"/>
+        </w:rPr>
+        <w:t xml:space="preserve"> </w:t>
+      </w:r>
+      <w:r>
+        <w:rPr>
+          <w:rFonts w:ascii="Times New Roman" w:hAnsi="Times New Roman"/>
+          <w:sz w:val="28"/>
+          <w:szCs w:val="28"/>
+          <w:lang w:val="en-US"/>
+        </w:rPr>
+        <w:t>(</w:t>
+      </w:r>
+      <w:proofErr w:type="spellStart"/>
+      <w:r>
+        <w:rPr>
+          <w:rFonts w:ascii="Times New Roman" w:hAnsi="Times New Roman"/>
+          <w:sz w:val="28"/>
+          <w:szCs w:val="28"/>
+          <w:lang w:val="en-US"/>
+        </w:rPr>
+        <w:t>дата</w:t>
+      </w:r>
+      <w:proofErr w:type="spellEnd"/>
+      <w:r>
+        <w:rPr>
+          <w:rFonts w:ascii="Times New Roman" w:hAnsi="Times New Roman"/>
+          <w:sz w:val="28"/>
+          <w:szCs w:val="28"/>
+          <w:lang w:val="en-US"/>
+        </w:rPr>
+        <w:t xml:space="preserve"> </w:t>
+      </w:r>
+      <w:proofErr w:type="spellStart"/>
+      <w:r>
+        <w:rPr>
+          <w:rFonts w:ascii="Times New Roman" w:hAnsi="Times New Roman"/>
+          <w:sz w:val="28"/>
+          <w:szCs w:val="28"/>
+          <w:lang w:val="en-US"/>
+        </w:rPr>
+        <w:t>обращения</w:t>
+      </w:r>
+      <w:proofErr w:type="spellEnd"/>
+      <w:r>
+        <w:rPr>
+          <w:rFonts w:ascii="Times New Roman" w:hAnsi="Times New Roman"/>
+          <w:sz w:val="28"/>
+          <w:szCs w:val="28"/>
+          <w:lang w:val="en-US"/>
+        </w:rPr>
+        <w:t>: 17.04.2026).</w:t>
       </w:r>
     </w:p>
     <w:sectPr>
@@ -824,8 +1268,574 @@
 </file>
 
 <file path=word/numbering.xml><?xml version="1.0" encoding="utf-8"?>
-<w:numbering xmlns:wpc="http://schemas.microsoft.com/office/word/2010/wordprocessingCanvas" xmlns:cx="http://schemas.microsoft.com/office/drawing/2014/chartex" xmlns:cx1="http://schemas.microsoft.com/office/drawing/2015/9/8/chartex" xmlns:cx2="http://schemas.microsoft.com/office/drawing/2015/10/21/chartex" xmlns:cx3="http://schemas.microsoft.com/office/drawing/2016/5/9/chartex" xmlns:cx4="http://schemas.microsoft.com/office/drawing/2016/5/10/chartex" xmlns:cx5="http://schemas.microsoft.com/office/drawing/2016/5/11/chartex" xmlns:cx6="http://schemas.microsoft.com/office/drawing/2016/5/12/chartex" xmlns:cx7="http://schemas.microsoft.com/office/drawing/2016/5/13/chartex" xmlns:cx8="http://schemas.microsoft.com/office/drawing/2016/5/14/chartex" xmlns:mc="http://schemas.openxmlformats.org/markup-compatibility/2006" xmlns:aink="http://schemas.microsoft.com/office/drawing/2016/ink" xmlns:am3d="http://schemas.microsoft.com/office/drawing/2017/model3d" xmlns:o="urn:schemas-microsoft-com:office:office" xmlns:oel="http://schemas.microsoft.com/office/2019/extlst" xmlns:r="http://schemas.openxmlformats.org/officeDocument/2006/relationships" xmlns:m="http://schemas.openxmlformats.org/officeDocument/2006/math" xmlns:v="urn:schemas-microsoft-com:vml" xmlns:wp14="http://schemas.microsoft.com/office/word/2010/wordprocessingDrawing" xmlns:wp="http://schemas.openxmlformats.org/drawingml/2006/wordprocessingDrawing" xmlns:w10="urn:schemas-microsoft-com:office:word" xmlns:w="http://schemas.openxmlformats.org/wordprocessingml/2006/main" xmlns:w14="http://schemas.microsoft.com/office/word/2010/wordml" xmlns:w15="http://schemas.microsoft.com/office/word/2012/wordml" xmlns:w16cex="http://schemas.microsoft.com/office/word/2018/wordml/cex" xmlns:w16cid="http://schemas.microsoft.com/office/word/2016/wordml/cid" xmlns:w16="http://schemas.microsoft.com/office/word/2018/wordml" xmlns:w16sdtdh="http://schemas.microsoft.com/office/word/2020/wordml/sdtdatahash" xmlns:w16se="http://schemas.microsoft.com/office/word/2015/wordml/symex" xmlns:wpg="http://schemas.microsoft.com/office/word/2010/wordprocessingGroup" xmlns:wpi="http://schemas.microsoft.com/office/word/2010/wordprocessingInk" xmlns:wne="http://schemas.microsoft.com/office/word/2006/wordml" xmlns:wps="http://schemas.microsoft.com/office/word/2010/wordprocessingShape" mc:Ignorable="w14 w15 w16se w16cid w16 w16cex w16sdtdh wp14">
+<w:numbering xmlns:wpc="http://schemas.microsoft.com/office/word/2010/wordprocessingCanvas" xmlns:cx="http://schemas.microsoft.com/office/drawing/2014/chartex" xmlns:cx1="http://schemas.microsoft.com/office/drawing/2015/9/8/chartex" xmlns:cx2="http://schemas.microsoft.com/office/drawing/2015/10/21/chartex" xmlns:cx3="http://schemas.microsoft.com/office/drawing/2016/5/9/chartex" xmlns:cx4="http://schemas.microsoft.com/office/drawing/2016/5/10/chartex" xmlns:cx5="http://schemas.microsoft.com/office/drawing/2016/5/11/chartex" xmlns:cx6="http://schemas.microsoft.com/office/drawing/2016/5/12/chartex" xmlns:cx7="http://schemas.microsoft.com/office/drawing/2016/5/13/chartex" xmlns:cx8="http://schemas.microsoft.com/office/drawing/2016/5/14/chartex" xmlns:mc="http://schemas.openxmlformats.org/markup-compatibility/2006" xmlns:aink="http://schemas.microsoft.com/office/drawing/2016/ink" xmlns:am3d="http://schemas.microsoft.com/office/drawing/2017/model3d" xmlns:o="urn:schemas-microsoft-com:office:office" xmlns:oel="http://schemas.microsoft.com/office/2019/extlst" xmlns:r="http://schemas.openxmlformats.org/officeDocument/2006/relationships" xmlns:m="http://schemas.openxmlformats.org/officeDocument/2006/math" xmlns:v="urn:schemas-microsoft-com:vml" xmlns:wp14="http://schemas.microsoft.com/office/word/2010/wordprocessingDrawing" xmlns:wp="http://schemas.openxmlformats.org/drawingml/2006/wordprocessingDrawing" xmlns:w10="urn:schemas-microsoft-com:office:word" xmlns:w="http://schemas.openxmlformats.org/wordprocessingml/2006/main" xmlns:w14="http://schemas.microsoft.com/office/word/2010/wordml" xmlns:w15="http://schemas.microsoft.com/office/word/2012/wordml" xmlns:w16cex="http://schemas.microsoft.com/office/word/2018/wordml/cex" xmlns:w16cid="http://schemas.microsoft.com/office/word/2016/wordml/cid" xmlns:w16="http://schemas.microsoft.com/office/word/2018/wordml" xmlns:w16du="http://schemas.microsoft.com/office/word/2023/wordml/word16du" xmlns:w16sdtdh="http://schemas.microsoft.com/office/word/2020/wordml/sdtdatahash" xmlns:w16sdtfl="http://schemas.microsoft.com/office/word/2024/wordml/sdtformatlock" xmlns:w16se="http://schemas.microsoft.com/office/word/2015/wordml/symex" xmlns:wpg="http://schemas.microsoft.com/office/word/2010/wordprocessingGroup" xmlns:wpi="http://schemas.microsoft.com/office/word/2010/wordprocessingInk" xmlns:wne="http://schemas.microsoft.com/office/word/2006/wordml" xmlns:wps="http://schemas.microsoft.com/office/word/2010/wordprocessingShape" mc:Ignorable="w14 w15 w16se w16cid w16 w16cex w16sdtdh w16sdtfl w16du wp14">
   <w:abstractNum w:abstractNumId="0" w15:restartNumberingAfterBreak="0">
+    <w:nsid w:val="0A50621C"/>
+    <w:multiLevelType w:val="multilevel"/>
+    <w:tmpl w:val="F8184C62"/>
+    <w:styleLink w:val="1"/>
+    <w:lvl w:ilvl="0">
+      <w:start w:val="1"/>
+      <w:numFmt w:val="bullet"/>
+      <w:lvlText w:val=""/>
+      <w:lvlJc w:val="left"/>
+      <w:pPr>
+        <w:ind w:left="720" w:hanging="360"/>
+      </w:pPr>
+      <w:rPr>
+        <w:rFonts w:ascii="Symbol" w:hAnsi="Symbol" w:hint="default"/>
+      </w:rPr>
+    </w:lvl>
+    <w:lvl w:ilvl="1">
+      <w:start w:val="1"/>
+      <w:numFmt w:val="bullet"/>
+      <w:lvlText w:val="o"/>
+      <w:lvlJc w:val="left"/>
+      <w:pPr>
+        <w:ind w:left="1440" w:hanging="360"/>
+      </w:pPr>
+      <w:rPr>
+        <w:rFonts w:ascii="Courier New" w:hAnsi="Courier New" w:hint="default"/>
+      </w:rPr>
+    </w:lvl>
+    <w:lvl w:ilvl="2">
+      <w:start w:val="1"/>
+      <w:numFmt w:val="bullet"/>
+      <w:lvlText w:val=""/>
+      <w:lvlJc w:val="left"/>
+      <w:pPr>
+        <w:ind w:left="2160" w:hanging="360"/>
+      </w:pPr>
+      <w:rPr>
+        <w:rFonts w:ascii="Wingdings" w:hAnsi="Wingdings" w:hint="default"/>
+      </w:rPr>
+    </w:lvl>
+    <w:lvl w:ilvl="3">
+      <w:start w:val="1"/>
+      <w:numFmt w:val="bullet"/>
+      <w:lvlText w:val=""/>
+      <w:lvlJc w:val="left"/>
+      <w:pPr>
+        <w:ind w:left="2880" w:hanging="360"/>
+      </w:pPr>
+      <w:rPr>
+        <w:rFonts w:ascii="Symbol" w:hAnsi="Symbol" w:hint="default"/>
+      </w:rPr>
+    </w:lvl>
+    <w:lvl w:ilvl="4">
+      <w:start w:val="1"/>
+      <w:numFmt w:val="bullet"/>
+      <w:lvlText w:val="o"/>
+      <w:lvlJc w:val="left"/>
+      <w:pPr>
+        <w:ind w:left="3600" w:hanging="360"/>
+      </w:pPr>
+      <w:rPr>
+        <w:rFonts w:ascii="Courier New" w:hAnsi="Courier New" w:hint="default"/>
+      </w:rPr>
+    </w:lvl>
+    <w:lvl w:ilvl="5">
+      <w:start w:val="1"/>
+      <w:numFmt w:val="bullet"/>
+      <w:lvlText w:val=""/>
+      <w:lvlJc w:val="left"/>
+      <w:pPr>
+        <w:ind w:left="4320" w:hanging="360"/>
+      </w:pPr>
+      <w:rPr>
+        <w:rFonts w:ascii="Wingdings" w:hAnsi="Wingdings" w:hint="default"/>
+      </w:rPr>
+    </w:lvl>
+    <w:lvl w:ilvl="6">
+      <w:start w:val="1"/>
+      <w:numFmt w:val="bullet"/>
+      <w:lvlText w:val=""/>
+      <w:lvlJc w:val="left"/>
+      <w:pPr>
+        <w:ind w:left="5040" w:hanging="360"/>
+      </w:pPr>
+      <w:rPr>
+        <w:rFonts w:ascii="Symbol" w:hAnsi="Symbol" w:hint="default"/>
+      </w:rPr>
+    </w:lvl>
+    <w:lvl w:ilvl="7">
+      <w:start w:val="1"/>
+      <w:numFmt w:val="bullet"/>
+      <w:lvlText w:val="o"/>
+      <w:lvlJc w:val="left"/>
+      <w:pPr>
+        <w:ind w:left="5760" w:hanging="360"/>
+      </w:pPr>
+      <w:rPr>
+        <w:rFonts w:ascii="Courier New" w:hAnsi="Courier New" w:hint="default"/>
+      </w:rPr>
+    </w:lvl>
+    <w:lvl w:ilvl="8">
+      <w:start w:val="1"/>
+      <w:numFmt w:val="bullet"/>
+      <w:lvlText w:val=""/>
+      <w:lvlJc w:val="left"/>
+      <w:pPr>
+        <w:ind w:left="6480" w:hanging="360"/>
+      </w:pPr>
+      <w:rPr>
+        <w:rFonts w:ascii="Wingdings" w:hAnsi="Wingdings" w:hint="default"/>
+      </w:rPr>
+    </w:lvl>
+  </w:abstractNum>
+  <w:abstractNum w:abstractNumId="1" w15:restartNumberingAfterBreak="0">
+    <w:nsid w:val="16207EB9"/>
+    <w:multiLevelType w:val="hybridMultilevel"/>
+    <w:tmpl w:val="B01473BA"/>
+    <w:lvl w:ilvl="0" w:tplc="04190001">
+      <w:start w:val="1"/>
+      <w:numFmt w:val="bullet"/>
+      <w:lvlText w:val=""/>
+      <w:lvlJc w:val="left"/>
+      <w:pPr>
+        <w:ind w:left="720" w:hanging="360"/>
+      </w:pPr>
+      <w:rPr>
+        <w:rFonts w:ascii="Symbol" w:hAnsi="Symbol" w:hint="default"/>
+      </w:rPr>
+    </w:lvl>
+    <w:lvl w:ilvl="1" w:tplc="04190003" w:tentative="1">
+      <w:start w:val="1"/>
+      <w:numFmt w:val="bullet"/>
+      <w:lvlText w:val="o"/>
+      <w:lvlJc w:val="left"/>
+      <w:pPr>
+        <w:ind w:left="1440" w:hanging="360"/>
+      </w:pPr>
+      <w:rPr>
+        <w:rFonts w:ascii="Courier New" w:hAnsi="Courier New" w:hint="default"/>
+      </w:rPr>
+    </w:lvl>
+    <w:lvl w:ilvl="2" w:tplc="04190005" w:tentative="1">
+      <w:start w:val="1"/>
+      <w:numFmt w:val="bullet"/>
+      <w:lvlText w:val=""/>
+      <w:lvlJc w:val="left"/>
+      <w:pPr>
+        <w:ind w:left="2160" w:hanging="360"/>
+      </w:pPr>
+      <w:rPr>
+        <w:rFonts w:ascii="Wingdings" w:hAnsi="Wingdings" w:hint="default"/>
+      </w:rPr>
+    </w:lvl>
+    <w:lvl w:ilvl="3" w:tplc="04190001" w:tentative="1">
+      <w:start w:val="1"/>
+      <w:numFmt w:val="bullet"/>
+      <w:lvlText w:val=""/>
+      <w:lvlJc w:val="left"/>
+      <w:pPr>
+        <w:ind w:left="2880" w:hanging="360"/>
+      </w:pPr>
+      <w:rPr>
+        <w:rFonts w:ascii="Symbol" w:hAnsi="Symbol" w:hint="default"/>
+      </w:rPr>
+    </w:lvl>
+    <w:lvl w:ilvl="4" w:tplc="04190003" w:tentative="1">
+      <w:start w:val="1"/>
+      <w:numFmt w:val="bullet"/>
+      <w:lvlText w:val="o"/>
+      <w:lvlJc w:val="left"/>
+      <w:pPr>
+        <w:ind w:left="3600" w:hanging="360"/>
+      </w:pPr>
+      <w:rPr>
+        <w:rFonts w:ascii="Courier New" w:hAnsi="Courier New" w:hint="default"/>
+      </w:rPr>
+    </w:lvl>
+    <w:lvl w:ilvl="5" w:tplc="04190005" w:tentative="1">
+      <w:start w:val="1"/>
+      <w:numFmt w:val="bullet"/>
+      <w:lvlText w:val=""/>
+      <w:lvlJc w:val="left"/>
+      <w:pPr>
+        <w:ind w:left="4320" w:hanging="360"/>
+      </w:pPr>
+      <w:rPr>
+        <w:rFonts w:ascii="Wingdings" w:hAnsi="Wingdings" w:hint="default"/>
+      </w:rPr>
+    </w:lvl>
+    <w:lvl w:ilvl="6" w:tplc="04190001" w:tentative="1">
+      <w:start w:val="1"/>
+      <w:numFmt w:val="bullet"/>
+      <w:lvlText w:val=""/>
+      <w:lvlJc w:val="left"/>
+      <w:pPr>
+        <w:ind w:left="5040" w:hanging="360"/>
+      </w:pPr>
+      <w:rPr>
+        <w:rFonts w:ascii="Symbol" w:hAnsi="Symbol" w:hint="default"/>
+      </w:rPr>
+    </w:lvl>
+    <w:lvl w:ilvl="7" w:tplc="04190003" w:tentative="1">
+      <w:start w:val="1"/>
+      <w:numFmt w:val="bullet"/>
+      <w:lvlText w:val="o"/>
+      <w:lvlJc w:val="left"/>
+      <w:pPr>
+        <w:ind w:left="5760" w:hanging="360"/>
+      </w:pPr>
+      <w:rPr>
+        <w:rFonts w:ascii="Courier New" w:hAnsi="Courier New" w:hint="default"/>
+      </w:rPr>
+    </w:lvl>
+    <w:lvl w:ilvl="8" w:tplc="04190005" w:tentative="1">
+      <w:start w:val="1"/>
+      <w:numFmt w:val="bullet"/>
+      <w:lvlText w:val=""/>
+      <w:lvlJc w:val="left"/>
+      <w:pPr>
+        <w:ind w:left="6480" w:hanging="360"/>
+      </w:pPr>
+      <w:rPr>
+        <w:rFonts w:ascii="Wingdings" w:hAnsi="Wingdings" w:hint="default"/>
+      </w:rPr>
+    </w:lvl>
+  </w:abstractNum>
+  <w:abstractNum w:abstractNumId="2" w15:restartNumberingAfterBreak="0">
+    <w:nsid w:val="16E44B94"/>
+    <w:multiLevelType w:val="hybridMultilevel"/>
+    <w:tmpl w:val="474EF7AC"/>
+    <w:lvl w:ilvl="0" w:tplc="23FCE038">
+      <w:numFmt w:val="bullet"/>
+      <w:suff w:val="space"/>
+      <w:lvlText w:val="–"/>
+      <w:lvlJc w:val="left"/>
+      <w:pPr>
+        <w:ind w:left="1429" w:hanging="360"/>
+      </w:pPr>
+      <w:rPr>
+        <w:rFonts w:ascii="Times New Roman" w:hAnsi="Times New Roman" w:cs="Times New Roman" w:hint="default"/>
+      </w:rPr>
+    </w:lvl>
+    <w:lvl w:ilvl="1" w:tplc="FFFFFFFF">
+      <w:start w:val="1"/>
+      <w:numFmt w:val="bullet"/>
+      <w:lvlText w:val="o"/>
+      <w:lvlJc w:val="left"/>
+      <w:pPr>
+        <w:ind w:left="2149" w:hanging="360"/>
+      </w:pPr>
+      <w:rPr>
+        <w:rFonts w:ascii="Courier New" w:hAnsi="Courier New" w:cs="Courier New" w:hint="default"/>
+      </w:rPr>
+    </w:lvl>
+    <w:lvl w:ilvl="2" w:tplc="FFFFFFFF">
+      <w:start w:val="1"/>
+      <w:numFmt w:val="bullet"/>
+      <w:lvlText w:val=""/>
+      <w:lvlJc w:val="left"/>
+      <w:pPr>
+        <w:ind w:left="2869" w:hanging="360"/>
+      </w:pPr>
+      <w:rPr>
+        <w:rFonts w:ascii="Wingdings" w:hAnsi="Wingdings" w:hint="default"/>
+      </w:rPr>
+    </w:lvl>
+    <w:lvl w:ilvl="3" w:tplc="FFFFFFFF">
+      <w:start w:val="1"/>
+      <w:numFmt w:val="bullet"/>
+      <w:lvlText w:val=""/>
+      <w:lvlJc w:val="left"/>
+      <w:pPr>
+        <w:ind w:left="3589" w:hanging="360"/>
+      </w:pPr>
+      <w:rPr>
+        <w:rFonts w:ascii="Symbol" w:hAnsi="Symbol" w:hint="default"/>
+      </w:rPr>
+    </w:lvl>
+    <w:lvl w:ilvl="4" w:tplc="FFFFFFFF">
+      <w:start w:val="1"/>
+      <w:numFmt w:val="bullet"/>
+      <w:lvlText w:val="o"/>
+      <w:lvlJc w:val="left"/>
+      <w:pPr>
+        <w:ind w:left="4309" w:hanging="360"/>
+      </w:pPr>
+      <w:rPr>
+        <w:rFonts w:ascii="Courier New" w:hAnsi="Courier New" w:cs="Courier New" w:hint="default"/>
+      </w:rPr>
+    </w:lvl>
+    <w:lvl w:ilvl="5" w:tplc="FFFFFFFF">
+      <w:start w:val="1"/>
+      <w:numFmt w:val="bullet"/>
+      <w:lvlText w:val=""/>
+      <w:lvlJc w:val="left"/>
+      <w:pPr>
+        <w:ind w:left="5029" w:hanging="360"/>
+      </w:pPr>
+      <w:rPr>
+        <w:rFonts w:ascii="Wingdings" w:hAnsi="Wingdings" w:hint="default"/>
+      </w:rPr>
+    </w:lvl>
+    <w:lvl w:ilvl="6" w:tplc="FFFFFFFF">
+      <w:start w:val="1"/>
+      <w:numFmt w:val="bullet"/>
+      <w:lvlText w:val=""/>
+      <w:lvlJc w:val="left"/>
+      <w:pPr>
+        <w:ind w:left="5749" w:hanging="360"/>
+      </w:pPr>
+      <w:rPr>
+        <w:rFonts w:ascii="Symbol" w:hAnsi="Symbol" w:hint="default"/>
+      </w:rPr>
+    </w:lvl>
+    <w:lvl w:ilvl="7" w:tplc="FFFFFFFF">
+      <w:start w:val="1"/>
+      <w:numFmt w:val="bullet"/>
+      <w:lvlText w:val="o"/>
+      <w:lvlJc w:val="left"/>
+      <w:pPr>
+        <w:ind w:left="6469" w:hanging="360"/>
+      </w:pPr>
+      <w:rPr>
+        <w:rFonts w:ascii="Courier New" w:hAnsi="Courier New" w:cs="Courier New" w:hint="default"/>
+      </w:rPr>
+    </w:lvl>
+    <w:lvl w:ilvl="8" w:tplc="FFFFFFFF">
+      <w:start w:val="1"/>
+      <w:numFmt w:val="bullet"/>
+      <w:lvlText w:val=""/>
+      <w:lvlJc w:val="left"/>
+      <w:pPr>
+        <w:ind w:left="7189" w:hanging="360"/>
+      </w:pPr>
+      <w:rPr>
+        <w:rFonts w:ascii="Wingdings" w:hAnsi="Wingdings" w:hint="default"/>
+      </w:rPr>
+    </w:lvl>
+  </w:abstractNum>
+  <w:abstractNum w:abstractNumId="3" w15:restartNumberingAfterBreak="0">
+    <w:nsid w:val="2D554672"/>
+    <w:multiLevelType w:val="hybridMultilevel"/>
+    <w:tmpl w:val="986E5540"/>
+    <w:lvl w:ilvl="0" w:tplc="04190001">
+      <w:start w:val="1"/>
+      <w:numFmt w:val="bullet"/>
+      <w:lvlText w:val=""/>
+      <w:lvlJc w:val="left"/>
+      <w:pPr>
+        <w:ind w:left="720" w:hanging="360"/>
+      </w:pPr>
+      <w:rPr>
+        <w:rFonts w:ascii="Symbol" w:hAnsi="Symbol" w:hint="default"/>
+      </w:rPr>
+    </w:lvl>
+    <w:lvl w:ilvl="1" w:tplc="04190003">
+      <w:start w:val="1"/>
+      <w:numFmt w:val="bullet"/>
+      <w:lvlText w:val="o"/>
+      <w:lvlJc w:val="left"/>
+      <w:pPr>
+        <w:ind w:left="1440" w:hanging="360"/>
+      </w:pPr>
+      <w:rPr>
+        <w:rFonts w:ascii="Courier New" w:hAnsi="Courier New" w:cs="Times New Roman" w:hint="default"/>
+      </w:rPr>
+    </w:lvl>
+    <w:lvl w:ilvl="2" w:tplc="04190005">
+      <w:start w:val="1"/>
+      <w:numFmt w:val="bullet"/>
+      <w:lvlText w:val=""/>
+      <w:lvlJc w:val="left"/>
+      <w:pPr>
+        <w:ind w:left="2160" w:hanging="360"/>
+      </w:pPr>
+      <w:rPr>
+        <w:rFonts w:ascii="Wingdings" w:hAnsi="Wingdings" w:hint="default"/>
+      </w:rPr>
+    </w:lvl>
+    <w:lvl w:ilvl="3" w:tplc="04190001">
+      <w:start w:val="1"/>
+      <w:numFmt w:val="bullet"/>
+      <w:lvlText w:val=""/>
+      <w:lvlJc w:val="left"/>
+      <w:pPr>
+        <w:ind w:left="2880" w:hanging="360"/>
+      </w:pPr>
+      <w:rPr>
+        <w:rFonts w:ascii="Symbol" w:hAnsi="Symbol" w:hint="default"/>
+      </w:rPr>
+    </w:lvl>
+    <w:lvl w:ilvl="4" w:tplc="04190003">
+      <w:start w:val="1"/>
+      <w:numFmt w:val="bullet"/>
+      <w:lvlText w:val="o"/>
+      <w:lvlJc w:val="left"/>
+      <w:pPr>
+        <w:ind w:left="3600" w:hanging="360"/>
+      </w:pPr>
+      <w:rPr>
+        <w:rFonts w:ascii="Courier New" w:hAnsi="Courier New" w:cs="Times New Roman" w:hint="default"/>
+      </w:rPr>
+    </w:lvl>
+    <w:lvl w:ilvl="5" w:tplc="04190005">
+      <w:start w:val="1"/>
+      <w:numFmt w:val="bullet"/>
+      <w:lvlText w:val=""/>
+      <w:lvlJc w:val="left"/>
+      <w:pPr>
+        <w:ind w:left="4320" w:hanging="360"/>
+      </w:pPr>
+      <w:rPr>
+        <w:rFonts w:ascii="Wingdings" w:hAnsi="Wingdings" w:hint="default"/>
+      </w:rPr>
+    </w:lvl>
+    <w:lvl w:ilvl="6" w:tplc="04190001">
+      <w:start w:val="1"/>
+      <w:numFmt w:val="bullet"/>
+      <w:lvlText w:val=""/>
+      <w:lvlJc w:val="left"/>
+      <w:pPr>
+        <w:ind w:left="5040" w:hanging="360"/>
+      </w:pPr>
+      <w:rPr>
+        <w:rFonts w:ascii="Symbol" w:hAnsi="Symbol" w:hint="default"/>
+      </w:rPr>
+    </w:lvl>
+    <w:lvl w:ilvl="7" w:tplc="04190003">
+      <w:start w:val="1"/>
+      <w:numFmt w:val="bullet"/>
+      <w:lvlText w:val="o"/>
+      <w:lvlJc w:val="left"/>
+      <w:pPr>
+        <w:ind w:left="5760" w:hanging="360"/>
+      </w:pPr>
+      <w:rPr>
+        <w:rFonts w:ascii="Courier New" w:hAnsi="Courier New" w:cs="Times New Roman" w:hint="default"/>
+      </w:rPr>
+    </w:lvl>
+    <w:lvl w:ilvl="8" w:tplc="04190005">
+      <w:start w:val="1"/>
+      <w:numFmt w:val="bullet"/>
+      <w:lvlText w:val=""/>
+      <w:lvlJc w:val="left"/>
+      <w:pPr>
+        <w:ind w:left="6480" w:hanging="360"/>
+      </w:pPr>
+      <w:rPr>
+        <w:rFonts w:ascii="Wingdings" w:hAnsi="Wingdings" w:hint="default"/>
+      </w:rPr>
+    </w:lvl>
+  </w:abstractNum>
+  <w:abstractNum w:abstractNumId="4" w15:restartNumberingAfterBreak="0">
+    <w:nsid w:val="5C2A0E35"/>
+    <w:multiLevelType w:val="hybridMultilevel"/>
+    <w:tmpl w:val="F8184C62"/>
+    <w:lvl w:ilvl="0" w:tplc="CF7A30AE">
+      <w:start w:val="1"/>
+      <w:numFmt w:val="bullet"/>
+      <w:lvlText w:val=""/>
+      <w:lvlJc w:val="left"/>
+      <w:pPr>
+        <w:ind w:left="720" w:hanging="360"/>
+      </w:pPr>
+      <w:rPr>
+        <w:rFonts w:ascii="Symbol" w:hAnsi="Symbol" w:hint="default"/>
+      </w:rPr>
+    </w:lvl>
+    <w:lvl w:ilvl="1" w:tplc="FFFFFFFF" w:tentative="1">
+      <w:start w:val="1"/>
+      <w:numFmt w:val="bullet"/>
+      <w:lvlText w:val="o"/>
+      <w:lvlJc w:val="left"/>
+      <w:pPr>
+        <w:ind w:left="1440" w:hanging="360"/>
+      </w:pPr>
+      <w:rPr>
+        <w:rFonts w:ascii="Courier New" w:hAnsi="Courier New" w:hint="default"/>
+      </w:rPr>
+    </w:lvl>
+    <w:lvl w:ilvl="2" w:tplc="FFFFFFFF" w:tentative="1">
+      <w:start w:val="1"/>
+      <w:numFmt w:val="bullet"/>
+      <w:lvlText w:val=""/>
+      <w:lvlJc w:val="left"/>
+      <w:pPr>
+        <w:ind w:left="2160" w:hanging="360"/>
+      </w:pPr>
+      <w:rPr>
+        <w:rFonts w:ascii="Wingdings" w:hAnsi="Wingdings" w:hint="default"/>
+      </w:rPr>
+    </w:lvl>
+    <w:lvl w:ilvl="3" w:tplc="FFFFFFFF" w:tentative="1">
+      <w:start w:val="1"/>
+      <w:numFmt w:val="bullet"/>
+      <w:lvlText w:val=""/>
+      <w:lvlJc w:val="left"/>
+      <w:pPr>
+        <w:ind w:left="2880" w:hanging="360"/>
+      </w:pPr>
+      <w:rPr>
+        <w:rFonts w:ascii="Symbol" w:hAnsi="Symbol" w:hint="default"/>
+      </w:rPr>
+    </w:lvl>
+    <w:lvl w:ilvl="4" w:tplc="FFFFFFFF" w:tentative="1">
+      <w:start w:val="1"/>
+      <w:numFmt w:val="bullet"/>
+      <w:lvlText w:val="o"/>
+      <w:lvlJc w:val="left"/>
+      <w:pPr>
+        <w:ind w:left="3600" w:hanging="360"/>
+      </w:pPr>
+      <w:rPr>
+        <w:rFonts w:ascii="Courier New" w:hAnsi="Courier New" w:hint="default"/>
+      </w:rPr>
+    </w:lvl>
+    <w:lvl w:ilvl="5" w:tplc="FFFFFFFF" w:tentative="1">
+      <w:start w:val="1"/>
+      <w:numFmt w:val="bullet"/>
+      <w:lvlText w:val=""/>
+      <w:lvlJc w:val="left"/>
+      <w:pPr>
+        <w:ind w:left="4320" w:hanging="360"/>
+      </w:pPr>
+      <w:rPr>
+        <w:rFonts w:ascii="Wingdings" w:hAnsi="Wingdings" w:hint="default"/>
+      </w:rPr>
+    </w:lvl>
+    <w:lvl w:ilvl="6" w:tplc="FFFFFFFF" w:tentative="1">
+      <w:start w:val="1"/>
+      <w:numFmt w:val="bullet"/>
+      <w:lvlText w:val=""/>
+      <w:lvlJc w:val="left"/>
+      <w:pPr>
+        <w:ind w:left="5040" w:hanging="360"/>
+      </w:pPr>
+      <w:rPr>
+        <w:rFonts w:ascii="Symbol" w:hAnsi="Symbol" w:hint="default"/>
+      </w:rPr>
+    </w:lvl>
+    <w:lvl w:ilvl="7" w:tplc="FFFFFFFF" w:tentative="1">
+      <w:start w:val="1"/>
+      <w:numFmt w:val="bullet"/>
+      <w:lvlText w:val="o"/>
+      <w:lvlJc w:val="left"/>
+      <w:pPr>
+        <w:ind w:left="5760" w:hanging="360"/>
+      </w:pPr>
+      <w:rPr>
+        <w:rFonts w:ascii="Courier New" w:hAnsi="Courier New" w:hint="default"/>
+      </w:rPr>
+    </w:lvl>
+    <w:lvl w:ilvl="8" w:tplc="FFFFFFFF" w:tentative="1">
+      <w:start w:val="1"/>
+      <w:numFmt w:val="bullet"/>
+      <w:lvlText w:val=""/>
+      <w:lvlJc w:val="left"/>
+      <w:pPr>
+        <w:ind w:left="6480" w:hanging="360"/>
+      </w:pPr>
+      <w:rPr>
+        <w:rFonts w:ascii="Wingdings" w:hAnsi="Wingdings" w:hint="default"/>
+      </w:rPr>
+    </w:lvl>
+  </w:abstractNum>
+  <w:abstractNum w:abstractNumId="5" w15:restartNumberingAfterBreak="0">
     <w:nsid w:val="75C73734"/>
     <w:multiLevelType w:val="multilevel"/>
     <w:tmpl w:val="278A2480"/>
@@ -962,13 +1972,40 @@
     </w:lvl>
   </w:abstractNum>
   <w:num w:numId="1" w16cid:durableId="573317229">
+    <w:abstractNumId w:val="5"/>
+  </w:num>
+  <w:num w:numId="2" w16cid:durableId="478963753">
+    <w:abstractNumId w:val="3"/>
+  </w:num>
+  <w:num w:numId="3" w16cid:durableId="2029141044">
+    <w:abstractNumId w:val="3"/>
+  </w:num>
+  <w:num w:numId="4" w16cid:durableId="825513379">
+    <w:abstractNumId w:val="1"/>
+  </w:num>
+  <w:num w:numId="5" w16cid:durableId="861406267">
+    <w:abstractNumId w:val="4"/>
+  </w:num>
+  <w:num w:numId="6" w16cid:durableId="285551118">
     <w:abstractNumId w:val="0"/>
+  </w:num>
+  <w:num w:numId="7" w16cid:durableId="611672299">
+    <w:abstractNumId w:val="2"/>
+    <w:lvlOverride w:ilvl="0"/>
+    <w:lvlOverride w:ilvl="1"/>
+    <w:lvlOverride w:ilvl="2"/>
+    <w:lvlOverride w:ilvl="3"/>
+    <w:lvlOverride w:ilvl="4"/>
+    <w:lvlOverride w:ilvl="5"/>
+    <w:lvlOverride w:ilvl="6"/>
+    <w:lvlOverride w:ilvl="7"/>
+    <w:lvlOverride w:ilvl="8"/>
   </w:num>
 </w:numbering>
 </file>
 
 <file path=word/styles.xml><?xml version="1.0" encoding="utf-8"?>
-<w:styles xmlns:mc="http://schemas.openxmlformats.org/markup-compatibility/2006" xmlns:r="http://schemas.openxmlformats.org/officeDocument/2006/relationships" xmlns:w="http://schemas.openxmlformats.org/wordprocessingml/2006/main" xmlns:w14="http://schemas.microsoft.com/office/word/2010/wordml" xmlns:w15="http://schemas.microsoft.com/office/word/2012/wordml" xmlns:w16cex="http://schemas.microsoft.com/office/word/2018/wordml/cex" xmlns:w16cid="http://schemas.microsoft.com/office/word/2016/wordml/cid" xmlns:w16="http://schemas.microsoft.com/office/word/2018/wordml" xmlns:w16sdtdh="http://schemas.microsoft.com/office/word/2020/wordml/sdtdatahash" xmlns:w16se="http://schemas.microsoft.com/office/word/2015/wordml/symex" mc:Ignorable="w14 w15 w16se w16cid w16 w16cex w16sdtdh">
+<w:styles xmlns:mc="http://schemas.openxmlformats.org/markup-compatibility/2006" xmlns:r="http://schemas.openxmlformats.org/officeDocument/2006/relationships" xmlns:w="http://schemas.openxmlformats.org/wordprocessingml/2006/main" xmlns:w14="http://schemas.microsoft.com/office/word/2010/wordml" xmlns:w15="http://schemas.microsoft.com/office/word/2012/wordml" xmlns:w16cex="http://schemas.microsoft.com/office/word/2018/wordml/cex" xmlns:w16cid="http://schemas.microsoft.com/office/word/2016/wordml/cid" xmlns:w16="http://schemas.microsoft.com/office/word/2018/wordml" xmlns:w16du="http://schemas.microsoft.com/office/word/2023/wordml/word16du" xmlns:w16sdtdh="http://schemas.microsoft.com/office/word/2020/wordml/sdtdatahash" xmlns:w16sdtfl="http://schemas.microsoft.com/office/word/2024/wordml/sdtformatlock" xmlns:w16se="http://schemas.microsoft.com/office/word/2015/wordml/symex" mc:Ignorable="w14 w15 w16se w16cid w16 w16cex w16sdtdh w16sdtfl w16du">
   <w:docDefaults>
     <w:rPrDefault>
       <w:rPr>
@@ -1164,7 +2201,7 @@
     <w:lsdException w:name="Medium Shading 2 Accent 1" w:uiPriority="64"/>
     <w:lsdException w:name="Medium List 1 Accent 1" w:uiPriority="65"/>
     <w:lsdException w:name="Revision" w:semiHidden="1"/>
-    <w:lsdException w:name="List Paragraph" w:uiPriority="34" w:qFormat="1"/>
+    <w:lsdException w:name="List Paragraph" w:uiPriority="0" w:qFormat="1"/>
     <w:lsdException w:name="Quote" w:uiPriority="29" w:qFormat="1"/>
     <w:lsdException w:name="Intense Quote" w:uiPriority="30" w:qFormat="1"/>
     <w:lsdException w:name="Medium List 2 Accent 1" w:uiPriority="66"/>
@@ -1376,6 +2413,7 @@
   <w:style w:type="character" w:default="1" w:styleId="a0">
     <w:name w:val="Default Paragraph Font"/>
     <w:uiPriority w:val="1"/>
+    <w:semiHidden/>
     <w:unhideWhenUsed/>
   </w:style>
   <w:style w:type="table" w:default="1" w:styleId="a1">
@@ -1454,13 +2492,34 @@
   <w:style w:type="paragraph" w:styleId="a7">
     <w:name w:val="List Paragraph"/>
     <w:basedOn w:val="a"/>
-    <w:uiPriority w:val="34"/>
     <w:qFormat/>
     <w:rsid w:val="00275073"/>
     <w:pPr>
       <w:ind w:left="720"/>
       <w:contextualSpacing/>
     </w:pPr>
+  </w:style>
+  <w:style w:type="numbering" w:customStyle="1" w:styleId="1">
+    <w:name w:val="Текущий список1"/>
+    <w:uiPriority w:val="99"/>
+    <w:rsid w:val="005D1DD5"/>
+    <w:pPr>
+      <w:numPr>
+        <w:numId w:val="6"/>
+      </w:numPr>
+    </w:pPr>
+  </w:style>
+  <w:style w:type="character" w:styleId="a8">
+    <w:name w:val="Unresolved Mention"/>
+    <w:basedOn w:val="a0"/>
+    <w:uiPriority w:val="99"/>
+    <w:semiHidden/>
+    <w:unhideWhenUsed/>
+    <w:rsid w:val="002F786D"/>
+    <w:rPr>
+      <w:color w:val="605E5C"/>
+      <w:shd w:val="clear" w:color="auto" w:fill="E1DFDD"/>
+    </w:rPr>
   </w:style>
 </w:styles>
 </file>

</xml_diff>

<commit_message>
updated .pptx .docx v_last
</commit_message>
<xml_diff>
--- a/conference/conf.docx
+++ b/conference/conf.docx
@@ -1,6 +1,6 @@
 
 <file path=word/document.xml><?xml version="1.0" encoding="utf-8"?>
-<w:document xmlns:wpc="http://schemas.microsoft.com/office/word/2010/wordprocessingCanvas" xmlns:cx="http://schemas.microsoft.com/office/drawing/2014/chartex" xmlns:cx1="http://schemas.microsoft.com/office/drawing/2015/9/8/chartex" xmlns:cx2="http://schemas.microsoft.com/office/drawing/2015/10/21/chartex" xmlns:cx3="http://schemas.microsoft.com/office/drawing/2016/5/9/chartex" xmlns:cx4="http://schemas.microsoft.com/office/drawing/2016/5/10/chartex" xmlns:cx5="http://schemas.microsoft.com/office/drawing/2016/5/11/chartex" xmlns:cx6="http://schemas.microsoft.com/office/drawing/2016/5/12/chartex" xmlns:cx7="http://schemas.microsoft.com/office/drawing/2016/5/13/chartex" xmlns:cx8="http://schemas.microsoft.com/office/drawing/2016/5/14/chartex" xmlns:mc="http://schemas.openxmlformats.org/markup-compatibility/2006" xmlns:aink="http://schemas.microsoft.com/office/drawing/2016/ink" xmlns:am3d="http://schemas.microsoft.com/office/drawing/2017/model3d" xmlns:o="urn:schemas-microsoft-com:office:office" xmlns:oel="http://schemas.microsoft.com/office/2019/extlst" xmlns:r="http://schemas.openxmlformats.org/officeDocument/2006/relationships" xmlns:m="http://schemas.openxmlformats.org/officeDocument/2006/math" xmlns:v="urn:schemas-microsoft-com:vml" xmlns:wp14="http://schemas.microsoft.com/office/word/2010/wordprocessingDrawing" xmlns:wp="http://schemas.openxmlformats.org/drawingml/2006/wordprocessingDrawing" xmlns:w10="urn:schemas-microsoft-com:office:word" xmlns:w="http://schemas.openxmlformats.org/wordprocessingml/2006/main" xmlns:w14="http://schemas.microsoft.com/office/word/2010/wordml" xmlns:w15="http://schemas.microsoft.com/office/word/2012/wordml" xmlns:w16cex="http://schemas.microsoft.com/office/word/2018/wordml/cex" xmlns:w16cid="http://schemas.microsoft.com/office/word/2016/wordml/cid" xmlns:w16="http://schemas.microsoft.com/office/word/2018/wordml" xmlns:w16du="http://schemas.microsoft.com/office/word/2023/wordml/word16du" xmlns:w16sdtdh="http://schemas.microsoft.com/office/word/2020/wordml/sdtdatahash" xmlns:w16sdtfl="http://schemas.microsoft.com/office/word/2024/wordml/sdtformatlock" xmlns:w16se="http://schemas.microsoft.com/office/word/2015/wordml/symex" xmlns:wpg="http://schemas.microsoft.com/office/word/2010/wordprocessingGroup" xmlns:wpi="http://schemas.microsoft.com/office/word/2010/wordprocessingInk" xmlns:wne="http://schemas.microsoft.com/office/word/2006/wordml" xmlns:wps="http://schemas.microsoft.com/office/word/2010/wordprocessingShape" mc:Ignorable="w14 w15 w16se w16cid w16 w16cex w16sdtdh w16sdtfl w16du wp14">
+<w:document xmlns:wpc="http://schemas.microsoft.com/office/word/2010/wordprocessingCanvas" xmlns:cx="http://schemas.microsoft.com/office/drawing/2014/chartex" xmlns:cx1="http://schemas.microsoft.com/office/drawing/2015/9/8/chartex" xmlns:cx2="http://schemas.microsoft.com/office/drawing/2015/10/21/chartex" xmlns:cx3="http://schemas.microsoft.com/office/drawing/2016/5/9/chartex" xmlns:cx4="http://schemas.microsoft.com/office/drawing/2016/5/10/chartex" xmlns:cx5="http://schemas.microsoft.com/office/drawing/2016/5/11/chartex" xmlns:cx6="http://schemas.microsoft.com/office/drawing/2016/5/12/chartex" xmlns:cx7="http://schemas.microsoft.com/office/drawing/2016/5/13/chartex" xmlns:cx8="http://schemas.microsoft.com/office/drawing/2016/5/14/chartex" xmlns:mc="http://schemas.openxmlformats.org/markup-compatibility/2006" xmlns:aink="http://schemas.microsoft.com/office/drawing/2016/ink" xmlns:am3d="http://schemas.microsoft.com/office/drawing/2017/model3d" xmlns:o="urn:schemas-microsoft-com:office:office" xmlns:oel="http://schemas.microsoft.com/office/2019/extlst" xmlns:r="http://schemas.openxmlformats.org/officeDocument/2006/relationships" xmlns:m="http://schemas.openxmlformats.org/officeDocument/2006/math" xmlns:v="urn:schemas-microsoft-com:vml" xmlns:wp14="http://schemas.microsoft.com/office/word/2010/wordprocessingDrawing" xmlns:wp="http://schemas.openxmlformats.org/drawingml/2006/wordprocessingDrawing" xmlns:w10="urn:schemas-microsoft-com:office:word" xmlns:w="http://schemas.openxmlformats.org/wordprocessingml/2006/main" xmlns:w14="http://schemas.microsoft.com/office/word/2010/wordml" xmlns:w15="http://schemas.microsoft.com/office/word/2012/wordml" xmlns:w16cex="http://schemas.microsoft.com/office/word/2018/wordml/cex" xmlns:w16cid="http://schemas.microsoft.com/office/word/2016/wordml/cid" xmlns:w16="http://schemas.microsoft.com/office/word/2018/wordml" xmlns:w16sdtdh="http://schemas.microsoft.com/office/word/2020/wordml/sdtdatahash" xmlns:w16se="http://schemas.microsoft.com/office/word/2015/wordml/symex" xmlns:wpg="http://schemas.microsoft.com/office/word/2010/wordprocessingGroup" xmlns:wpi="http://schemas.microsoft.com/office/word/2010/wordprocessingInk" xmlns:wne="http://schemas.microsoft.com/office/word/2006/wordml" xmlns:wps="http://schemas.microsoft.com/office/word/2010/wordprocessingShape" mc:Ignorable="w14 w15 w16se w16cid w16 w16cex w16sdtdh wp14">
   <w:body>
     <w:p>
       <w:pPr>
@@ -11,6 +11,7 @@
           <w:szCs w:val="28"/>
         </w:rPr>
       </w:pPr>
+      <w:bookmarkStart w:id="0" w:name="_Hlk227660764"/>
       <w:r>
         <w:rPr>
           <w:rFonts w:ascii="Times New Roman" w:hAnsi="Times New Roman"/>
@@ -44,7 +45,7 @@
           <w:sz w:val="28"/>
           <w:szCs w:val="28"/>
         </w:rPr>
-        <w:t>Т. Ф. Марушко</w:t>
+        <w:t>Т.Ф. Марушко</w:t>
       </w:r>
     </w:p>
     <w:p>
@@ -87,7 +88,7 @@
           <w:sz w:val="28"/>
           <w:szCs w:val="28"/>
         </w:rPr>
-        <w:t xml:space="preserve"> Е. А. Блинова</w:t>
+        <w:t xml:space="preserve"> Е.А. Блинова</w:t>
       </w:r>
       <w:r>
         <w:rPr>
@@ -150,9 +151,28 @@
           <w:szCs w:val="28"/>
         </w:rPr>
         <w:noBreakHyphen/>
-        <w:t>АРХИТЕКТУРА НА ОСНОВЕ POSTGRESQL, CITUS И KUBERNETES</w:t>
+        <w:t>АРХИТЕКТУРА НА ОСНОВЕ</w:t>
+      </w:r>
+      <w:r>
+        <w:rPr>
+          <w:rFonts w:ascii="Times New Roman" w:hAnsi="Times New Roman"/>
+          <w:b/>
+          <w:sz w:val="28"/>
+          <w:szCs w:val="28"/>
+        </w:rPr>
+        <w:t xml:space="preserve"> ТЕХНОЛОГИЙ</w:t>
+      </w:r>
+      <w:r>
+        <w:rPr>
+          <w:rFonts w:ascii="Times New Roman" w:hAnsi="Times New Roman"/>
+          <w:b/>
+          <w:sz w:val="28"/>
+          <w:szCs w:val="28"/>
+        </w:rPr>
+        <w:t xml:space="preserve"> POSTGRESQL, CITUS И KUBERNETES</w:t>
       </w:r>
     </w:p>
+    <w:bookmarkEnd w:id="0"/>
     <w:p>
       <w:pPr>
         <w:spacing w:after="0" w:line="312" w:lineRule="exact"/>
@@ -198,7 +218,27 @@
           <w:sz w:val="28"/>
           <w:szCs w:val="28"/>
         </w:rPr>
-        <w:t>Цель работы — спроектировать и реализовать прототип распределённой мультимастер-СУБД на основе PostgreSQL, расширения Citus и оркестратора Kubernetes, а также оценить применимость данного стека для построения отказоустойчивых масштабируемых систем.</w:t>
+        <w:t xml:space="preserve">Цель работы </w:t>
+      </w:r>
+      <w:r>
+        <w:rPr>
+          <w:rFonts w:ascii="Times New Roman" w:hAnsi="Times New Roman"/>
+          <w:color w:val="000000"/>
+          <w:spacing w:val="-4"/>
+          <w:sz w:val="28"/>
+          <w:szCs w:val="28"/>
+        </w:rPr>
+        <w:t>–</w:t>
+      </w:r>
+      <w:r>
+        <w:rPr>
+          <w:rFonts w:ascii="Times New Roman" w:hAnsi="Times New Roman"/>
+          <w:color w:val="000000"/>
+          <w:spacing w:val="-4"/>
+          <w:sz w:val="28"/>
+          <w:szCs w:val="28"/>
+        </w:rPr>
+        <w:t xml:space="preserve"> спроектировать и реализовать прототип распределённой мультимастер-СУБД на основе PostgreSQL, расширения Citus и оркестратора Kubernetes, а также оценить применимость данного стека для построения отказоустойчивых масштабируемых систем.</w:t>
       </w:r>
     </w:p>
     <w:p>
@@ -250,51 +290,7 @@
           <w:sz w:val="28"/>
           <w:szCs w:val="28"/>
         </w:rPr>
-        <w:t xml:space="preserve">проектирование трёхуровневой топологии кластера и её автоматизированное развёртывание через </w:t>
-      </w:r>
-      <w:proofErr w:type="spellStart"/>
-      <w:r>
-        <w:rPr>
-          <w:rFonts w:ascii="Times New Roman" w:hAnsi="Times New Roman"/>
-          <w:color w:val="000000"/>
-          <w:spacing w:val="-4"/>
-          <w:sz w:val="28"/>
-          <w:szCs w:val="28"/>
-        </w:rPr>
-        <w:t>Helm</w:t>
-      </w:r>
-      <w:proofErr w:type="spellEnd"/>
-      <w:r>
-        <w:rPr>
-          <w:rFonts w:ascii="Times New Roman" w:hAnsi="Times New Roman"/>
-          <w:color w:val="000000"/>
-          <w:spacing w:val="-4"/>
-          <w:sz w:val="28"/>
-          <w:szCs w:val="28"/>
-        </w:rPr>
-        <w:t xml:space="preserve"> </w:t>
-      </w:r>
-      <w:proofErr w:type="spellStart"/>
-      <w:r>
-        <w:rPr>
-          <w:rFonts w:ascii="Times New Roman" w:hAnsi="Times New Roman"/>
-          <w:color w:val="000000"/>
-          <w:spacing w:val="-4"/>
-          <w:sz w:val="28"/>
-          <w:szCs w:val="28"/>
-        </w:rPr>
-        <w:t>Chart</w:t>
-      </w:r>
-      <w:proofErr w:type="spellEnd"/>
-      <w:r>
-        <w:rPr>
-          <w:rFonts w:ascii="Times New Roman" w:hAnsi="Times New Roman"/>
-          <w:color w:val="000000"/>
-          <w:spacing w:val="-4"/>
-          <w:sz w:val="28"/>
-          <w:szCs w:val="28"/>
-        </w:rPr>
-        <w:t>;</w:t>
+        <w:t>проектирование трёхуровневой топологии кластера и её автоматизированное развёртывание через Helm Chart;</w:t>
       </w:r>
     </w:p>
     <w:p>
@@ -350,29 +346,7 @@
           <w:sz w:val="28"/>
           <w:szCs w:val="28"/>
         </w:rPr>
-        <w:t xml:space="preserve">реализация </w:t>
-      </w:r>
-      <w:proofErr w:type="spellStart"/>
-      <w:r>
-        <w:rPr>
-          <w:rFonts w:ascii="Times New Roman" w:hAnsi="Times New Roman"/>
-          <w:color w:val="000000"/>
-          <w:spacing w:val="-4"/>
-          <w:sz w:val="28"/>
-          <w:szCs w:val="28"/>
-        </w:rPr>
-        <w:t>шардирования</w:t>
-      </w:r>
-      <w:proofErr w:type="spellEnd"/>
-      <w:r>
-        <w:rPr>
-          <w:rFonts w:ascii="Times New Roman" w:hAnsi="Times New Roman"/>
-          <w:color w:val="000000"/>
-          <w:spacing w:val="-4"/>
-          <w:sz w:val="28"/>
-          <w:szCs w:val="28"/>
-        </w:rPr>
-        <w:t xml:space="preserve"> через механизм промежуточных таблиц с триггерами;</w:t>
+        <w:t>реализация шардирования через механизм промежуточных таблиц с триггерами;</w:t>
       </w:r>
     </w:p>
     <w:p>
@@ -424,51 +398,67 @@
           <w:sz w:val="28"/>
           <w:szCs w:val="28"/>
         </w:rPr>
-        <w:t xml:space="preserve">Предложенный кластер разворачивается в пространстве имён Kubernetes и включает три уровня. Первый уровень — несколько мастер-узлов PostgreSQL, хранящих исходные данные и связанных между собой двунаправленной логической репликацией. Второй уровень — координаторы Citus, каждый из которых подписан на один мастер-узел и управляет своим набором воркеров. Третий уровень — </w:t>
-      </w:r>
-      <w:proofErr w:type="spellStart"/>
-      <w:r>
-        <w:rPr>
-          <w:rFonts w:ascii="Times New Roman" w:hAnsi="Times New Roman"/>
-          <w:color w:val="000000"/>
-          <w:spacing w:val="-4"/>
-          <w:sz w:val="28"/>
-          <w:szCs w:val="28"/>
-        </w:rPr>
-        <w:t>воркеры</w:t>
-      </w:r>
-      <w:proofErr w:type="spellEnd"/>
-      <w:r>
-        <w:rPr>
-          <w:rFonts w:ascii="Times New Roman" w:hAnsi="Times New Roman"/>
-          <w:color w:val="000000"/>
-          <w:spacing w:val="-4"/>
-          <w:sz w:val="28"/>
-          <w:szCs w:val="28"/>
-        </w:rPr>
-        <w:t xml:space="preserve">, хранящие </w:t>
-      </w:r>
-      <w:proofErr w:type="spellStart"/>
-      <w:r>
-        <w:rPr>
-          <w:rFonts w:ascii="Times New Roman" w:hAnsi="Times New Roman"/>
-          <w:color w:val="000000"/>
-          <w:spacing w:val="-4"/>
-          <w:sz w:val="28"/>
-          <w:szCs w:val="28"/>
-        </w:rPr>
-        <w:t>шарды</w:t>
-      </w:r>
-      <w:proofErr w:type="spellEnd"/>
-      <w:r>
-        <w:rPr>
-          <w:rFonts w:ascii="Times New Roman" w:hAnsi="Times New Roman"/>
-          <w:color w:val="000000"/>
-          <w:spacing w:val="-4"/>
-          <w:sz w:val="28"/>
-          <w:szCs w:val="28"/>
-        </w:rPr>
-        <w:t xml:space="preserve"> распределённых таблиц.</w:t>
+        <w:t xml:space="preserve">Предложенный кластер разворачивается в пространстве имён Kubernetes и включает три уровня. Первый уровень </w:t>
+      </w:r>
+      <w:r>
+        <w:rPr>
+          <w:rFonts w:ascii="Times New Roman" w:hAnsi="Times New Roman"/>
+          <w:color w:val="000000"/>
+          <w:spacing w:val="-4"/>
+          <w:sz w:val="28"/>
+          <w:szCs w:val="28"/>
+        </w:rPr>
+        <w:t>–</w:t>
+      </w:r>
+      <w:r>
+        <w:rPr>
+          <w:rFonts w:ascii="Times New Roman" w:hAnsi="Times New Roman"/>
+          <w:color w:val="000000"/>
+          <w:spacing w:val="-4"/>
+          <w:sz w:val="28"/>
+          <w:szCs w:val="28"/>
+        </w:rPr>
+        <w:t xml:space="preserve"> несколько мастер-узлов PostgreSQL, хранящих исходные данные и связанных между собой двунаправленной логической репликацией. Второй уровень </w:t>
+      </w:r>
+      <w:r>
+        <w:rPr>
+          <w:rFonts w:ascii="Times New Roman" w:hAnsi="Times New Roman"/>
+          <w:color w:val="000000"/>
+          <w:spacing w:val="-4"/>
+          <w:sz w:val="28"/>
+          <w:szCs w:val="28"/>
+        </w:rPr>
+        <w:t>–</w:t>
+      </w:r>
+      <w:r>
+        <w:rPr>
+          <w:rFonts w:ascii="Times New Roman" w:hAnsi="Times New Roman"/>
+          <w:color w:val="000000"/>
+          <w:spacing w:val="-4"/>
+          <w:sz w:val="28"/>
+          <w:szCs w:val="28"/>
+        </w:rPr>
+        <w:t xml:space="preserve"> координаторы Citus, каждый из которых подписан на один мастер-узел и управляет своим набором воркеров. Третий уровень </w:t>
+      </w:r>
+      <w:r>
+        <w:rPr>
+          <w:rFonts w:ascii="Times New Roman" w:hAnsi="Times New Roman"/>
+          <w:color w:val="000000"/>
+          <w:spacing w:val="-4"/>
+          <w:sz w:val="28"/>
+          <w:szCs w:val="28"/>
+        </w:rPr>
+        <w:t>–</w:t>
+      </w:r>
+      <w:r>
+        <w:rPr>
+          <w:rFonts w:ascii="Times New Roman" w:hAnsi="Times New Roman"/>
+          <w:color w:val="000000"/>
+          <w:spacing w:val="-4"/>
+          <w:sz w:val="28"/>
+          <w:szCs w:val="28"/>
+        </w:rPr>
+        <w:t xml:space="preserve"> воркеры, хранящие шарды распределённых таблиц.</w:t>
       </w:r>
     </w:p>
     <w:p>
@@ -492,7 +482,38 @@
           <w:sz w:val="28"/>
           <w:szCs w:val="28"/>
         </w:rPr>
-        <w:t>Все компоненты оформлены в виде StatefulSet, что обеспечивает стабильные сетевые имена и сохранность привязанных томов при перезапусках. Конфигурационные параметры подсистемы журналирования (WAL) передаются через аргументы командной строки в манифестах, что позволяет сохранять неизменяемость контейнерных образов.</w:t>
+        <w:t xml:space="preserve">Все компоненты оформлены в виде StatefulSet, что обеспечивает стабильные сетевые имена и сохранность привязанных томов при перезапусках. StatefulSet гарантирует предсказуемое DNS-имя каждого пода в формате &lt;имя&gt;.&lt;сервис&gt;.&lt;namespace&gt;.svc.cluster.local, что критично для PostgreSQL: при перезапуске пода hostname остаётся </w:t>
+      </w:r>
+      <w:r>
+        <w:rPr>
+          <w:rFonts w:ascii="Times New Roman" w:hAnsi="Times New Roman"/>
+          <w:color w:val="000000"/>
+          <w:spacing w:val="-4"/>
+          <w:sz w:val="28"/>
+          <w:szCs w:val="28"/>
+        </w:rPr>
+        <w:lastRenderedPageBreak/>
+        <w:t>прежним, и репликация продолжает работать без переконфигурации подписок. Хранилище каждого компонента выделяется через volumeClaimTemplates</w:t>
+      </w:r>
+      <w:r>
+        <w:rPr>
+          <w:rFonts w:ascii="Times New Roman" w:hAnsi="Times New Roman"/>
+          <w:color w:val="000000"/>
+          <w:spacing w:val="-4"/>
+          <w:sz w:val="28"/>
+          <w:szCs w:val="28"/>
+        </w:rPr>
+        <w:t xml:space="preserve"> </w:t>
+      </w:r>
+      <w:r>
+        <w:rPr>
+          <w:rFonts w:ascii="Times New Roman" w:hAnsi="Times New Roman"/>
+          <w:color w:val="000000"/>
+          <w:spacing w:val="-4"/>
+          <w:sz w:val="28"/>
+          <w:szCs w:val="28"/>
+        </w:rPr>
+        <w:t>с режимом доступа ReadWriteOnce, поскольку PostgreSQL требует эксклюзивного владения директорией данных. Суммарный объём заявленного хранилища составляет 155 ГБ: три мастера и три координатора по 10 ГБ, девять воркеров по 10 ГБ и один сервис блокировок на 5 ГБ.</w:t>
       </w:r>
     </w:p>
     <w:p>
@@ -516,30 +537,173 @@
           <w:sz w:val="28"/>
           <w:szCs w:val="28"/>
         </w:rPr>
-        <w:lastRenderedPageBreak/>
-        <w:t xml:space="preserve">Между мастер-узлами реализована mesh-репликация: каждый узел публикует целевые таблицы и подписывается на публикации остальных. Для предотвращения циклической пересылки транзакций в логической репликации используется параметр origin = none, указывающий, что изменения, полученные по репликации, не должны распространяться далее. Поскольку Citus не поддерживает логическую репликацию непосредственно в распределённые таблицы, применена схема с промежуточной локальной таблицей и триггером, синхронизирующим данные с </w:t>
-      </w:r>
-      <w:proofErr w:type="spellStart"/>
-      <w:r>
-        <w:rPr>
-          <w:rFonts w:ascii="Times New Roman" w:hAnsi="Times New Roman"/>
-          <w:color w:val="000000"/>
-          <w:spacing w:val="-4"/>
-          <w:sz w:val="28"/>
-          <w:szCs w:val="28"/>
-        </w:rPr>
-        <w:t>шардированной</w:t>
-      </w:r>
-      <w:proofErr w:type="spellEnd"/>
-      <w:r>
-        <w:rPr>
-          <w:rFonts w:ascii="Times New Roman" w:hAnsi="Times New Roman"/>
-          <w:color w:val="000000"/>
-          <w:spacing w:val="-4"/>
-          <w:sz w:val="28"/>
-          <w:szCs w:val="28"/>
-        </w:rPr>
-        <w:t xml:space="preserve"> таблицей.</w:t>
+        <w:t>Конфигурационные параметры подсистемы журналирования (WAL) передаются через аргументы командной строки в манифестах, что позволяет сохранять неизменяемость контейнерных образов. Режим wal_level=logical</w:t>
+      </w:r>
+      <w:r>
+        <w:rPr>
+          <w:rFonts w:ascii="Times New Roman" w:hAnsi="Times New Roman"/>
+          <w:color w:val="000000"/>
+          <w:spacing w:val="-4"/>
+          <w:sz w:val="28"/>
+          <w:szCs w:val="28"/>
+        </w:rPr>
+        <w:t xml:space="preserve"> </w:t>
+      </w:r>
+      <w:r>
+        <w:rPr>
+          <w:rFonts w:ascii="Times New Roman" w:hAnsi="Times New Roman"/>
+          <w:color w:val="000000"/>
+          <w:spacing w:val="-4"/>
+          <w:sz w:val="28"/>
+          <w:szCs w:val="28"/>
+        </w:rPr>
+        <w:t>является обязательным условием для работы логической репликации: он включает в журнал достаточно информации для декодирования изменений на уровне строк. Параметры</w:t>
+      </w:r>
+      <w:r>
+        <w:rPr>
+          <w:rFonts w:ascii="Times New Roman" w:hAnsi="Times New Roman"/>
+          <w:color w:val="000000"/>
+          <w:spacing w:val="-4"/>
+          <w:sz w:val="28"/>
+          <w:szCs w:val="28"/>
+          <w:lang w:val="en-US"/>
+        </w:rPr>
+        <w:t> max_replication_slots=10, max_wal_senders=10</w:t>
+      </w:r>
+      <w:r>
+        <w:rPr>
+          <w:rFonts w:ascii="Times New Roman" w:hAnsi="Times New Roman"/>
+          <w:color w:val="000000"/>
+          <w:spacing w:val="-4"/>
+          <w:sz w:val="28"/>
+          <w:szCs w:val="28"/>
+          <w:lang w:val="en-US"/>
+        </w:rPr>
+        <w:t> </w:t>
+      </w:r>
+      <w:r>
+        <w:rPr>
+          <w:rFonts w:ascii="Times New Roman" w:hAnsi="Times New Roman"/>
+          <w:color w:val="000000"/>
+          <w:spacing w:val="-4"/>
+          <w:sz w:val="28"/>
+          <w:szCs w:val="28"/>
+        </w:rPr>
+        <w:t>и</w:t>
+      </w:r>
+      <w:r>
+        <w:rPr>
+          <w:rFonts w:ascii="Times New Roman" w:hAnsi="Times New Roman"/>
+          <w:color w:val="000000"/>
+          <w:spacing w:val="-4"/>
+          <w:sz w:val="28"/>
+          <w:szCs w:val="28"/>
+          <w:lang w:val="en-US"/>
+        </w:rPr>
+        <w:t> max_logical_replication_workers=10</w:t>
+      </w:r>
+      <w:r>
+        <w:rPr>
+          <w:rFonts w:ascii="Times New Roman" w:hAnsi="Times New Roman"/>
+          <w:color w:val="000000"/>
+          <w:spacing w:val="-4"/>
+          <w:sz w:val="28"/>
+          <w:szCs w:val="28"/>
+          <w:lang w:val="en-US"/>
+        </w:rPr>
+        <w:t xml:space="preserve"> </w:t>
+      </w:r>
+      <w:r>
+        <w:rPr>
+          <w:rFonts w:ascii="Times New Roman" w:hAnsi="Times New Roman"/>
+          <w:color w:val="000000"/>
+          <w:spacing w:val="-4"/>
+          <w:sz w:val="28"/>
+          <w:szCs w:val="28"/>
+        </w:rPr>
+        <w:t>определяют</w:t>
+      </w:r>
+      <w:r>
+        <w:rPr>
+          <w:rFonts w:ascii="Times New Roman" w:hAnsi="Times New Roman"/>
+          <w:color w:val="000000"/>
+          <w:spacing w:val="-4"/>
+          <w:sz w:val="28"/>
+          <w:szCs w:val="28"/>
+          <w:lang w:val="en-US"/>
+        </w:rPr>
+        <w:t xml:space="preserve"> </w:t>
+      </w:r>
+      <w:r>
+        <w:rPr>
+          <w:rFonts w:ascii="Times New Roman" w:hAnsi="Times New Roman"/>
+          <w:color w:val="000000"/>
+          <w:spacing w:val="-4"/>
+          <w:sz w:val="28"/>
+          <w:szCs w:val="28"/>
+        </w:rPr>
+        <w:t>верхнюю</w:t>
+      </w:r>
+      <w:r>
+        <w:rPr>
+          <w:rFonts w:ascii="Times New Roman" w:hAnsi="Times New Roman"/>
+          <w:color w:val="000000"/>
+          <w:spacing w:val="-4"/>
+          <w:sz w:val="28"/>
+          <w:szCs w:val="28"/>
+          <w:lang w:val="en-US"/>
+        </w:rPr>
+        <w:t xml:space="preserve"> </w:t>
+      </w:r>
+      <w:r>
+        <w:rPr>
+          <w:rFonts w:ascii="Times New Roman" w:hAnsi="Times New Roman"/>
+          <w:color w:val="000000"/>
+          <w:spacing w:val="-4"/>
+          <w:sz w:val="28"/>
+          <w:szCs w:val="28"/>
+        </w:rPr>
+        <w:t>границу одновременных соединений репликации; max_worker_processes=20</w:t>
+      </w:r>
+      <w:r>
+        <w:rPr>
+          <w:rFonts w:ascii="Times New Roman" w:hAnsi="Times New Roman"/>
+          <w:color w:val="000000"/>
+          <w:spacing w:val="-4"/>
+          <w:sz w:val="28"/>
+          <w:szCs w:val="28"/>
+        </w:rPr>
+        <w:t xml:space="preserve"> </w:t>
+      </w:r>
+      <w:r>
+        <w:rPr>
+          <w:rFonts w:ascii="Times New Roman" w:hAnsi="Times New Roman"/>
+          <w:color w:val="000000"/>
+          <w:spacing w:val="-4"/>
+          <w:sz w:val="28"/>
+          <w:szCs w:val="28"/>
+        </w:rPr>
+        <w:t>резервирует фоновые слоты, часть из которых потребляет сам Citus. Все значения задаются централизованно в values.yaml</w:t>
+      </w:r>
+      <w:r>
+        <w:rPr>
+          <w:rFonts w:ascii="Times New Roman" w:hAnsi="Times New Roman"/>
+          <w:color w:val="000000"/>
+          <w:spacing w:val="-4"/>
+          <w:sz w:val="28"/>
+          <w:szCs w:val="28"/>
+        </w:rPr>
+        <w:t xml:space="preserve"> </w:t>
+      </w:r>
+      <w:r>
+        <w:rPr>
+          <w:rFonts w:ascii="Times New Roman" w:hAnsi="Times New Roman"/>
+          <w:color w:val="000000"/>
+          <w:spacing w:val="-4"/>
+          <w:sz w:val="28"/>
+          <w:szCs w:val="28"/>
+        </w:rPr>
+        <w:t>и подставляются через шаблонизатор.</w:t>
       </w:r>
     </w:p>
     <w:p>
@@ -563,7 +727,27 @@
           <w:sz w:val="28"/>
           <w:szCs w:val="28"/>
         </w:rPr>
-        <w:t>Конкурентная запись одной и той же строки на разных мастер-узлах приводит к риску конфликтов при репликации. Для устранения этого риска реализован отдельный сервис глобальных блокировок pg-locker на основе экземпляра PostgreSQL со специальной схемой и таблицей блокировок. Координаторы обращаются к нему через расширение dblink, вызывая обёртки для установки и освобождения блокировок. Использование форматирования запросов с параметрами %L позволяет избежать SQL-инъекций при формировании динамических SQL-команд.</w:t>
+        <w:t>Между мастер-узлами реализована mesh-репликация: каждый узел публикует целевые таблицы и подписывается на публикации остальных. Для предотвращения циклической пересылки транзакций используется параметр origin = none: подписчик принимает только локально порождённые транзакции, не ретранслируя транзитные данные. Без этого параметра изменения циклически пересылались бы между узлами бесконечно. Флаг copy_data = false</w:t>
+      </w:r>
+      <w:r>
+        <w:rPr>
+          <w:rFonts w:ascii="Times New Roman" w:hAnsi="Times New Roman"/>
+          <w:color w:val="000000"/>
+          <w:spacing w:val="-4"/>
+          <w:sz w:val="28"/>
+          <w:szCs w:val="28"/>
+        </w:rPr>
+        <w:t xml:space="preserve"> </w:t>
+      </w:r>
+      <w:r>
+        <w:rPr>
+          <w:rFonts w:ascii="Times New Roman" w:hAnsi="Times New Roman"/>
+          <w:color w:val="000000"/>
+          <w:spacing w:val="-4"/>
+          <w:sz w:val="28"/>
+          <w:szCs w:val="28"/>
+        </w:rPr>
+        <w:t>исключает дублирование строк при создании подписок поверх уже заполненных таблиц.</w:t>
       </w:r>
     </w:p>
     <w:p>
@@ -587,20 +771,535 @@
           <w:sz w:val="28"/>
           <w:szCs w:val="28"/>
         </w:rPr>
-        <w:t>Полученный прототип показывает, что комбинация PostgreSQL, Citus и Kubernetes может быть использована для построения отказоустойчивых систем с горизонтальным масштабированием. Kubernetes обеспечивает инфраструктурную надёжность и автоматизацию развёртывания, Citus — распределённое хранение и обработку шардированных данных, PostgreSQL — гибкий механизм логической репликации. Ключевыми аспектами проектирования являются корректная настройка параметра origin в подписках и разделение шардируемых и локальных таблиц с учётом ограничений Citus.</w:t>
+        <w:t>Поскольку Citus не поддерживает логическую репликацию непосредственно в распределённые таблицы, применена схема с промежуточной локальной таблицей и триггером. На каждом координаторе существуют app_users</w:t>
+      </w:r>
+      <w:r>
+        <w:rPr>
+          <w:rFonts w:ascii="Times New Roman" w:hAnsi="Times New Roman"/>
+          <w:color w:val="000000"/>
+          <w:spacing w:val="-4"/>
+          <w:sz w:val="28"/>
+          <w:szCs w:val="28"/>
+        </w:rPr>
+        <w:t xml:space="preserve"> </w:t>
+      </w:r>
+      <w:r>
+        <w:rPr>
+          <w:rFonts w:ascii="Times New Roman" w:hAnsi="Times New Roman"/>
+          <w:color w:val="000000"/>
+          <w:spacing w:val="-4"/>
+          <w:sz w:val="28"/>
+          <w:szCs w:val="28"/>
+        </w:rPr>
+        <w:t>(локальная, принимает данные из репликации) и app_users_distributed</w:t>
+      </w:r>
+      <w:r>
+        <w:rPr>
+          <w:rFonts w:ascii="Times New Roman" w:hAnsi="Times New Roman"/>
+          <w:color w:val="000000"/>
+          <w:spacing w:val="-4"/>
+          <w:sz w:val="28"/>
+          <w:szCs w:val="28"/>
+        </w:rPr>
+        <w:t xml:space="preserve"> </w:t>
+      </w:r>
+      <w:r>
+        <w:rPr>
+          <w:rFonts w:ascii="Times New Roman" w:hAnsi="Times New Roman"/>
+          <w:color w:val="000000"/>
+          <w:spacing w:val="-4"/>
+          <w:sz w:val="28"/>
+          <w:szCs w:val="28"/>
+        </w:rPr>
+        <w:t>(шардированная по полю id</w:t>
+      </w:r>
+      <w:r>
+        <w:rPr>
+          <w:rFonts w:ascii="Times New Roman" w:hAnsi="Times New Roman"/>
+          <w:color w:val="000000"/>
+          <w:spacing w:val="-4"/>
+          <w:sz w:val="28"/>
+          <w:szCs w:val="28"/>
+        </w:rPr>
+        <w:t xml:space="preserve"> </w:t>
+      </w:r>
+      <w:r>
+        <w:rPr>
+          <w:rFonts w:ascii="Times New Roman" w:hAnsi="Times New Roman"/>
+          <w:color w:val="000000"/>
+          <w:spacing w:val="-4"/>
+          <w:sz w:val="28"/>
+          <w:szCs w:val="28"/>
+        </w:rPr>
+        <w:t>с 32 шардами). Триггер</w:t>
+      </w:r>
+      <w:r>
+        <w:rPr>
+          <w:rFonts w:ascii="Times New Roman" w:hAnsi="Times New Roman"/>
+          <w:color w:val="000000"/>
+          <w:spacing w:val="-4"/>
+          <w:sz w:val="28"/>
+          <w:szCs w:val="28"/>
+        </w:rPr>
+        <w:t> </w:t>
+      </w:r>
+      <w:r>
+        <w:rPr>
+          <w:rFonts w:ascii="Times New Roman" w:hAnsi="Times New Roman"/>
+          <w:color w:val="000000"/>
+          <w:spacing w:val="-4"/>
+          <w:sz w:val="28"/>
+          <w:szCs w:val="28"/>
+        </w:rPr>
+        <w:t>trg_sync</w:t>
+      </w:r>
+      <w:r>
+        <w:rPr>
+          <w:rFonts w:ascii="Times New Roman" w:hAnsi="Times New Roman"/>
+          <w:color w:val="000000"/>
+          <w:spacing w:val="-4"/>
+          <w:sz w:val="28"/>
+          <w:szCs w:val="28"/>
+        </w:rPr>
+        <w:t xml:space="preserve"> синхронизирует </w:t>
+      </w:r>
+      <w:r>
+        <w:rPr>
+          <w:rFonts w:ascii="Times New Roman" w:hAnsi="Times New Roman"/>
+          <w:color w:val="000000"/>
+          <w:spacing w:val="-4"/>
+          <w:sz w:val="28"/>
+          <w:szCs w:val="28"/>
+        </w:rPr>
+        <w:t>все операции в шардированную таблицу через ON CONFLICT DO UPDATE. Ключевым условием является активация режима ENABLE REPLICA: без него данные, пришедшие через подписку, не попали бы в app_users_distributed. Replication worker использует пустой search_path, поэтому в теле триггерной функции требуется явное указание схемы public.</w:t>
       </w:r>
     </w:p>
     <w:p>
       <w:pPr>
+        <w:spacing w:after="0" w:line="312" w:lineRule="exact"/>
+        <w:ind w:firstLine="709"/>
+        <w:jc w:val="both"/>
+        <w:rPr>
+          <w:rFonts w:ascii="Times New Roman" w:hAnsi="Times New Roman"/>
+          <w:color w:val="000000"/>
+          <w:spacing w:val="-4"/>
+          <w:sz w:val="28"/>
+          <w:szCs w:val="28"/>
+        </w:rPr>
+      </w:pPr>
+      <w:r>
+        <w:rPr>
+          <w:rFonts w:ascii="Times New Roman" w:hAnsi="Times New Roman"/>
+          <w:color w:val="000000"/>
+          <w:spacing w:val="-4"/>
+          <w:sz w:val="28"/>
+          <w:szCs w:val="28"/>
+        </w:rPr>
+        <w:t>Конкурентная запись одной строки на разных мастер-узлах создаёт риск конфликтов при репликации. Для его устранения реализован сервис глобальных блокировок pg-locker</w:t>
+      </w:r>
+      <w:r>
+        <w:rPr>
+          <w:rFonts w:ascii="Times New Roman" w:hAnsi="Times New Roman"/>
+          <w:color w:val="000000"/>
+          <w:spacing w:val="-4"/>
+          <w:sz w:val="28"/>
+          <w:szCs w:val="28"/>
+        </w:rPr>
+        <w:t xml:space="preserve"> </w:t>
+      </w:r>
+      <w:r>
+        <w:rPr>
+          <w:rFonts w:ascii="Times New Roman" w:hAnsi="Times New Roman"/>
+          <w:color w:val="000000"/>
+          <w:spacing w:val="-4"/>
+          <w:sz w:val="28"/>
+          <w:szCs w:val="28"/>
+        </w:rPr>
+        <w:t>на основе PostgreSQL. Таблица locker.locks</w:t>
+      </w:r>
+      <w:r>
+        <w:rPr>
+          <w:rFonts w:ascii="Times New Roman" w:hAnsi="Times New Roman"/>
+          <w:color w:val="000000"/>
+          <w:spacing w:val="-4"/>
+          <w:sz w:val="28"/>
+          <w:szCs w:val="28"/>
+        </w:rPr>
+        <w:t xml:space="preserve"> </w:t>
+      </w:r>
+      <w:r>
+        <w:rPr>
+          <w:rFonts w:ascii="Times New Roman" w:hAnsi="Times New Roman"/>
+          <w:color w:val="000000"/>
+          <w:spacing w:val="-4"/>
+          <w:sz w:val="28"/>
+          <w:szCs w:val="28"/>
+        </w:rPr>
+        <w:t>хранит тройку (table_name, key_text, coord_id)</w:t>
+      </w:r>
+      <w:r>
+        <w:rPr>
+          <w:rFonts w:ascii="Times New Roman" w:hAnsi="Times New Roman"/>
+          <w:color w:val="000000"/>
+          <w:spacing w:val="-4"/>
+          <w:sz w:val="28"/>
+          <w:szCs w:val="28"/>
+        </w:rPr>
+        <w:t xml:space="preserve"> </w:t>
+      </w:r>
+      <w:r>
+        <w:rPr>
+          <w:rFonts w:ascii="Times New Roman" w:hAnsi="Times New Roman"/>
+          <w:color w:val="000000"/>
+          <w:spacing w:val="-4"/>
+          <w:sz w:val="28"/>
+          <w:szCs w:val="28"/>
+        </w:rPr>
+        <w:t>с составным первичным ключом. Функция locker.try_lock</w:t>
+      </w:r>
+      <w:r>
+        <w:rPr>
+          <w:rFonts w:ascii="Times New Roman" w:hAnsi="Times New Roman"/>
+          <w:color w:val="000000"/>
+          <w:spacing w:val="-4"/>
+          <w:sz w:val="28"/>
+          <w:szCs w:val="28"/>
+        </w:rPr>
+        <w:t xml:space="preserve"> </w:t>
+      </w:r>
+      <w:r>
+        <w:rPr>
+          <w:rFonts w:ascii="Times New Roman" w:hAnsi="Times New Roman"/>
+          <w:color w:val="000000"/>
+          <w:spacing w:val="-4"/>
+          <w:sz w:val="28"/>
+          <w:szCs w:val="28"/>
+        </w:rPr>
+        <w:t>использует SELECT</w:t>
+      </w:r>
+      <w:r>
+        <w:rPr>
+          <w:rFonts w:ascii="Times New Roman" w:hAnsi="Times New Roman"/>
+          <w:color w:val="000000"/>
+          <w:spacing w:val="-4"/>
+          <w:sz w:val="28"/>
+          <w:szCs w:val="28"/>
+        </w:rPr>
+        <w:t> …</w:t>
+      </w:r>
+      <w:r>
+        <w:rPr>
+          <w:rFonts w:ascii="Times New Roman" w:hAnsi="Times New Roman"/>
+          <w:color w:val="000000"/>
+          <w:spacing w:val="-4"/>
+          <w:sz w:val="28"/>
+          <w:szCs w:val="28"/>
+          <w:lang w:val="en-US"/>
+        </w:rPr>
+        <w:t> </w:t>
+      </w:r>
+      <w:r>
+        <w:rPr>
+          <w:rFonts w:ascii="Times New Roman" w:hAnsi="Times New Roman"/>
+          <w:color w:val="000000"/>
+          <w:spacing w:val="-4"/>
+          <w:sz w:val="28"/>
+          <w:szCs w:val="28"/>
+        </w:rPr>
+        <w:t>FOR</w:t>
+      </w:r>
+      <w:r>
+        <w:rPr>
+          <w:rFonts w:ascii="Times New Roman" w:hAnsi="Times New Roman"/>
+          <w:color w:val="000000"/>
+          <w:spacing w:val="-4"/>
+          <w:sz w:val="28"/>
+          <w:szCs w:val="28"/>
+          <w:lang w:val="en-US"/>
+        </w:rPr>
+        <w:t> </w:t>
+      </w:r>
+      <w:r>
+        <w:rPr>
+          <w:rFonts w:ascii="Times New Roman" w:hAnsi="Times New Roman"/>
+          <w:color w:val="000000"/>
+          <w:spacing w:val="-4"/>
+          <w:sz w:val="28"/>
+          <w:szCs w:val="28"/>
+        </w:rPr>
+        <w:t>UPDATE</w:t>
+      </w:r>
+      <w:r>
+        <w:rPr>
+          <w:rFonts w:ascii="Times New Roman" w:hAnsi="Times New Roman"/>
+          <w:color w:val="000000"/>
+          <w:spacing w:val="-4"/>
+          <w:sz w:val="28"/>
+          <w:szCs w:val="28"/>
+        </w:rPr>
+        <w:t xml:space="preserve"> </w:t>
+      </w:r>
+      <w:r>
+        <w:rPr>
+          <w:rFonts w:ascii="Times New Roman" w:hAnsi="Times New Roman"/>
+          <w:color w:val="000000"/>
+          <w:spacing w:val="-4"/>
+          <w:sz w:val="28"/>
+          <w:szCs w:val="28"/>
+        </w:rPr>
+        <w:t xml:space="preserve">для атомарного захвата </w:t>
+      </w:r>
+      <w:r>
+        <w:rPr>
+          <w:rFonts w:ascii="Times New Roman" w:hAnsi="Times New Roman"/>
+          <w:color w:val="000000"/>
+          <w:spacing w:val="-4"/>
+          <w:sz w:val="28"/>
+          <w:szCs w:val="28"/>
+        </w:rPr>
+        <w:lastRenderedPageBreak/>
+        <w:t>блокировки; при конфликте генерируется исключение lock_not_available. Координаторы обращаются к сервису через dblink, вызывая обёртки locker_call_try_lock</w:t>
+      </w:r>
+      <w:r>
+        <w:rPr>
+          <w:rFonts w:ascii="Times New Roman" w:hAnsi="Times New Roman"/>
+          <w:color w:val="000000"/>
+          <w:spacing w:val="-4"/>
+          <w:sz w:val="28"/>
+          <w:szCs w:val="28"/>
+        </w:rPr>
+        <w:t> </w:t>
+      </w:r>
+      <w:r>
+        <w:rPr>
+          <w:rFonts w:ascii="Times New Roman" w:hAnsi="Times New Roman"/>
+          <w:color w:val="000000"/>
+          <w:spacing w:val="-4"/>
+          <w:sz w:val="28"/>
+          <w:szCs w:val="28"/>
+        </w:rPr>
+        <w:t>и locker_call_release_lock</w:t>
+      </w:r>
+      <w:r>
+        <w:rPr>
+          <w:rFonts w:ascii="Times New Roman" w:hAnsi="Times New Roman"/>
+          <w:color w:val="000000"/>
+          <w:spacing w:val="-4"/>
+          <w:sz w:val="28"/>
+          <w:szCs w:val="28"/>
+        </w:rPr>
+        <w:t xml:space="preserve"> </w:t>
+      </w:r>
+      <w:r>
+        <w:rPr>
+          <w:rFonts w:ascii="Times New Roman" w:hAnsi="Times New Roman"/>
+          <w:color w:val="000000"/>
+          <w:spacing w:val="-4"/>
+          <w:sz w:val="28"/>
+          <w:szCs w:val="28"/>
+        </w:rPr>
+        <w:t>с параметрами %L</w:t>
+      </w:r>
+      <w:r>
+        <w:rPr>
+          <w:rFonts w:ascii="Times New Roman" w:hAnsi="Times New Roman"/>
+          <w:color w:val="000000"/>
+          <w:spacing w:val="-4"/>
+          <w:sz w:val="28"/>
+          <w:szCs w:val="28"/>
+        </w:rPr>
+        <w:t xml:space="preserve"> </w:t>
+      </w:r>
+      <w:r>
+        <w:rPr>
+          <w:rFonts w:ascii="Times New Roman" w:hAnsi="Times New Roman"/>
+          <w:color w:val="000000"/>
+          <w:spacing w:val="-4"/>
+          <w:sz w:val="28"/>
+          <w:szCs w:val="28"/>
+        </w:rPr>
+        <w:t>для защиты от SQL-инъекций.</w:t>
+      </w:r>
+    </w:p>
+    <w:p>
+      <w:pPr>
+        <w:spacing w:after="0" w:line="312" w:lineRule="exact"/>
+        <w:ind w:firstLine="709"/>
+        <w:jc w:val="both"/>
+        <w:rPr>
+          <w:rFonts w:ascii="Times New Roman" w:hAnsi="Times New Roman"/>
+          <w:color w:val="000000"/>
+          <w:spacing w:val="-4"/>
+          <w:sz w:val="28"/>
+          <w:szCs w:val="28"/>
+        </w:rPr>
+      </w:pPr>
+      <w:r>
+        <w:rPr>
+          <w:rFonts w:ascii="Times New Roman" w:hAnsi="Times New Roman"/>
+          <w:color w:val="000000"/>
+          <w:spacing w:val="-4"/>
+          <w:sz w:val="28"/>
+          <w:szCs w:val="28"/>
+        </w:rPr>
+        <w:t>Всё развёртывание автоматизировано через Helm Chart. Директива {{- range }}</w:t>
+      </w:r>
+      <w:r>
+        <w:rPr>
+          <w:rFonts w:ascii="Times New Roman" w:hAnsi="Times New Roman"/>
+          <w:color w:val="000000"/>
+          <w:spacing w:val="-4"/>
+          <w:sz w:val="28"/>
+          <w:szCs w:val="28"/>
+        </w:rPr>
+        <w:t xml:space="preserve"> </w:t>
+      </w:r>
+      <w:r>
+        <w:rPr>
+          <w:rFonts w:ascii="Times New Roman" w:hAnsi="Times New Roman"/>
+          <w:color w:val="000000"/>
+          <w:spacing w:val="-4"/>
+          <w:sz w:val="28"/>
+          <w:szCs w:val="28"/>
+        </w:rPr>
+        <w:t>генерирует пары Service + StatefulSet для каждого узла из values.yaml; сервис блокировок подключается условно через {{-</w:t>
+      </w:r>
+      <w:r>
+        <w:rPr>
+          <w:rFonts w:ascii="Times New Roman" w:hAnsi="Times New Roman"/>
+          <w:color w:val="000000"/>
+          <w:spacing w:val="-4"/>
+          <w:sz w:val="28"/>
+          <w:szCs w:val="28"/>
+        </w:rPr>
+        <w:t> </w:t>
+      </w:r>
+      <w:r>
+        <w:rPr>
+          <w:rFonts w:ascii="Times New Roman" w:hAnsi="Times New Roman"/>
+          <w:color w:val="000000"/>
+          <w:spacing w:val="-4"/>
+          <w:sz w:val="28"/>
+          <w:szCs w:val="28"/>
+        </w:rPr>
+        <w:t>if</w:t>
+      </w:r>
+      <w:r>
+        <w:rPr>
+          <w:rFonts w:ascii="Times New Roman" w:hAnsi="Times New Roman"/>
+          <w:color w:val="000000"/>
+          <w:spacing w:val="-4"/>
+          <w:sz w:val="28"/>
+          <w:szCs w:val="28"/>
+        </w:rPr>
+        <w:t> </w:t>
+      </w:r>
+      <w:r>
+        <w:rPr>
+          <w:rFonts w:ascii="Times New Roman" w:hAnsi="Times New Roman"/>
+          <w:color w:val="000000"/>
+          <w:spacing w:val="-4"/>
+          <w:sz w:val="28"/>
+          <w:szCs w:val="28"/>
+        </w:rPr>
+        <w:t>.Values.locker.enabled }}. Для воркеров применяется Headless Service (clusterIP: None), обеспечивающий стабильную DNS-адресацию, необходимую для master_add_node()</w:t>
+      </w:r>
+      <w:r>
+        <w:rPr>
+          <w:rFonts w:ascii="Times New Roman" w:hAnsi="Times New Roman"/>
+          <w:color w:val="000000"/>
+          <w:spacing w:val="-4"/>
+          <w:sz w:val="28"/>
+          <w:szCs w:val="28"/>
+        </w:rPr>
+        <w:t xml:space="preserve"> </w:t>
+      </w:r>
+      <w:r>
+        <w:rPr>
+          <w:rFonts w:ascii="Times New Roman" w:hAnsi="Times New Roman"/>
+          <w:color w:val="000000"/>
+          <w:spacing w:val="-4"/>
+          <w:sz w:val="28"/>
+          <w:szCs w:val="28"/>
+        </w:rPr>
+        <w:t>в Citus.</w:t>
+      </w:r>
+    </w:p>
+    <w:p>
+      <w:pPr>
+        <w:spacing w:after="0" w:line="312" w:lineRule="exact"/>
+        <w:ind w:firstLine="709"/>
+        <w:jc w:val="both"/>
+        <w:rPr>
+          <w:rFonts w:ascii="Times New Roman" w:hAnsi="Times New Roman"/>
+          <w:color w:val="000000"/>
+          <w:spacing w:val="-4"/>
+          <w:sz w:val="28"/>
+          <w:szCs w:val="28"/>
+        </w:rPr>
+      </w:pPr>
+      <w:r>
+        <w:rPr>
+          <w:rFonts w:ascii="Times New Roman" w:hAnsi="Times New Roman"/>
+          <w:color w:val="000000"/>
+          <w:spacing w:val="-4"/>
+          <w:sz w:val="28"/>
+          <w:szCs w:val="28"/>
+        </w:rPr>
+        <w:t>Полученный прототип показывает, что комбинация PostgreSQL, Citus и Kubernetes применима для построения отказоустойчивых систем с горизонтальным масштабированием. Ключевыми аспектами проектирования являются корректная настройка origin = none</w:t>
+      </w:r>
+      <w:r>
+        <w:rPr>
+          <w:rFonts w:ascii="Times New Roman" w:hAnsi="Times New Roman"/>
+          <w:color w:val="000000"/>
+          <w:spacing w:val="-4"/>
+          <w:sz w:val="28"/>
+          <w:szCs w:val="28"/>
+        </w:rPr>
+        <w:t xml:space="preserve"> </w:t>
+      </w:r>
+      <w:r>
+        <w:rPr>
+          <w:rFonts w:ascii="Times New Roman" w:hAnsi="Times New Roman"/>
+          <w:color w:val="000000"/>
+          <w:spacing w:val="-4"/>
+          <w:sz w:val="28"/>
+          <w:szCs w:val="28"/>
+        </w:rPr>
+        <w:t>в подписках, разделение шардируемых и локальных таблиц с учётом ограничений Citus, а также режим ENABLE REPLICA</w:t>
+      </w:r>
+      <w:r>
+        <w:rPr>
+          <w:rFonts w:ascii="Times New Roman" w:hAnsi="Times New Roman"/>
+          <w:color w:val="000000"/>
+          <w:spacing w:val="-4"/>
+          <w:sz w:val="28"/>
+          <w:szCs w:val="28"/>
+        </w:rPr>
+        <w:t xml:space="preserve"> </w:t>
+      </w:r>
+      <w:r>
+        <w:rPr>
+          <w:rFonts w:ascii="Times New Roman" w:hAnsi="Times New Roman"/>
+          <w:color w:val="000000"/>
+          <w:spacing w:val="-4"/>
+          <w:sz w:val="28"/>
+          <w:szCs w:val="28"/>
+        </w:rPr>
+        <w:t>для триггеров синхронизации, без которого поток репликации не инициирует передачу данных в шардированный слой.</w:t>
+      </w:r>
+    </w:p>
+    <w:p>
+      <w:pPr>
         <w:spacing w:before="120" w:after="80" w:line="240" w:lineRule="auto"/>
         <w:jc w:val="center"/>
         <w:rPr>
           <w:rFonts w:ascii="Times New Roman" w:hAnsi="Times New Roman"/>
           <w:sz w:val="28"/>
           <w:szCs w:val="28"/>
-          <w:lang w:val="en-US"/>
-        </w:rPr>
-      </w:pPr>
+        </w:rPr>
+      </w:pPr>
+      <w:bookmarkStart w:id="1" w:name="_Hlk227660749"/>
       <w:r>
         <w:rPr>
           <w:rFonts w:ascii="Times New Roman" w:hAnsi="Times New Roman"/>
@@ -644,18 +1343,54 @@
           <w:szCs w:val="28"/>
           <w:lang w:val="en-US"/>
         </w:rPr>
-        <w:t>.  </w:t>
-      </w:r>
-      <w:r>
-        <w:rPr>
-          <w:rFonts w:ascii="Times New Roman" w:hAnsi="Times New Roman"/>
-          <w:sz w:val="28"/>
-          <w:szCs w:val="28"/>
-          <w:lang w:val="en-US"/>
-        </w:rPr>
-        <w:t xml:space="preserve">PostgreSQL Documentation. Logical Replication / The PostgreSQL Global Development Group. — 2024. — URL: </w:t>
-      </w:r>
-      <w:hyperlink r:id="rId5" w:history="1">
+        <w:t>. </w:t>
+      </w:r>
+      <w:r>
+        <w:rPr>
+          <w:rFonts w:ascii="Times New Roman" w:hAnsi="Times New Roman"/>
+          <w:sz w:val="28"/>
+          <w:szCs w:val="28"/>
+          <w:lang w:val="en-US"/>
+        </w:rPr>
+        <w:t xml:space="preserve">PostgreSQL Documentation. Logical Replication / The PostgreSQL Global Development Group. </w:t>
+      </w:r>
+      <w:r>
+        <w:rPr>
+          <w:rFonts w:ascii="Times New Roman" w:hAnsi="Times New Roman"/>
+          <w:sz w:val="28"/>
+          <w:szCs w:val="28"/>
+          <w:lang w:val="en-US"/>
+        </w:rPr>
+        <w:t>–</w:t>
+      </w:r>
+      <w:r>
+        <w:rPr>
+          <w:rFonts w:ascii="Times New Roman" w:hAnsi="Times New Roman"/>
+          <w:sz w:val="28"/>
+          <w:szCs w:val="28"/>
+          <w:lang w:val="en-US"/>
+        </w:rPr>
+        <w:t xml:space="preserve"> 2024. </w:t>
+      </w:r>
+      <w:r>
+        <w:rPr>
+          <w:rFonts w:ascii="Times New Roman" w:hAnsi="Times New Roman"/>
+          <w:sz w:val="28"/>
+          <w:szCs w:val="28"/>
+          <w:lang w:val="en-US"/>
+        </w:rPr>
+        <w:t>–</w:t>
+      </w:r>
+      <w:r>
+        <w:rPr>
+          <w:rFonts w:ascii="Times New Roman" w:hAnsi="Times New Roman"/>
+          <w:sz w:val="28"/>
+          <w:szCs w:val="28"/>
+          <w:lang w:val="en-US"/>
+        </w:rPr>
+        <w:t xml:space="preserve"> URL: </w:t>
+      </w:r>
+      <w:hyperlink r:id="rId7" w:history="1">
         <w:r>
           <w:rPr>
             <w:rStyle w:val="a3"/>
@@ -674,47 +1409,7 @@
           <w:szCs w:val="28"/>
           <w:lang w:val="en-US"/>
         </w:rPr>
-        <w:t xml:space="preserve"> (</w:t>
-      </w:r>
-      <w:proofErr w:type="spellStart"/>
-      <w:r>
-        <w:rPr>
-          <w:rFonts w:ascii="Times New Roman" w:hAnsi="Times New Roman"/>
-          <w:sz w:val="28"/>
-          <w:szCs w:val="28"/>
-          <w:lang w:val="en-US"/>
-        </w:rPr>
-        <w:t>дата</w:t>
-      </w:r>
-      <w:proofErr w:type="spellEnd"/>
-      <w:r>
-        <w:rPr>
-          <w:rFonts w:ascii="Times New Roman" w:hAnsi="Times New Roman"/>
-          <w:sz w:val="28"/>
-          <w:szCs w:val="28"/>
-          <w:lang w:val="en-US"/>
-        </w:rPr>
-        <w:t xml:space="preserve"> </w:t>
-      </w:r>
-      <w:proofErr w:type="spellStart"/>
-      <w:r>
-        <w:rPr>
-          <w:rFonts w:ascii="Times New Roman" w:hAnsi="Times New Roman"/>
-          <w:sz w:val="28"/>
-          <w:szCs w:val="28"/>
-          <w:lang w:val="en-US"/>
-        </w:rPr>
-        <w:t>обращения</w:t>
-      </w:r>
-      <w:proofErr w:type="spellEnd"/>
-      <w:r>
-        <w:rPr>
-          <w:rFonts w:ascii="Times New Roman" w:hAnsi="Times New Roman"/>
-          <w:sz w:val="28"/>
-          <w:szCs w:val="28"/>
-          <w:lang w:val="en-US"/>
-        </w:rPr>
-        <w:t>: 17.04.2026).</w:t>
+        <w:t xml:space="preserve"> (дата обращения: 17.04.2026).</w:t>
       </w:r>
     </w:p>
     <w:p>
@@ -742,29 +1437,54 @@
           <w:szCs w:val="28"/>
           <w:lang w:val="en-US"/>
         </w:rPr>
-        <w:t>2.  </w:t>
-      </w:r>
-      <w:proofErr w:type="spellStart"/>
-      <w:r>
-        <w:rPr>
-          <w:rFonts w:ascii="Times New Roman" w:hAnsi="Times New Roman"/>
-          <w:sz w:val="28"/>
-          <w:szCs w:val="28"/>
-          <w:lang w:val="en-US"/>
-        </w:rPr>
-        <w:t>Citus</w:t>
-      </w:r>
-      <w:proofErr w:type="spellEnd"/>
-      <w:r>
-        <w:rPr>
-          <w:rFonts w:ascii="Times New Roman" w:hAnsi="Times New Roman"/>
-          <w:sz w:val="28"/>
-          <w:szCs w:val="28"/>
-          <w:lang w:val="en-US"/>
-        </w:rPr>
-        <w:t xml:space="preserve"> Data. Citus 13.0 Documentation / Microsoft Corporation. — 2024. — URL: </w:t>
-      </w:r>
-      <w:hyperlink r:id="rId6" w:history="1">
+        <w:t>2. </w:t>
+      </w:r>
+      <w:r>
+        <w:rPr>
+          <w:rFonts w:ascii="Times New Roman" w:hAnsi="Times New Roman"/>
+          <w:sz w:val="28"/>
+          <w:szCs w:val="28"/>
+          <w:lang w:val="en-US"/>
+        </w:rPr>
+        <w:t xml:space="preserve">Citus Data. Citus 13.0 Documentation / Microsoft Corporation. </w:t>
+      </w:r>
+      <w:r>
+        <w:rPr>
+          <w:rFonts w:ascii="Times New Roman" w:hAnsi="Times New Roman"/>
+          <w:sz w:val="28"/>
+          <w:szCs w:val="28"/>
+          <w:lang w:val="en-US"/>
+        </w:rPr>
+        <w:t>–</w:t>
+      </w:r>
+      <w:r>
+        <w:rPr>
+          <w:rFonts w:ascii="Times New Roman" w:hAnsi="Times New Roman"/>
+          <w:sz w:val="28"/>
+          <w:szCs w:val="28"/>
+          <w:lang w:val="en-US"/>
+        </w:rPr>
+        <w:t xml:space="preserve"> 2024. </w:t>
+      </w:r>
+      <w:r>
+        <w:rPr>
+          <w:rFonts w:ascii="Times New Roman" w:hAnsi="Times New Roman"/>
+          <w:sz w:val="28"/>
+          <w:szCs w:val="28"/>
+          <w:lang w:val="en-US"/>
+        </w:rPr>
+        <w:t>–</w:t>
+      </w:r>
+      <w:r>
+        <w:rPr>
+          <w:rFonts w:ascii="Times New Roman" w:hAnsi="Times New Roman"/>
+          <w:sz w:val="28"/>
+          <w:szCs w:val="28"/>
+          <w:lang w:val="en-US"/>
+        </w:rPr>
+        <w:t xml:space="preserve"> URL: </w:t>
+      </w:r>
+      <w:hyperlink r:id="rId8" w:history="1">
         <w:r>
           <w:rPr>
             <w:rStyle w:val="a3"/>
@@ -783,47 +1503,7 @@
           <w:szCs w:val="28"/>
           <w:lang w:val="en-US"/>
         </w:rPr>
-        <w:t xml:space="preserve"> (</w:t>
-      </w:r>
-      <w:proofErr w:type="spellStart"/>
-      <w:r>
-        <w:rPr>
-          <w:rFonts w:ascii="Times New Roman" w:hAnsi="Times New Roman"/>
-          <w:sz w:val="28"/>
-          <w:szCs w:val="28"/>
-          <w:lang w:val="en-US"/>
-        </w:rPr>
-        <w:t>дата</w:t>
-      </w:r>
-      <w:proofErr w:type="spellEnd"/>
-      <w:r>
-        <w:rPr>
-          <w:rFonts w:ascii="Times New Roman" w:hAnsi="Times New Roman"/>
-          <w:sz w:val="28"/>
-          <w:szCs w:val="28"/>
-          <w:lang w:val="en-US"/>
-        </w:rPr>
-        <w:t xml:space="preserve"> </w:t>
-      </w:r>
-      <w:proofErr w:type="spellStart"/>
-      <w:r>
-        <w:rPr>
-          <w:rFonts w:ascii="Times New Roman" w:hAnsi="Times New Roman"/>
-          <w:sz w:val="28"/>
-          <w:szCs w:val="28"/>
-          <w:lang w:val="en-US"/>
-        </w:rPr>
-        <w:t>обращения</w:t>
-      </w:r>
-      <w:proofErr w:type="spellEnd"/>
-      <w:r>
-        <w:rPr>
-          <w:rFonts w:ascii="Times New Roman" w:hAnsi="Times New Roman"/>
-          <w:sz w:val="28"/>
-          <w:szCs w:val="28"/>
-          <w:lang w:val="en-US"/>
-        </w:rPr>
-        <w:t>: 17.04.2026).</w:t>
+        <w:t xml:space="preserve"> (дата обращения: 17.04.2026).</w:t>
       </w:r>
     </w:p>
     <w:p>
@@ -851,18 +1531,54 @@
           <w:szCs w:val="28"/>
           <w:lang w:val="en-US"/>
         </w:rPr>
-        <w:t>3.  </w:t>
-      </w:r>
-      <w:r>
-        <w:rPr>
-          <w:rFonts w:ascii="Times New Roman" w:hAnsi="Times New Roman"/>
-          <w:sz w:val="28"/>
-          <w:szCs w:val="28"/>
-          <w:lang w:val="en-US"/>
-        </w:rPr>
-        <w:t xml:space="preserve">Kubernetes Documentation. StatefulSets / The Kubernetes Authors. — 2024. — URL: </w:t>
-      </w:r>
-      <w:hyperlink r:id="rId7" w:history="1">
+        <w:t>3. </w:t>
+      </w:r>
+      <w:r>
+        <w:rPr>
+          <w:rFonts w:ascii="Times New Roman" w:hAnsi="Times New Roman"/>
+          <w:sz w:val="28"/>
+          <w:szCs w:val="28"/>
+          <w:lang w:val="en-US"/>
+        </w:rPr>
+        <w:t xml:space="preserve">Kubernetes Documentation. StatefulSets / The Kubernetes Authors. </w:t>
+      </w:r>
+      <w:r>
+        <w:rPr>
+          <w:rFonts w:ascii="Times New Roman" w:hAnsi="Times New Roman"/>
+          <w:sz w:val="28"/>
+          <w:szCs w:val="28"/>
+          <w:lang w:val="en-US"/>
+        </w:rPr>
+        <w:t>–</w:t>
+      </w:r>
+      <w:r>
+        <w:rPr>
+          <w:rFonts w:ascii="Times New Roman" w:hAnsi="Times New Roman"/>
+          <w:sz w:val="28"/>
+          <w:szCs w:val="28"/>
+          <w:lang w:val="en-US"/>
+        </w:rPr>
+        <w:t xml:space="preserve"> 2024. </w:t>
+      </w:r>
+      <w:r>
+        <w:rPr>
+          <w:rFonts w:ascii="Times New Roman" w:hAnsi="Times New Roman"/>
+          <w:sz w:val="28"/>
+          <w:szCs w:val="28"/>
+          <w:lang w:val="en-US"/>
+        </w:rPr>
+        <w:t>–</w:t>
+      </w:r>
+      <w:r>
+        <w:rPr>
+          <w:rFonts w:ascii="Times New Roman" w:hAnsi="Times New Roman"/>
+          <w:sz w:val="28"/>
+          <w:szCs w:val="28"/>
+          <w:lang w:val="en-US"/>
+        </w:rPr>
+        <w:t xml:space="preserve"> URL: </w:t>
+      </w:r>
+      <w:hyperlink r:id="rId9" w:history="1">
         <w:r>
           <w:rPr>
             <w:rStyle w:val="a3"/>
@@ -881,47 +1597,7 @@
           <w:szCs w:val="28"/>
           <w:lang w:val="en-US"/>
         </w:rPr>
-        <w:t xml:space="preserve"> (</w:t>
-      </w:r>
-      <w:proofErr w:type="spellStart"/>
-      <w:r>
-        <w:rPr>
-          <w:rFonts w:ascii="Times New Roman" w:hAnsi="Times New Roman"/>
-          <w:sz w:val="28"/>
-          <w:szCs w:val="28"/>
-          <w:lang w:val="en-US"/>
-        </w:rPr>
-        <w:t>дата</w:t>
-      </w:r>
-      <w:proofErr w:type="spellEnd"/>
-      <w:r>
-        <w:rPr>
-          <w:rFonts w:ascii="Times New Roman" w:hAnsi="Times New Roman"/>
-          <w:sz w:val="28"/>
-          <w:szCs w:val="28"/>
-          <w:lang w:val="en-US"/>
-        </w:rPr>
-        <w:t xml:space="preserve"> </w:t>
-      </w:r>
-      <w:proofErr w:type="spellStart"/>
-      <w:r>
-        <w:rPr>
-          <w:rFonts w:ascii="Times New Roman" w:hAnsi="Times New Roman"/>
-          <w:sz w:val="28"/>
-          <w:szCs w:val="28"/>
-          <w:lang w:val="en-US"/>
-        </w:rPr>
-        <w:t>обращения</w:t>
-      </w:r>
-      <w:proofErr w:type="spellEnd"/>
-      <w:r>
-        <w:rPr>
-          <w:rFonts w:ascii="Times New Roman" w:hAnsi="Times New Roman"/>
-          <w:sz w:val="28"/>
-          <w:szCs w:val="28"/>
-          <w:lang w:val="en-US"/>
-        </w:rPr>
-        <w:t>: 17.04.2026).</w:t>
+        <w:t xml:space="preserve"> (дата обращения: 17.04.2026).</w:t>
       </w:r>
     </w:p>
     <w:p>
@@ -949,18 +1625,54 @@
           <w:szCs w:val="28"/>
           <w:lang w:val="en-US"/>
         </w:rPr>
-        <w:t>4.  </w:t>
-      </w:r>
-      <w:r>
-        <w:rPr>
-          <w:rFonts w:ascii="Times New Roman" w:hAnsi="Times New Roman"/>
-          <w:sz w:val="28"/>
-          <w:szCs w:val="28"/>
-          <w:lang w:val="en-US"/>
-        </w:rPr>
-        <w:t xml:space="preserve">Helm Documentation. Chart Template Guide / Helm Authors. — 2024. — URL: </w:t>
-      </w:r>
-      <w:hyperlink r:id="rId8" w:history="1">
+        <w:t>4. </w:t>
+      </w:r>
+      <w:r>
+        <w:rPr>
+          <w:rFonts w:ascii="Times New Roman" w:hAnsi="Times New Roman"/>
+          <w:sz w:val="28"/>
+          <w:szCs w:val="28"/>
+          <w:lang w:val="en-US"/>
+        </w:rPr>
+        <w:t xml:space="preserve">Helm Documentation. Chart Template Guide / Helm Authors. </w:t>
+      </w:r>
+      <w:r>
+        <w:rPr>
+          <w:rFonts w:ascii="Times New Roman" w:hAnsi="Times New Roman"/>
+          <w:sz w:val="28"/>
+          <w:szCs w:val="28"/>
+          <w:lang w:val="en-US"/>
+        </w:rPr>
+        <w:t>–</w:t>
+      </w:r>
+      <w:r>
+        <w:rPr>
+          <w:rFonts w:ascii="Times New Roman" w:hAnsi="Times New Roman"/>
+          <w:sz w:val="28"/>
+          <w:szCs w:val="28"/>
+          <w:lang w:val="en-US"/>
+        </w:rPr>
+        <w:t xml:space="preserve"> 2024. </w:t>
+      </w:r>
+      <w:r>
+        <w:rPr>
+          <w:rFonts w:ascii="Times New Roman" w:hAnsi="Times New Roman"/>
+          <w:sz w:val="28"/>
+          <w:szCs w:val="28"/>
+          <w:lang w:val="en-US"/>
+        </w:rPr>
+        <w:t>–</w:t>
+      </w:r>
+      <w:r>
+        <w:rPr>
+          <w:rFonts w:ascii="Times New Roman" w:hAnsi="Times New Roman"/>
+          <w:sz w:val="28"/>
+          <w:szCs w:val="28"/>
+          <w:lang w:val="en-US"/>
+        </w:rPr>
+        <w:t xml:space="preserve"> URL: </w:t>
+      </w:r>
+      <w:hyperlink r:id="rId10" w:history="1">
         <w:r>
           <w:rPr>
             <w:rStyle w:val="a3"/>
@@ -988,47 +1700,7 @@
           <w:szCs w:val="28"/>
           <w:lang w:val="en-US"/>
         </w:rPr>
-        <w:t>(</w:t>
-      </w:r>
-      <w:proofErr w:type="spellStart"/>
-      <w:r>
-        <w:rPr>
-          <w:rFonts w:ascii="Times New Roman" w:hAnsi="Times New Roman"/>
-          <w:sz w:val="28"/>
-          <w:szCs w:val="28"/>
-          <w:lang w:val="en-US"/>
-        </w:rPr>
-        <w:t>дата</w:t>
-      </w:r>
-      <w:proofErr w:type="spellEnd"/>
-      <w:r>
-        <w:rPr>
-          <w:rFonts w:ascii="Times New Roman" w:hAnsi="Times New Roman"/>
-          <w:sz w:val="28"/>
-          <w:szCs w:val="28"/>
-          <w:lang w:val="en-US"/>
-        </w:rPr>
-        <w:t xml:space="preserve"> </w:t>
-      </w:r>
-      <w:proofErr w:type="spellStart"/>
-      <w:r>
-        <w:rPr>
-          <w:rFonts w:ascii="Times New Roman" w:hAnsi="Times New Roman"/>
-          <w:sz w:val="28"/>
-          <w:szCs w:val="28"/>
-          <w:lang w:val="en-US"/>
-        </w:rPr>
-        <w:t>обращения</w:t>
-      </w:r>
-      <w:proofErr w:type="spellEnd"/>
-      <w:r>
-        <w:rPr>
-          <w:rFonts w:ascii="Times New Roman" w:hAnsi="Times New Roman"/>
-          <w:sz w:val="28"/>
-          <w:szCs w:val="28"/>
-          <w:lang w:val="en-US"/>
-        </w:rPr>
-        <w:t>: 17.04.2026).</w:t>
+        <w:t>(дата обращения: 17.04.2026).</w:t>
       </w:r>
     </w:p>
     <w:p>
@@ -1056,19 +1728,54 @@
           <w:szCs w:val="28"/>
           <w:lang w:val="en-US"/>
         </w:rPr>
-        <w:lastRenderedPageBreak/>
-        <w:t>5.  </w:t>
-      </w:r>
-      <w:r>
-        <w:rPr>
-          <w:rFonts w:ascii="Times New Roman" w:hAnsi="Times New Roman"/>
-          <w:sz w:val="28"/>
-          <w:szCs w:val="28"/>
-          <w:lang w:val="en-US"/>
-        </w:rPr>
-        <w:t xml:space="preserve">PostgreSQL Documentation. dblink / The PostgreSQL Global Development Group. — 2024. — URL: </w:t>
-      </w:r>
-      <w:hyperlink r:id="rId9" w:history="1">
+        <w:t>5. </w:t>
+      </w:r>
+      <w:r>
+        <w:rPr>
+          <w:rFonts w:ascii="Times New Roman" w:hAnsi="Times New Roman"/>
+          <w:sz w:val="28"/>
+          <w:szCs w:val="28"/>
+          <w:lang w:val="en-US"/>
+        </w:rPr>
+        <w:t xml:space="preserve">PostgreSQL Documentation. dblink / The PostgreSQL Global Development Group. </w:t>
+      </w:r>
+      <w:r>
+        <w:rPr>
+          <w:rFonts w:ascii="Times New Roman" w:hAnsi="Times New Roman"/>
+          <w:sz w:val="28"/>
+          <w:szCs w:val="28"/>
+          <w:lang w:val="en-US"/>
+        </w:rPr>
+        <w:t>–</w:t>
+      </w:r>
+      <w:r>
+        <w:rPr>
+          <w:rFonts w:ascii="Times New Roman" w:hAnsi="Times New Roman"/>
+          <w:sz w:val="28"/>
+          <w:szCs w:val="28"/>
+          <w:lang w:val="en-US"/>
+        </w:rPr>
+        <w:t xml:space="preserve"> 2024. </w:t>
+      </w:r>
+      <w:r>
+        <w:rPr>
+          <w:rFonts w:ascii="Times New Roman" w:hAnsi="Times New Roman"/>
+          <w:sz w:val="28"/>
+          <w:szCs w:val="28"/>
+          <w:lang w:val="en-US"/>
+        </w:rPr>
+        <w:t>–</w:t>
+      </w:r>
+      <w:r>
+        <w:rPr>
+          <w:rFonts w:ascii="Times New Roman" w:hAnsi="Times New Roman"/>
+          <w:sz w:val="28"/>
+          <w:szCs w:val="28"/>
+          <w:lang w:val="en-US"/>
+        </w:rPr>
+        <w:t xml:space="preserve"> URL: </w:t>
+      </w:r>
+      <w:hyperlink r:id="rId11" w:history="1">
         <w:r>
           <w:rPr>
             <w:rStyle w:val="a3"/>
@@ -1096,47 +1803,7 @@
           <w:szCs w:val="28"/>
           <w:lang w:val="en-US"/>
         </w:rPr>
-        <w:t>(</w:t>
-      </w:r>
-      <w:proofErr w:type="spellStart"/>
-      <w:r>
-        <w:rPr>
-          <w:rFonts w:ascii="Times New Roman" w:hAnsi="Times New Roman"/>
-          <w:sz w:val="28"/>
-          <w:szCs w:val="28"/>
-          <w:lang w:val="en-US"/>
-        </w:rPr>
-        <w:t>дата</w:t>
-      </w:r>
-      <w:proofErr w:type="spellEnd"/>
-      <w:r>
-        <w:rPr>
-          <w:rFonts w:ascii="Times New Roman" w:hAnsi="Times New Roman"/>
-          <w:sz w:val="28"/>
-          <w:szCs w:val="28"/>
-          <w:lang w:val="en-US"/>
-        </w:rPr>
-        <w:t xml:space="preserve"> </w:t>
-      </w:r>
-      <w:proofErr w:type="spellStart"/>
-      <w:r>
-        <w:rPr>
-          <w:rFonts w:ascii="Times New Roman" w:hAnsi="Times New Roman"/>
-          <w:sz w:val="28"/>
-          <w:szCs w:val="28"/>
-          <w:lang w:val="en-US"/>
-        </w:rPr>
-        <w:t>обращения</w:t>
-      </w:r>
-      <w:proofErr w:type="spellEnd"/>
-      <w:r>
-        <w:rPr>
-          <w:rFonts w:ascii="Times New Roman" w:hAnsi="Times New Roman"/>
-          <w:sz w:val="28"/>
-          <w:szCs w:val="28"/>
-          <w:lang w:val="en-US"/>
-        </w:rPr>
-        <w:t>: 17.04.2026).</w:t>
+        <w:t>(дата обращения: 17.04.2026).</w:t>
       </w:r>
     </w:p>
     <w:p>
@@ -1164,29 +1831,54 @@
           <w:szCs w:val="28"/>
           <w:lang w:val="en-US"/>
         </w:rPr>
-        <w:t>6.  </w:t>
-      </w:r>
-      <w:proofErr w:type="spellStart"/>
-      <w:r>
-        <w:rPr>
-          <w:rFonts w:ascii="Times New Roman" w:hAnsi="Times New Roman"/>
-          <w:sz w:val="28"/>
-          <w:szCs w:val="28"/>
-          <w:lang w:val="en-US"/>
-        </w:rPr>
-        <w:t>Citus</w:t>
-      </w:r>
-      <w:proofErr w:type="spellEnd"/>
-      <w:r>
-        <w:rPr>
-          <w:rFonts w:ascii="Times New Roman" w:hAnsi="Times New Roman"/>
-          <w:sz w:val="28"/>
-          <w:szCs w:val="28"/>
-          <w:lang w:val="en-US"/>
-        </w:rPr>
-        <w:t xml:space="preserve"> Data. Distributed Tables API / Microsoft Corporation. — 2024. — URL: </w:t>
-      </w:r>
-      <w:hyperlink r:id="rId10" w:history="1">
+        <w:t>6. </w:t>
+      </w:r>
+      <w:r>
+        <w:rPr>
+          <w:rFonts w:ascii="Times New Roman" w:hAnsi="Times New Roman"/>
+          <w:sz w:val="28"/>
+          <w:szCs w:val="28"/>
+          <w:lang w:val="en-US"/>
+        </w:rPr>
+        <w:t xml:space="preserve">Citus Data. Distributed Tables API / Microsoft Corporation. </w:t>
+      </w:r>
+      <w:r>
+        <w:rPr>
+          <w:rFonts w:ascii="Times New Roman" w:hAnsi="Times New Roman"/>
+          <w:sz w:val="28"/>
+          <w:szCs w:val="28"/>
+          <w:lang w:val="en-US"/>
+        </w:rPr>
+        <w:t>–</w:t>
+      </w:r>
+      <w:r>
+        <w:rPr>
+          <w:rFonts w:ascii="Times New Roman" w:hAnsi="Times New Roman"/>
+          <w:sz w:val="28"/>
+          <w:szCs w:val="28"/>
+          <w:lang w:val="en-US"/>
+        </w:rPr>
+        <w:t xml:space="preserve"> 2024. </w:t>
+      </w:r>
+      <w:r>
+        <w:rPr>
+          <w:rFonts w:ascii="Times New Roman" w:hAnsi="Times New Roman"/>
+          <w:sz w:val="28"/>
+          <w:szCs w:val="28"/>
+          <w:lang w:val="en-US"/>
+        </w:rPr>
+        <w:t>–</w:t>
+      </w:r>
+      <w:r>
+        <w:rPr>
+          <w:rFonts w:ascii="Times New Roman" w:hAnsi="Times New Roman"/>
+          <w:sz w:val="28"/>
+          <w:szCs w:val="28"/>
+          <w:lang w:val="en-US"/>
+        </w:rPr>
+        <w:t xml:space="preserve"> URL: </w:t>
+      </w:r>
+      <w:hyperlink r:id="rId12" w:history="1">
         <w:r>
           <w:rPr>
             <w:rStyle w:val="a3"/>
@@ -1214,50 +1906,17 @@
           <w:szCs w:val="28"/>
           <w:lang w:val="en-US"/>
         </w:rPr>
-        <w:t>(</w:t>
-      </w:r>
-      <w:proofErr w:type="spellStart"/>
-      <w:r>
-        <w:rPr>
-          <w:rFonts w:ascii="Times New Roman" w:hAnsi="Times New Roman"/>
-          <w:sz w:val="28"/>
-          <w:szCs w:val="28"/>
-          <w:lang w:val="en-US"/>
-        </w:rPr>
-        <w:t>дата</w:t>
-      </w:r>
-      <w:proofErr w:type="spellEnd"/>
-      <w:r>
-        <w:rPr>
-          <w:rFonts w:ascii="Times New Roman" w:hAnsi="Times New Roman"/>
-          <w:sz w:val="28"/>
-          <w:szCs w:val="28"/>
-          <w:lang w:val="en-US"/>
-        </w:rPr>
-        <w:t xml:space="preserve"> </w:t>
-      </w:r>
-      <w:proofErr w:type="spellStart"/>
-      <w:r>
-        <w:rPr>
-          <w:rFonts w:ascii="Times New Roman" w:hAnsi="Times New Roman"/>
-          <w:sz w:val="28"/>
-          <w:szCs w:val="28"/>
-          <w:lang w:val="en-US"/>
-        </w:rPr>
-        <w:t>обращения</w:t>
-      </w:r>
-      <w:proofErr w:type="spellEnd"/>
-      <w:r>
-        <w:rPr>
-          <w:rFonts w:ascii="Times New Roman" w:hAnsi="Times New Roman"/>
-          <w:sz w:val="28"/>
-          <w:szCs w:val="28"/>
-          <w:lang w:val="en-US"/>
-        </w:rPr>
-        <w:t>: 17.04.2026).</w:t>
-      </w:r>
+        <w:t>(дата обращения: 17.04.2026).</w:t>
+      </w:r>
+      <w:bookmarkEnd w:id="1"/>
     </w:p>
     <w:sectPr>
+      <w:headerReference w:type="even" r:id="rId13"/>
+      <w:headerReference w:type="default" r:id="rId14"/>
+      <w:footerReference w:type="even" r:id="rId15"/>
+      <w:footerReference w:type="default" r:id="rId16"/>
+      <w:headerReference w:type="first" r:id="rId17"/>
+      <w:footerReference w:type="first" r:id="rId18"/>
       <w:pgSz w:w="11906" w:h="16838"/>
       <w:pgMar w:top="1701" w:right="1701" w:bottom="1701" w:left="1701" w:header="708" w:footer="708" w:gutter="0"/>
       <w:cols w:space="708"/>
@@ -1267,8 +1926,118 @@
 </w:document>
 </file>
 
+<file path=word/endnotes.xml><?xml version="1.0" encoding="utf-8"?>
+<w:endnotes xmlns:wpc="http://schemas.microsoft.com/office/word/2010/wordprocessingCanvas" xmlns:cx="http://schemas.microsoft.com/office/drawing/2014/chartex" xmlns:cx1="http://schemas.microsoft.com/office/drawing/2015/9/8/chartex" xmlns:cx2="http://schemas.microsoft.com/office/drawing/2015/10/21/chartex" xmlns:cx3="http://schemas.microsoft.com/office/drawing/2016/5/9/chartex" xmlns:cx4="http://schemas.microsoft.com/office/drawing/2016/5/10/chartex" xmlns:cx5="http://schemas.microsoft.com/office/drawing/2016/5/11/chartex" xmlns:cx6="http://schemas.microsoft.com/office/drawing/2016/5/12/chartex" xmlns:cx7="http://schemas.microsoft.com/office/drawing/2016/5/13/chartex" xmlns:cx8="http://schemas.microsoft.com/office/drawing/2016/5/14/chartex" xmlns:mc="http://schemas.openxmlformats.org/markup-compatibility/2006" xmlns:aink="http://schemas.microsoft.com/office/drawing/2016/ink" xmlns:am3d="http://schemas.microsoft.com/office/drawing/2017/model3d" xmlns:o="urn:schemas-microsoft-com:office:office" xmlns:oel="http://schemas.microsoft.com/office/2019/extlst" xmlns:r="http://schemas.openxmlformats.org/officeDocument/2006/relationships" xmlns:m="http://schemas.openxmlformats.org/officeDocument/2006/math" xmlns:v="urn:schemas-microsoft-com:vml" xmlns:wp14="http://schemas.microsoft.com/office/word/2010/wordprocessingDrawing" xmlns:wp="http://schemas.openxmlformats.org/drawingml/2006/wordprocessingDrawing" xmlns:w10="urn:schemas-microsoft-com:office:word" xmlns:w="http://schemas.openxmlformats.org/wordprocessingml/2006/main" xmlns:w14="http://schemas.microsoft.com/office/word/2010/wordml" xmlns:w15="http://schemas.microsoft.com/office/word/2012/wordml" xmlns:w16cex="http://schemas.microsoft.com/office/word/2018/wordml/cex" xmlns:w16cid="http://schemas.microsoft.com/office/word/2016/wordml/cid" xmlns:w16="http://schemas.microsoft.com/office/word/2018/wordml" xmlns:w16sdtdh="http://schemas.microsoft.com/office/word/2020/wordml/sdtdatahash" xmlns:w16se="http://schemas.microsoft.com/office/word/2015/wordml/symex" xmlns:wpg="http://schemas.microsoft.com/office/word/2010/wordprocessingGroup" xmlns:wpi="http://schemas.microsoft.com/office/word/2010/wordprocessingInk" xmlns:wne="http://schemas.microsoft.com/office/word/2006/wordml" xmlns:wps="http://schemas.microsoft.com/office/word/2010/wordprocessingShape" mc:Ignorable="w14 w15 w16se w16cid w16 w16cex w16sdtdh wp14">
+  <w:endnote w:type="separator" w:id="-1">
+    <w:p>
+      <w:pPr>
+        <w:spacing w:after="0" w:line="240" w:lineRule="auto"/>
+      </w:pPr>
+      <w:r>
+        <w:separator/>
+      </w:r>
+    </w:p>
+  </w:endnote>
+  <w:endnote w:type="continuationSeparator" w:id="0">
+    <w:p>
+      <w:pPr>
+        <w:spacing w:after="0" w:line="240" w:lineRule="auto"/>
+      </w:pPr>
+      <w:r>
+        <w:continuationSeparator/>
+      </w:r>
+    </w:p>
+  </w:endnote>
+</w:endnotes>
+</file>
+
+<file path=word/footer1.xml><?xml version="1.0" encoding="utf-8"?>
+<w:ftr xmlns:wpc="http://schemas.microsoft.com/office/word/2010/wordprocessingCanvas" xmlns:cx="http://schemas.microsoft.com/office/drawing/2014/chartex" xmlns:cx1="http://schemas.microsoft.com/office/drawing/2015/9/8/chartex" xmlns:cx2="http://schemas.microsoft.com/office/drawing/2015/10/21/chartex" xmlns:cx3="http://schemas.microsoft.com/office/drawing/2016/5/9/chartex" xmlns:cx4="http://schemas.microsoft.com/office/drawing/2016/5/10/chartex" xmlns:cx5="http://schemas.microsoft.com/office/drawing/2016/5/11/chartex" xmlns:cx6="http://schemas.microsoft.com/office/drawing/2016/5/12/chartex" xmlns:cx7="http://schemas.microsoft.com/office/drawing/2016/5/13/chartex" xmlns:cx8="http://schemas.microsoft.com/office/drawing/2016/5/14/chartex" xmlns:mc="http://schemas.openxmlformats.org/markup-compatibility/2006" xmlns:aink="http://schemas.microsoft.com/office/drawing/2016/ink" xmlns:am3d="http://schemas.microsoft.com/office/drawing/2017/model3d" xmlns:o="urn:schemas-microsoft-com:office:office" xmlns:oel="http://schemas.microsoft.com/office/2019/extlst" xmlns:r="http://schemas.openxmlformats.org/officeDocument/2006/relationships" xmlns:m="http://schemas.openxmlformats.org/officeDocument/2006/math" xmlns:v="urn:schemas-microsoft-com:vml" xmlns:wp14="http://schemas.microsoft.com/office/word/2010/wordprocessingDrawing" xmlns:wp="http://schemas.openxmlformats.org/drawingml/2006/wordprocessingDrawing" xmlns:w10="urn:schemas-microsoft-com:office:word" xmlns:w="http://schemas.openxmlformats.org/wordprocessingml/2006/main" xmlns:w14="http://schemas.microsoft.com/office/word/2010/wordml" xmlns:w15="http://schemas.microsoft.com/office/word/2012/wordml" xmlns:w16cex="http://schemas.microsoft.com/office/word/2018/wordml/cex" xmlns:w16cid="http://schemas.microsoft.com/office/word/2016/wordml/cid" xmlns:w16="http://schemas.microsoft.com/office/word/2018/wordml" xmlns:w16sdtdh="http://schemas.microsoft.com/office/word/2020/wordml/sdtdatahash" xmlns:w16se="http://schemas.microsoft.com/office/word/2015/wordml/symex" xmlns:wpg="http://schemas.microsoft.com/office/word/2010/wordprocessingGroup" xmlns:wpi="http://schemas.microsoft.com/office/word/2010/wordprocessingInk" xmlns:wne="http://schemas.microsoft.com/office/word/2006/wordml" xmlns:wps="http://schemas.microsoft.com/office/word/2010/wordprocessingShape" mc:Ignorable="w14 w15 w16se w16cid w16 w16cex w16sdtdh wp14">
+  <w:p>
+    <w:pPr>
+      <w:pStyle w:val="ab"/>
+    </w:pPr>
+  </w:p>
+</w:ftr>
+</file>
+
+<file path=word/footer2.xml><?xml version="1.0" encoding="utf-8"?>
+<w:ftr xmlns:wpc="http://schemas.microsoft.com/office/word/2010/wordprocessingCanvas" xmlns:cx="http://schemas.microsoft.com/office/drawing/2014/chartex" xmlns:cx1="http://schemas.microsoft.com/office/drawing/2015/9/8/chartex" xmlns:cx2="http://schemas.microsoft.com/office/drawing/2015/10/21/chartex" xmlns:cx3="http://schemas.microsoft.com/office/drawing/2016/5/9/chartex" xmlns:cx4="http://schemas.microsoft.com/office/drawing/2016/5/10/chartex" xmlns:cx5="http://schemas.microsoft.com/office/drawing/2016/5/11/chartex" xmlns:cx6="http://schemas.microsoft.com/office/drawing/2016/5/12/chartex" xmlns:cx7="http://schemas.microsoft.com/office/drawing/2016/5/13/chartex" xmlns:cx8="http://schemas.microsoft.com/office/drawing/2016/5/14/chartex" xmlns:mc="http://schemas.openxmlformats.org/markup-compatibility/2006" xmlns:aink="http://schemas.microsoft.com/office/drawing/2016/ink" xmlns:am3d="http://schemas.microsoft.com/office/drawing/2017/model3d" xmlns:o="urn:schemas-microsoft-com:office:office" xmlns:oel="http://schemas.microsoft.com/office/2019/extlst" xmlns:r="http://schemas.openxmlformats.org/officeDocument/2006/relationships" xmlns:m="http://schemas.openxmlformats.org/officeDocument/2006/math" xmlns:v="urn:schemas-microsoft-com:vml" xmlns:wp14="http://schemas.microsoft.com/office/word/2010/wordprocessingDrawing" xmlns:wp="http://schemas.openxmlformats.org/drawingml/2006/wordprocessingDrawing" xmlns:w10="urn:schemas-microsoft-com:office:word" xmlns:w="http://schemas.openxmlformats.org/wordprocessingml/2006/main" xmlns:w14="http://schemas.microsoft.com/office/word/2010/wordml" xmlns:w15="http://schemas.microsoft.com/office/word/2012/wordml" xmlns:w16cex="http://schemas.microsoft.com/office/word/2018/wordml/cex" xmlns:w16cid="http://schemas.microsoft.com/office/word/2016/wordml/cid" xmlns:w16="http://schemas.microsoft.com/office/word/2018/wordml" xmlns:w16sdtdh="http://schemas.microsoft.com/office/word/2020/wordml/sdtdatahash" xmlns:w16se="http://schemas.microsoft.com/office/word/2015/wordml/symex" xmlns:wpg="http://schemas.microsoft.com/office/word/2010/wordprocessingGroup" xmlns:wpi="http://schemas.microsoft.com/office/word/2010/wordprocessingInk" xmlns:wne="http://schemas.microsoft.com/office/word/2006/wordml" xmlns:wps="http://schemas.microsoft.com/office/word/2010/wordprocessingShape" mc:Ignorable="w14 w15 w16se w16cid w16 w16cex w16sdtdh wp14">
+  <w:p>
+    <w:pPr>
+      <w:pStyle w:val="ab"/>
+    </w:pPr>
+  </w:p>
+</w:ftr>
+</file>
+
+<file path=word/footer3.xml><?xml version="1.0" encoding="utf-8"?>
+<w:ftr xmlns:wpc="http://schemas.microsoft.com/office/word/2010/wordprocessingCanvas" xmlns:cx="http://schemas.microsoft.com/office/drawing/2014/chartex" xmlns:cx1="http://schemas.microsoft.com/office/drawing/2015/9/8/chartex" xmlns:cx2="http://schemas.microsoft.com/office/drawing/2015/10/21/chartex" xmlns:cx3="http://schemas.microsoft.com/office/drawing/2016/5/9/chartex" xmlns:cx4="http://schemas.microsoft.com/office/drawing/2016/5/10/chartex" xmlns:cx5="http://schemas.microsoft.com/office/drawing/2016/5/11/chartex" xmlns:cx6="http://schemas.microsoft.com/office/drawing/2016/5/12/chartex" xmlns:cx7="http://schemas.microsoft.com/office/drawing/2016/5/13/chartex" xmlns:cx8="http://schemas.microsoft.com/office/drawing/2016/5/14/chartex" xmlns:mc="http://schemas.openxmlformats.org/markup-compatibility/2006" xmlns:aink="http://schemas.microsoft.com/office/drawing/2016/ink" xmlns:am3d="http://schemas.microsoft.com/office/drawing/2017/model3d" xmlns:o="urn:schemas-microsoft-com:office:office" xmlns:oel="http://schemas.microsoft.com/office/2019/extlst" xmlns:r="http://schemas.openxmlformats.org/officeDocument/2006/relationships" xmlns:m="http://schemas.openxmlformats.org/officeDocument/2006/math" xmlns:v="urn:schemas-microsoft-com:vml" xmlns:wp14="http://schemas.microsoft.com/office/word/2010/wordprocessingDrawing" xmlns:wp="http://schemas.openxmlformats.org/drawingml/2006/wordprocessingDrawing" xmlns:w10="urn:schemas-microsoft-com:office:word" xmlns:w="http://schemas.openxmlformats.org/wordprocessingml/2006/main" xmlns:w14="http://schemas.microsoft.com/office/word/2010/wordml" xmlns:w15="http://schemas.microsoft.com/office/word/2012/wordml" xmlns:w16cex="http://schemas.microsoft.com/office/word/2018/wordml/cex" xmlns:w16cid="http://schemas.microsoft.com/office/word/2016/wordml/cid" xmlns:w16="http://schemas.microsoft.com/office/word/2018/wordml" xmlns:w16sdtdh="http://schemas.microsoft.com/office/word/2020/wordml/sdtdatahash" xmlns:w16se="http://schemas.microsoft.com/office/word/2015/wordml/symex" xmlns:wpg="http://schemas.microsoft.com/office/word/2010/wordprocessingGroup" xmlns:wpi="http://schemas.microsoft.com/office/word/2010/wordprocessingInk" xmlns:wne="http://schemas.microsoft.com/office/word/2006/wordml" xmlns:wps="http://schemas.microsoft.com/office/word/2010/wordprocessingShape" mc:Ignorable="w14 w15 w16se w16cid w16 w16cex w16sdtdh wp14">
+  <w:p>
+    <w:pPr>
+      <w:pStyle w:val="ab"/>
+    </w:pPr>
+  </w:p>
+</w:ftr>
+</file>
+
+<file path=word/footnotes.xml><?xml version="1.0" encoding="utf-8"?>
+<w:footnotes xmlns:wpc="http://schemas.microsoft.com/office/word/2010/wordprocessingCanvas" xmlns:cx="http://schemas.microsoft.com/office/drawing/2014/chartex" xmlns:cx1="http://schemas.microsoft.com/office/drawing/2015/9/8/chartex" xmlns:cx2="http://schemas.microsoft.com/office/drawing/2015/10/21/chartex" xmlns:cx3="http://schemas.microsoft.com/office/drawing/2016/5/9/chartex" xmlns:cx4="http://schemas.microsoft.com/office/drawing/2016/5/10/chartex" xmlns:cx5="http://schemas.microsoft.com/office/drawing/2016/5/11/chartex" xmlns:cx6="http://schemas.microsoft.com/office/drawing/2016/5/12/chartex" xmlns:cx7="http://schemas.microsoft.com/office/drawing/2016/5/13/chartex" xmlns:cx8="http://schemas.microsoft.com/office/drawing/2016/5/14/chartex" xmlns:mc="http://schemas.openxmlformats.org/markup-compatibility/2006" xmlns:aink="http://schemas.microsoft.com/office/drawing/2016/ink" xmlns:am3d="http://schemas.microsoft.com/office/drawing/2017/model3d" xmlns:o="urn:schemas-microsoft-com:office:office" xmlns:oel="http://schemas.microsoft.com/office/2019/extlst" xmlns:r="http://schemas.openxmlformats.org/officeDocument/2006/relationships" xmlns:m="http://schemas.openxmlformats.org/officeDocument/2006/math" xmlns:v="urn:schemas-microsoft-com:vml" xmlns:wp14="http://schemas.microsoft.com/office/word/2010/wordprocessingDrawing" xmlns:wp="http://schemas.openxmlformats.org/drawingml/2006/wordprocessingDrawing" xmlns:w10="urn:schemas-microsoft-com:office:word" xmlns:w="http://schemas.openxmlformats.org/wordprocessingml/2006/main" xmlns:w14="http://schemas.microsoft.com/office/word/2010/wordml" xmlns:w15="http://schemas.microsoft.com/office/word/2012/wordml" xmlns:w16cex="http://schemas.microsoft.com/office/word/2018/wordml/cex" xmlns:w16cid="http://schemas.microsoft.com/office/word/2016/wordml/cid" xmlns:w16="http://schemas.microsoft.com/office/word/2018/wordml" xmlns:w16sdtdh="http://schemas.microsoft.com/office/word/2020/wordml/sdtdatahash" xmlns:w16se="http://schemas.microsoft.com/office/word/2015/wordml/symex" xmlns:wpg="http://schemas.microsoft.com/office/word/2010/wordprocessingGroup" xmlns:wpi="http://schemas.microsoft.com/office/word/2010/wordprocessingInk" xmlns:wne="http://schemas.microsoft.com/office/word/2006/wordml" xmlns:wps="http://schemas.microsoft.com/office/word/2010/wordprocessingShape" mc:Ignorable="w14 w15 w16se w16cid w16 w16cex w16sdtdh wp14">
+  <w:footnote w:type="separator" w:id="-1">
+    <w:p>
+      <w:pPr>
+        <w:spacing w:after="0" w:line="240" w:lineRule="auto"/>
+      </w:pPr>
+      <w:r>
+        <w:separator/>
+      </w:r>
+    </w:p>
+  </w:footnote>
+  <w:footnote w:type="continuationSeparator" w:id="0">
+    <w:p>
+      <w:pPr>
+        <w:spacing w:after="0" w:line="240" w:lineRule="auto"/>
+      </w:pPr>
+      <w:r>
+        <w:continuationSeparator/>
+      </w:r>
+    </w:p>
+  </w:footnote>
+</w:footnotes>
+</file>
+
+<file path=word/header1.xml><?xml version="1.0" encoding="utf-8"?>
+<w:hdr xmlns:wpc="http://schemas.microsoft.com/office/word/2010/wordprocessingCanvas" xmlns:cx="http://schemas.microsoft.com/office/drawing/2014/chartex" xmlns:cx1="http://schemas.microsoft.com/office/drawing/2015/9/8/chartex" xmlns:cx2="http://schemas.microsoft.com/office/drawing/2015/10/21/chartex" xmlns:cx3="http://schemas.microsoft.com/office/drawing/2016/5/9/chartex" xmlns:cx4="http://schemas.microsoft.com/office/drawing/2016/5/10/chartex" xmlns:cx5="http://schemas.microsoft.com/office/drawing/2016/5/11/chartex" xmlns:cx6="http://schemas.microsoft.com/office/drawing/2016/5/12/chartex" xmlns:cx7="http://schemas.microsoft.com/office/drawing/2016/5/13/chartex" xmlns:cx8="http://schemas.microsoft.com/office/drawing/2016/5/14/chartex" xmlns:mc="http://schemas.openxmlformats.org/markup-compatibility/2006" xmlns:aink="http://schemas.microsoft.com/office/drawing/2016/ink" xmlns:am3d="http://schemas.microsoft.com/office/drawing/2017/model3d" xmlns:o="urn:schemas-microsoft-com:office:office" xmlns:oel="http://schemas.microsoft.com/office/2019/extlst" xmlns:r="http://schemas.openxmlformats.org/officeDocument/2006/relationships" xmlns:m="http://schemas.openxmlformats.org/officeDocument/2006/math" xmlns:v="urn:schemas-microsoft-com:vml" xmlns:wp14="http://schemas.microsoft.com/office/word/2010/wordprocessingDrawing" xmlns:wp="http://schemas.openxmlformats.org/drawingml/2006/wordprocessingDrawing" xmlns:w10="urn:schemas-microsoft-com:office:word" xmlns:w="http://schemas.openxmlformats.org/wordprocessingml/2006/main" xmlns:w14="http://schemas.microsoft.com/office/word/2010/wordml" xmlns:w15="http://schemas.microsoft.com/office/word/2012/wordml" xmlns:w16cex="http://schemas.microsoft.com/office/word/2018/wordml/cex" xmlns:w16cid="http://schemas.microsoft.com/office/word/2016/wordml/cid" xmlns:w16="http://schemas.microsoft.com/office/word/2018/wordml" xmlns:w16sdtdh="http://schemas.microsoft.com/office/word/2020/wordml/sdtdatahash" xmlns:w16se="http://schemas.microsoft.com/office/word/2015/wordml/symex" xmlns:wpg="http://schemas.microsoft.com/office/word/2010/wordprocessingGroup" xmlns:wpi="http://schemas.microsoft.com/office/word/2010/wordprocessingInk" xmlns:wne="http://schemas.microsoft.com/office/word/2006/wordml" xmlns:wps="http://schemas.microsoft.com/office/word/2010/wordprocessingShape" mc:Ignorable="w14 w15 w16se w16cid w16 w16cex w16sdtdh wp14">
+  <w:p>
+    <w:pPr>
+      <w:pStyle w:val="a9"/>
+    </w:pPr>
+  </w:p>
+</w:hdr>
+</file>
+
+<file path=word/header2.xml><?xml version="1.0" encoding="utf-8"?>
+<w:hdr xmlns:wpc="http://schemas.microsoft.com/office/word/2010/wordprocessingCanvas" xmlns:cx="http://schemas.microsoft.com/office/drawing/2014/chartex" xmlns:cx1="http://schemas.microsoft.com/office/drawing/2015/9/8/chartex" xmlns:cx2="http://schemas.microsoft.com/office/drawing/2015/10/21/chartex" xmlns:cx3="http://schemas.microsoft.com/office/drawing/2016/5/9/chartex" xmlns:cx4="http://schemas.microsoft.com/office/drawing/2016/5/10/chartex" xmlns:cx5="http://schemas.microsoft.com/office/drawing/2016/5/11/chartex" xmlns:cx6="http://schemas.microsoft.com/office/drawing/2016/5/12/chartex" xmlns:cx7="http://schemas.microsoft.com/office/drawing/2016/5/13/chartex" xmlns:cx8="http://schemas.microsoft.com/office/drawing/2016/5/14/chartex" xmlns:mc="http://schemas.openxmlformats.org/markup-compatibility/2006" xmlns:aink="http://schemas.microsoft.com/office/drawing/2016/ink" xmlns:am3d="http://schemas.microsoft.com/office/drawing/2017/model3d" xmlns:o="urn:schemas-microsoft-com:office:office" xmlns:oel="http://schemas.microsoft.com/office/2019/extlst" xmlns:r="http://schemas.openxmlformats.org/officeDocument/2006/relationships" xmlns:m="http://schemas.openxmlformats.org/officeDocument/2006/math" xmlns:v="urn:schemas-microsoft-com:vml" xmlns:wp14="http://schemas.microsoft.com/office/word/2010/wordprocessingDrawing" xmlns:wp="http://schemas.openxmlformats.org/drawingml/2006/wordprocessingDrawing" xmlns:w10="urn:schemas-microsoft-com:office:word" xmlns:w="http://schemas.openxmlformats.org/wordprocessingml/2006/main" xmlns:w14="http://schemas.microsoft.com/office/word/2010/wordml" xmlns:w15="http://schemas.microsoft.com/office/word/2012/wordml" xmlns:w16cex="http://schemas.microsoft.com/office/word/2018/wordml/cex" xmlns:w16cid="http://schemas.microsoft.com/office/word/2016/wordml/cid" xmlns:w16="http://schemas.microsoft.com/office/word/2018/wordml" xmlns:w16sdtdh="http://schemas.microsoft.com/office/word/2020/wordml/sdtdatahash" xmlns:w16se="http://schemas.microsoft.com/office/word/2015/wordml/symex" xmlns:wpg="http://schemas.microsoft.com/office/word/2010/wordprocessingGroup" xmlns:wpi="http://schemas.microsoft.com/office/word/2010/wordprocessingInk" xmlns:wne="http://schemas.microsoft.com/office/word/2006/wordml" xmlns:wps="http://schemas.microsoft.com/office/word/2010/wordprocessingShape" mc:Ignorable="w14 w15 w16se w16cid w16 w16cex w16sdtdh wp14">
+  <w:p>
+    <w:pPr>
+      <w:pStyle w:val="a9"/>
+    </w:pPr>
+  </w:p>
+</w:hdr>
+</file>
+
+<file path=word/header3.xml><?xml version="1.0" encoding="utf-8"?>
+<w:hdr xmlns:wpc="http://schemas.microsoft.com/office/word/2010/wordprocessingCanvas" xmlns:cx="http://schemas.microsoft.com/office/drawing/2014/chartex" xmlns:cx1="http://schemas.microsoft.com/office/drawing/2015/9/8/chartex" xmlns:cx2="http://schemas.microsoft.com/office/drawing/2015/10/21/chartex" xmlns:cx3="http://schemas.microsoft.com/office/drawing/2016/5/9/chartex" xmlns:cx4="http://schemas.microsoft.com/office/drawing/2016/5/10/chartex" xmlns:cx5="http://schemas.microsoft.com/office/drawing/2016/5/11/chartex" xmlns:cx6="http://schemas.microsoft.com/office/drawing/2016/5/12/chartex" xmlns:cx7="http://schemas.microsoft.com/office/drawing/2016/5/13/chartex" xmlns:cx8="http://schemas.microsoft.com/office/drawing/2016/5/14/chartex" xmlns:mc="http://schemas.openxmlformats.org/markup-compatibility/2006" xmlns:aink="http://schemas.microsoft.com/office/drawing/2016/ink" xmlns:am3d="http://schemas.microsoft.com/office/drawing/2017/model3d" xmlns:o="urn:schemas-microsoft-com:office:office" xmlns:oel="http://schemas.microsoft.com/office/2019/extlst" xmlns:r="http://schemas.openxmlformats.org/officeDocument/2006/relationships" xmlns:m="http://schemas.openxmlformats.org/officeDocument/2006/math" xmlns:v="urn:schemas-microsoft-com:vml" xmlns:wp14="http://schemas.microsoft.com/office/word/2010/wordprocessingDrawing" xmlns:wp="http://schemas.openxmlformats.org/drawingml/2006/wordprocessingDrawing" xmlns:w10="urn:schemas-microsoft-com:office:word" xmlns:w="http://schemas.openxmlformats.org/wordprocessingml/2006/main" xmlns:w14="http://schemas.microsoft.com/office/word/2010/wordml" xmlns:w15="http://schemas.microsoft.com/office/word/2012/wordml" xmlns:w16cex="http://schemas.microsoft.com/office/word/2018/wordml/cex" xmlns:w16cid="http://schemas.microsoft.com/office/word/2016/wordml/cid" xmlns:w16="http://schemas.microsoft.com/office/word/2018/wordml" xmlns:w16sdtdh="http://schemas.microsoft.com/office/word/2020/wordml/sdtdatahash" xmlns:w16se="http://schemas.microsoft.com/office/word/2015/wordml/symex" xmlns:wpg="http://schemas.microsoft.com/office/word/2010/wordprocessingGroup" xmlns:wpi="http://schemas.microsoft.com/office/word/2010/wordprocessingInk" xmlns:wne="http://schemas.microsoft.com/office/word/2006/wordml" xmlns:wps="http://schemas.microsoft.com/office/word/2010/wordprocessingShape" mc:Ignorable="w14 w15 w16se w16cid w16 w16cex w16sdtdh wp14">
+  <w:p>
+    <w:pPr>
+      <w:pStyle w:val="a9"/>
+    </w:pPr>
+  </w:p>
+</w:hdr>
+</file>
+
 <file path=word/numbering.xml><?xml version="1.0" encoding="utf-8"?>
-<w:numbering xmlns:wpc="http://schemas.microsoft.com/office/word/2010/wordprocessingCanvas" xmlns:cx="http://schemas.microsoft.com/office/drawing/2014/chartex" xmlns:cx1="http://schemas.microsoft.com/office/drawing/2015/9/8/chartex" xmlns:cx2="http://schemas.microsoft.com/office/drawing/2015/10/21/chartex" xmlns:cx3="http://schemas.microsoft.com/office/drawing/2016/5/9/chartex" xmlns:cx4="http://schemas.microsoft.com/office/drawing/2016/5/10/chartex" xmlns:cx5="http://schemas.microsoft.com/office/drawing/2016/5/11/chartex" xmlns:cx6="http://schemas.microsoft.com/office/drawing/2016/5/12/chartex" xmlns:cx7="http://schemas.microsoft.com/office/drawing/2016/5/13/chartex" xmlns:cx8="http://schemas.microsoft.com/office/drawing/2016/5/14/chartex" xmlns:mc="http://schemas.openxmlformats.org/markup-compatibility/2006" xmlns:aink="http://schemas.microsoft.com/office/drawing/2016/ink" xmlns:am3d="http://schemas.microsoft.com/office/drawing/2017/model3d" xmlns:o="urn:schemas-microsoft-com:office:office" xmlns:oel="http://schemas.microsoft.com/office/2019/extlst" xmlns:r="http://schemas.openxmlformats.org/officeDocument/2006/relationships" xmlns:m="http://schemas.openxmlformats.org/officeDocument/2006/math" xmlns:v="urn:schemas-microsoft-com:vml" xmlns:wp14="http://schemas.microsoft.com/office/word/2010/wordprocessingDrawing" xmlns:wp="http://schemas.openxmlformats.org/drawingml/2006/wordprocessingDrawing" xmlns:w10="urn:schemas-microsoft-com:office:word" xmlns:w="http://schemas.openxmlformats.org/wordprocessingml/2006/main" xmlns:w14="http://schemas.microsoft.com/office/word/2010/wordml" xmlns:w15="http://schemas.microsoft.com/office/word/2012/wordml" xmlns:w16cex="http://schemas.microsoft.com/office/word/2018/wordml/cex" xmlns:w16cid="http://schemas.microsoft.com/office/word/2016/wordml/cid" xmlns:w16="http://schemas.microsoft.com/office/word/2018/wordml" xmlns:w16du="http://schemas.microsoft.com/office/word/2023/wordml/word16du" xmlns:w16sdtdh="http://schemas.microsoft.com/office/word/2020/wordml/sdtdatahash" xmlns:w16sdtfl="http://schemas.microsoft.com/office/word/2024/wordml/sdtformatlock" xmlns:w16se="http://schemas.microsoft.com/office/word/2015/wordml/symex" xmlns:wpg="http://schemas.microsoft.com/office/word/2010/wordprocessingGroup" xmlns:wpi="http://schemas.microsoft.com/office/word/2010/wordprocessingInk" xmlns:wne="http://schemas.microsoft.com/office/word/2006/wordml" xmlns:wps="http://schemas.microsoft.com/office/word/2010/wordprocessingShape" mc:Ignorable="w14 w15 w16se w16cid w16 w16cex w16sdtdh w16sdtfl w16du wp14">
+<w:numbering xmlns:wpc="http://schemas.microsoft.com/office/word/2010/wordprocessingCanvas" xmlns:cx="http://schemas.microsoft.com/office/drawing/2014/chartex" xmlns:cx1="http://schemas.microsoft.com/office/drawing/2015/9/8/chartex" xmlns:cx2="http://schemas.microsoft.com/office/drawing/2015/10/21/chartex" xmlns:cx3="http://schemas.microsoft.com/office/drawing/2016/5/9/chartex" xmlns:cx4="http://schemas.microsoft.com/office/drawing/2016/5/10/chartex" xmlns:cx5="http://schemas.microsoft.com/office/drawing/2016/5/11/chartex" xmlns:cx6="http://schemas.microsoft.com/office/drawing/2016/5/12/chartex" xmlns:cx7="http://schemas.microsoft.com/office/drawing/2016/5/13/chartex" xmlns:cx8="http://schemas.microsoft.com/office/drawing/2016/5/14/chartex" xmlns:mc="http://schemas.openxmlformats.org/markup-compatibility/2006" xmlns:aink="http://schemas.microsoft.com/office/drawing/2016/ink" xmlns:am3d="http://schemas.microsoft.com/office/drawing/2017/model3d" xmlns:o="urn:schemas-microsoft-com:office:office" xmlns:oel="http://schemas.microsoft.com/office/2019/extlst" xmlns:r="http://schemas.openxmlformats.org/officeDocument/2006/relationships" xmlns:m="http://schemas.openxmlformats.org/officeDocument/2006/math" xmlns:v="urn:schemas-microsoft-com:vml" xmlns:wp14="http://schemas.microsoft.com/office/word/2010/wordprocessingDrawing" xmlns:wp="http://schemas.openxmlformats.org/drawingml/2006/wordprocessingDrawing" xmlns:w10="urn:schemas-microsoft-com:office:word" xmlns:w="http://schemas.openxmlformats.org/wordprocessingml/2006/main" xmlns:w14="http://schemas.microsoft.com/office/word/2010/wordml" xmlns:w15="http://schemas.microsoft.com/office/word/2012/wordml" xmlns:w16cex="http://schemas.microsoft.com/office/word/2018/wordml/cex" xmlns:w16cid="http://schemas.microsoft.com/office/word/2016/wordml/cid" xmlns:w16="http://schemas.microsoft.com/office/word/2018/wordml" xmlns:w16sdtdh="http://schemas.microsoft.com/office/word/2020/wordml/sdtdatahash" xmlns:w16se="http://schemas.microsoft.com/office/word/2015/wordml/symex" xmlns:wpg="http://schemas.microsoft.com/office/word/2010/wordprocessingGroup" xmlns:wpi="http://schemas.microsoft.com/office/word/2010/wordprocessingInk" xmlns:wne="http://schemas.microsoft.com/office/word/2006/wordml" xmlns:wps="http://schemas.microsoft.com/office/word/2010/wordprocessingShape" mc:Ignorable="w14 w15 w16se w16cid w16 w16cex w16sdtdh wp14">
   <w:abstractNum w:abstractNumId="0" w15:restartNumberingAfterBreak="0">
     <w:nsid w:val="0A50621C"/>
     <w:multiLevelType w:val="multilevel"/>
@@ -1991,21 +2760,12 @@
   </w:num>
   <w:num w:numId="7" w16cid:durableId="611672299">
     <w:abstractNumId w:val="2"/>
-    <w:lvlOverride w:ilvl="0"/>
-    <w:lvlOverride w:ilvl="1"/>
-    <w:lvlOverride w:ilvl="2"/>
-    <w:lvlOverride w:ilvl="3"/>
-    <w:lvlOverride w:ilvl="4"/>
-    <w:lvlOverride w:ilvl="5"/>
-    <w:lvlOverride w:ilvl="6"/>
-    <w:lvlOverride w:ilvl="7"/>
-    <w:lvlOverride w:ilvl="8"/>
   </w:num>
 </w:numbering>
 </file>
 
 <file path=word/styles.xml><?xml version="1.0" encoding="utf-8"?>
-<w:styles xmlns:mc="http://schemas.openxmlformats.org/markup-compatibility/2006" xmlns:r="http://schemas.openxmlformats.org/officeDocument/2006/relationships" xmlns:w="http://schemas.openxmlformats.org/wordprocessingml/2006/main" xmlns:w14="http://schemas.microsoft.com/office/word/2010/wordml" xmlns:w15="http://schemas.microsoft.com/office/word/2012/wordml" xmlns:w16cex="http://schemas.microsoft.com/office/word/2018/wordml/cex" xmlns:w16cid="http://schemas.microsoft.com/office/word/2016/wordml/cid" xmlns:w16="http://schemas.microsoft.com/office/word/2018/wordml" xmlns:w16du="http://schemas.microsoft.com/office/word/2023/wordml/word16du" xmlns:w16sdtdh="http://schemas.microsoft.com/office/word/2020/wordml/sdtdatahash" xmlns:w16sdtfl="http://schemas.microsoft.com/office/word/2024/wordml/sdtformatlock" xmlns:w16se="http://schemas.microsoft.com/office/word/2015/wordml/symex" mc:Ignorable="w14 w15 w16se w16cid w16 w16cex w16sdtdh w16sdtfl w16du">
+<w:styles xmlns:mc="http://schemas.openxmlformats.org/markup-compatibility/2006" xmlns:r="http://schemas.openxmlformats.org/officeDocument/2006/relationships" xmlns:w="http://schemas.openxmlformats.org/wordprocessingml/2006/main" xmlns:w14="http://schemas.microsoft.com/office/word/2010/wordml" xmlns:w15="http://schemas.microsoft.com/office/word/2012/wordml" xmlns:w16cex="http://schemas.microsoft.com/office/word/2018/wordml/cex" xmlns:w16cid="http://schemas.microsoft.com/office/word/2016/wordml/cid" xmlns:w16="http://schemas.microsoft.com/office/word/2018/wordml" xmlns:w16sdtdh="http://schemas.microsoft.com/office/word/2020/wordml/sdtdatahash" xmlns:w16se="http://schemas.microsoft.com/office/word/2015/wordml/symex" mc:Ignorable="w14 w15 w16se w16cid w16 w16cex w16sdtdh">
   <w:docDefaults>
     <w:rPrDefault>
       <w:rPr>
@@ -2521,6 +3281,56 @@
       <w:shd w:val="clear" w:color="auto" w:fill="E1DFDD"/>
     </w:rPr>
   </w:style>
+  <w:style w:type="paragraph" w:styleId="a9">
+    <w:name w:val="header"/>
+    <w:basedOn w:val="a"/>
+    <w:link w:val="aa"/>
+    <w:uiPriority w:val="99"/>
+    <w:unhideWhenUsed/>
+    <w:rsid w:val="00C534AF"/>
+    <w:pPr>
+      <w:tabs>
+        <w:tab w:val="center" w:pos="4677"/>
+        <w:tab w:val="right" w:pos="9355"/>
+      </w:tabs>
+      <w:spacing w:after="0" w:line="240" w:lineRule="auto"/>
+    </w:pPr>
+  </w:style>
+  <w:style w:type="character" w:customStyle="1" w:styleId="aa">
+    <w:name w:val="Верхний колонтитул Знак"/>
+    <w:basedOn w:val="a0"/>
+    <w:link w:val="a9"/>
+    <w:uiPriority w:val="99"/>
+    <w:rsid w:val="00C534AF"/>
+    <w:rPr>
+      <w:rFonts w:ascii="Calibri" w:eastAsia="Calibri" w:hAnsi="Calibri" w:cs="Times New Roman"/>
+    </w:rPr>
+  </w:style>
+  <w:style w:type="paragraph" w:styleId="ab">
+    <w:name w:val="footer"/>
+    <w:basedOn w:val="a"/>
+    <w:link w:val="ac"/>
+    <w:uiPriority w:val="99"/>
+    <w:unhideWhenUsed/>
+    <w:rsid w:val="00C534AF"/>
+    <w:pPr>
+      <w:tabs>
+        <w:tab w:val="center" w:pos="4677"/>
+        <w:tab w:val="right" w:pos="9355"/>
+      </w:tabs>
+      <w:spacing w:after="0" w:line="240" w:lineRule="auto"/>
+    </w:pPr>
+  </w:style>
+  <w:style w:type="character" w:customStyle="1" w:styleId="ac">
+    <w:name w:val="Нижний колонтитул Знак"/>
+    <w:basedOn w:val="a0"/>
+    <w:link w:val="ab"/>
+    <w:uiPriority w:val="99"/>
+    <w:rsid w:val="00C534AF"/>
+    <w:rPr>
+      <w:rFonts w:ascii="Calibri" w:eastAsia="Calibri" w:hAnsi="Calibri" w:cs="Times New Roman"/>
+    </w:rPr>
+  </w:style>
 </w:styles>
 </file>
 

</xml_diff>